<commit_message>
Fill coursework report with implementation and reflective content
Co-authored-by: Cursor <cursoragent@cursor.com>
</commit_message>
<xml_diff>
--- a/Report/SmartMed Report.docx
+++ b/Report/SmartMed Report.docx
@@ -5,575 +5,2605 @@
     <w:p>
       <w:pPr>
         <w:pStyle w:val="Heading1"/>
+        <w:spacing w:line="360" w:lineRule="auto"/>
+        <w:jc w:val="both"/>
         <w:rPr>
           <w:bCs w:val="0"/>
-        </w:rPr>
-      </w:pPr>
-      <w:r>
-        <w:rPr>
-          <w:bCs w:val="0"/>
-        </w:rPr>
-        <w:t>SmartMed Pharmacy System</w:t>
-      </w:r>
+          <w:sz w:val="72"/>
+          <w:szCs w:val="48"/>
+        </w:rPr>
+      </w:pPr>
     </w:p>
     <w:p>
       <w:pPr>
-        <w:spacing w:before="120" w:after="120" w:line="360" w:lineRule="auto"/>
-      </w:pPr>
-      <w:r>
-        <w:rPr>
-          <w:rFonts w:ascii="Times New Roman" w:eastAsia="Times New Roman" w:hAnsi="Times New Roman"/>
-          <w:sz w:val="28"/>
-        </w:rPr>
-        <w:t>Individual Coursework Report</w:t>
+        <w:spacing w:after="0"/>
+        <w:jc w:val="center"/>
+        <w:rPr>
+          <w:bCs/>
+          <w:color w:val="002060"/>
+          <w:sz w:val="72"/>
+          <w:szCs w:val="72"/>
+        </w:rPr>
+      </w:pPr>
+      <w:r>
+        <w:rPr>
+          <w:color w:val="002060"/>
+          <w:sz w:val="72"/>
+          <w:szCs w:val="72"/>
+        </w:rPr>
+        <w:t>Application Development</w:t>
       </w:r>
     </w:p>
     <w:p>
       <w:pPr>
-        <w:spacing w:before="120" w:after="120" w:line="360" w:lineRule="auto"/>
+        <w:pStyle w:val="ListParagraph"/>
+        <w:numPr>
+          <w:ilvl w:val="0"/>
+          <w:numId w:val="11"/>
+        </w:numPr>
+        <w:spacing w:after="0" w:line="360" w:lineRule="auto"/>
+        <w:jc w:val="center"/>
+        <w:rPr>
+          <w:color w:val="002060"/>
+        </w:rPr>
       </w:pPr>
       <w:r>
         <w:rPr>
           <w:rFonts w:ascii="Times New Roman" w:eastAsia="Times New Roman" w:hAnsi="Times New Roman"/>
-          <w:sz w:val="24"/>
-        </w:rPr>
-        <w:t>Module:</w:t>
+          <w:color w:val="002060"/>
+          <w:sz w:val="28"/>
+        </w:rPr>
+        <w:t>Individual Coursework Report</w:t>
+      </w:r>
+      <w:r>
+        <w:rPr>
+          <w:rFonts w:ascii="Times New Roman" w:eastAsia="Times New Roman" w:hAnsi="Times New Roman"/>
+          <w:color w:val="002060"/>
+          <w:sz w:val="28"/>
+        </w:rPr>
+        <w:t xml:space="preserve"> </w:t>
+      </w:r>
+      <w:r>
+        <w:rPr>
+          <w:rFonts w:ascii="Times New Roman" w:eastAsia="Times New Roman" w:hAnsi="Times New Roman"/>
+          <w:color w:val="002060"/>
+          <w:sz w:val="28"/>
+        </w:rPr>
+        <w:t>–</w:t>
       </w:r>
     </w:p>
     <w:p>
       <w:pPr>
-        <w:spacing w:before="120" w:after="120" w:line="360" w:lineRule="auto"/>
-      </w:pPr>
-      <w:r>
-        <w:rPr>
-          <w:rFonts w:ascii="Times New Roman" w:eastAsia="Times New Roman" w:hAnsi="Times New Roman"/>
-          <w:sz w:val="24"/>
-        </w:rPr>
-        <w:t>Assignment No:</w:t>
-      </w:r>
+        <w:spacing w:after="0" w:line="360" w:lineRule="auto"/>
+        <w:jc w:val="center"/>
+        <w:rPr>
+          <w:color w:val="002060"/>
+        </w:rPr>
+      </w:pPr>
     </w:p>
     <w:p>
       <w:pPr>
-        <w:spacing w:before="120" w:after="120" w:line="360" w:lineRule="auto"/>
-      </w:pPr>
-      <w:r>
-        <w:rPr>
-          <w:rFonts w:ascii="Times New Roman" w:eastAsia="Times New Roman" w:hAnsi="Times New Roman"/>
-          <w:sz w:val="24"/>
-        </w:rPr>
-        <w:t>Student ID:</w:t>
-      </w:r>
+        <w:spacing w:after="0" w:line="360" w:lineRule="auto"/>
+        <w:jc w:val="center"/>
+        <w:rPr>
+          <w:color w:val="002060"/>
+        </w:rPr>
+      </w:pPr>
     </w:p>
     <w:p>
       <w:pPr>
-        <w:spacing w:before="120" w:after="120" w:line="360" w:lineRule="auto"/>
-      </w:pPr>
-      <w:r>
-        <w:rPr>
-          <w:rFonts w:ascii="Times New Roman" w:eastAsia="Times New Roman" w:hAnsi="Times New Roman"/>
-          <w:sz w:val="24"/>
-        </w:rPr>
-        <w:t>Date:</w:t>
-      </w:r>
+        <w:spacing w:after="0" w:line="360" w:lineRule="auto"/>
+        <w:jc w:val="center"/>
+        <w:rPr>
+          <w:color w:val="002060"/>
+        </w:rPr>
+      </w:pPr>
     </w:p>
     <w:p>
-      <w:r>
-        <w:br w:type="page"/>
-      </w:r>
+      <w:pPr>
+        <w:spacing w:after="0" w:line="360" w:lineRule="auto"/>
+        <w:jc w:val="center"/>
+        <w:rPr>
+          <w:color w:val="002060"/>
+        </w:rPr>
+      </w:pPr>
     </w:p>
     <w:p>
       <w:pPr>
-        <w:spacing w:before="240" w:after="120" w:line="360" w:lineRule="auto"/>
-      </w:pPr>
-      <w:r>
-        <w:rPr>
-          <w:rFonts w:ascii="Times New Roman" w:eastAsia="Times New Roman" w:hAnsi="Times New Roman"/>
-          <w:sz w:val="36"/>
-        </w:rPr>
-        <w:lastRenderedPageBreak/>
-        <w:t>Introduction</w:t>
-      </w:r>
+        <w:spacing w:after="0" w:line="360" w:lineRule="auto"/>
+        <w:jc w:val="center"/>
+        <w:rPr>
+          <w:color w:val="002060"/>
+        </w:rPr>
+      </w:pPr>
     </w:p>
     <w:p>
       <w:pPr>
-        <w:spacing w:before="240" w:after="120" w:line="360" w:lineRule="auto"/>
-      </w:pPr>
-      <w:r>
-        <w:rPr>
-          <w:rFonts w:ascii="Times New Roman" w:eastAsia="Times New Roman" w:hAnsi="Times New Roman"/>
-          <w:sz w:val="36"/>
-        </w:rPr>
-        <w:t>Detailed Instructions to Run the Program</w:t>
+        <w:spacing w:after="0" w:line="360" w:lineRule="auto"/>
+        <w:jc w:val="center"/>
+        <w:rPr>
+          <w:color w:val="002060"/>
+          <w:sz w:val="48"/>
+          <w:szCs w:val="48"/>
+        </w:rPr>
+      </w:pPr>
+      <w:r>
+        <w:rPr>
+          <w:color w:val="002060"/>
+          <w:sz w:val="48"/>
+          <w:szCs w:val="48"/>
+        </w:rPr>
+        <w:t>SmartMed Pharmacy System</w:t>
       </w:r>
     </w:p>
     <w:p>
       <w:pPr>
-        <w:spacing w:before="240" w:after="120" w:line="360" w:lineRule="auto"/>
-      </w:pPr>
-      <w:r>
-        <w:rPr>
-          <w:rFonts w:ascii="Times New Roman" w:eastAsia="Times New Roman" w:hAnsi="Times New Roman"/>
-          <w:sz w:val="36"/>
-        </w:rPr>
-        <w:t>Software Architecture</w:t>
-      </w:r>
+        <w:spacing w:line="360" w:lineRule="auto"/>
+        <w:jc w:val="both"/>
+      </w:pPr>
     </w:p>
     <w:p>
       <w:pPr>
-        <w:spacing w:before="120" w:after="120" w:line="360" w:lineRule="auto"/>
-      </w:pPr>
-      <w:r>
-        <w:rPr>
-          <w:rFonts w:ascii="Times New Roman" w:eastAsia="Times New Roman" w:hAnsi="Times New Roman"/>
-          <w:sz w:val="28"/>
-        </w:rPr>
-        <w:t>System Overview</w:t>
-      </w:r>
+        <w:spacing w:line="360" w:lineRule="auto"/>
+        <w:jc w:val="both"/>
+      </w:pPr>
     </w:p>
     <w:p>
       <w:pPr>
-        <w:spacing w:before="120" w:after="120" w:line="360" w:lineRule="auto"/>
-      </w:pPr>
-      <w:r>
-        <w:rPr>
-          <w:rFonts w:ascii="Times New Roman" w:eastAsia="Times New Roman" w:hAnsi="Times New Roman"/>
-          <w:sz w:val="28"/>
-        </w:rPr>
-        <w:t>Three-Layer Architecture</w:t>
-      </w:r>
+        <w:spacing w:line="360" w:lineRule="auto"/>
+        <w:jc w:val="both"/>
+      </w:pPr>
     </w:p>
     <w:p>
       <w:pPr>
-        <w:spacing w:before="120" w:after="120" w:line="360" w:lineRule="auto"/>
-      </w:pPr>
-      <w:r>
-        <w:rPr>
-          <w:rFonts w:ascii="Times New Roman" w:eastAsia="Times New Roman" w:hAnsi="Times New Roman"/>
-          <w:sz w:val="28"/>
-        </w:rPr>
-        <w:t>Use Case Diagram</w:t>
-      </w:r>
+        <w:spacing w:line="360" w:lineRule="auto"/>
+        <w:jc w:val="both"/>
+      </w:pPr>
     </w:p>
     <w:p>
       <w:pPr>
-        <w:spacing w:before="120" w:after="120" w:line="360" w:lineRule="auto"/>
-      </w:pPr>
-      <w:r>
-        <w:rPr>
-          <w:rFonts w:ascii="Times New Roman" w:eastAsia="Times New Roman" w:hAnsi="Times New Roman"/>
-          <w:sz w:val="28"/>
-        </w:rPr>
-        <w:t>Entity-Relationship Diagram</w:t>
-      </w:r>
+        <w:spacing w:line="360" w:lineRule="auto"/>
+        <w:jc w:val="both"/>
+      </w:pPr>
     </w:p>
     <w:p>
       <w:pPr>
-        <w:spacing w:before="120" w:after="120" w:line="360" w:lineRule="auto"/>
-      </w:pPr>
-      <w:r>
-        <w:rPr>
-          <w:rFonts w:ascii="Times New Roman" w:eastAsia="Times New Roman" w:hAnsi="Times New Roman"/>
-          <w:sz w:val="28"/>
-        </w:rPr>
-        <w:t>Class Diagram</w:t>
-      </w:r>
+        <w:spacing w:line="360" w:lineRule="auto"/>
+        <w:jc w:val="both"/>
+      </w:pPr>
     </w:p>
     <w:p>
       <w:pPr>
-        <w:spacing w:before="120" w:after="120" w:line="360" w:lineRule="auto"/>
-      </w:pPr>
-      <w:r>
-        <w:rPr>
-          <w:rFonts w:ascii="Times New Roman" w:eastAsia="Times New Roman" w:hAnsi="Times New Roman"/>
-          <w:sz w:val="28"/>
-        </w:rPr>
-        <w:t>Class Relationships</w:t>
-      </w:r>
+        <w:spacing w:line="360" w:lineRule="auto"/>
+        <w:jc w:val="both"/>
+      </w:pPr>
     </w:p>
     <w:p>
       <w:pPr>
-        <w:spacing w:before="120" w:after="120" w:line="360" w:lineRule="auto"/>
-      </w:pPr>
-      <w:r>
-        <w:rPr>
-          <w:rFonts w:ascii="Times New Roman" w:eastAsia="Times New Roman" w:hAnsi="Times New Roman"/>
-          <w:sz w:val="28"/>
-        </w:rPr>
-        <w:t>Source Code Attribution</w:t>
-      </w:r>
+        <w:spacing w:line="360" w:lineRule="auto"/>
+        <w:jc w:val="both"/>
+      </w:pPr>
     </w:p>
     <w:p>
       <w:pPr>
-        <w:spacing w:before="240" w:after="120" w:line="360" w:lineRule="auto"/>
-      </w:pPr>
-      <w:r>
-        <w:rPr>
-          <w:rFonts w:ascii="Times New Roman" w:eastAsia="Times New Roman" w:hAnsi="Times New Roman"/>
-          <w:sz w:val="36"/>
-        </w:rPr>
-        <w:t>Functional Requirements Analysis</w:t>
-      </w:r>
+        <w:spacing w:line="360" w:lineRule="auto"/>
+        <w:jc w:val="both"/>
+      </w:pPr>
     </w:p>
     <w:p>
       <w:pPr>
-        <w:spacing w:before="120" w:after="120" w:line="360" w:lineRule="auto"/>
-      </w:pPr>
-      <w:r>
-        <w:rPr>
-          <w:rFonts w:ascii="Times New Roman" w:eastAsia="Times New Roman" w:hAnsi="Times New Roman"/>
-          <w:sz w:val="28"/>
-        </w:rPr>
-        <w:t>Admin Features</w:t>
-      </w:r>
+        <w:spacing w:line="360" w:lineRule="auto"/>
+        <w:jc w:val="both"/>
+      </w:pPr>
     </w:p>
     <w:p>
       <w:pPr>
-        <w:spacing w:before="120" w:after="120" w:line="360" w:lineRule="auto"/>
-      </w:pPr>
-      <w:r>
-        <w:rPr>
-          <w:rFonts w:ascii="Times New Roman" w:eastAsia="Times New Roman" w:hAnsi="Times New Roman"/>
-          <w:sz w:val="28"/>
-        </w:rPr>
-        <w:t>Customer Features</w:t>
-      </w:r>
+        <w:spacing w:line="360" w:lineRule="auto"/>
+        <w:jc w:val="both"/>
+      </w:pPr>
     </w:p>
     <w:p>
       <w:pPr>
-        <w:spacing w:before="120" w:after="120" w:line="360" w:lineRule="auto"/>
-      </w:pPr>
-      <w:r>
-        <w:rPr>
-          <w:rFonts w:ascii="Times New Roman" w:eastAsia="Times New Roman" w:hAnsi="Times New Roman"/>
-          <w:sz w:val="28"/>
-        </w:rPr>
-        <w:t>Additional Features</w:t>
-      </w:r>
+        <w:spacing w:line="360" w:lineRule="auto"/>
+        <w:jc w:val="both"/>
+      </w:pPr>
     </w:p>
     <w:p>
       <w:pPr>
-        <w:spacing w:before="240" w:after="120" w:line="360" w:lineRule="auto"/>
-      </w:pPr>
-      <w:r>
-        <w:rPr>
-          <w:rFonts w:ascii="Times New Roman" w:eastAsia="Times New Roman" w:hAnsi="Times New Roman"/>
-          <w:sz w:val="36"/>
-        </w:rPr>
-        <w:t>Technical Requirements</w:t>
-      </w:r>
+        <w:spacing w:line="360" w:lineRule="auto"/>
+        <w:jc w:val="both"/>
+      </w:pPr>
     </w:p>
     <w:p>
       <w:pPr>
-        <w:spacing w:before="120" w:after="120" w:line="360" w:lineRule="auto"/>
-      </w:pPr>
-      <w:r>
-        <w:rPr>
-          <w:rFonts w:ascii="Times New Roman" w:eastAsia="Times New Roman" w:hAnsi="Times New Roman"/>
-          <w:sz w:val="28"/>
-        </w:rPr>
-        <w:t>Programming Language and Platform</w:t>
-      </w:r>
+        <w:spacing w:line="360" w:lineRule="auto"/>
+        <w:jc w:val="both"/>
+      </w:pPr>
     </w:p>
     <w:p>
       <w:pPr>
-        <w:spacing w:before="120" w:after="120" w:line="360" w:lineRule="auto"/>
-      </w:pPr>
-      <w:r>
-        <w:rPr>
-          <w:rFonts w:ascii="Times New Roman" w:eastAsia="Times New Roman" w:hAnsi="Times New Roman"/>
-          <w:sz w:val="28"/>
-        </w:rPr>
-        <w:t>Data Storage</w:t>
-      </w:r>
+        <w:spacing w:line="360" w:lineRule="auto"/>
+        <w:jc w:val="both"/>
+      </w:pPr>
     </w:p>
     <w:p>
       <w:pPr>
-        <w:spacing w:before="120" w:after="120" w:line="360" w:lineRule="auto"/>
-      </w:pPr>
-      <w:r>
-        <w:rPr>
-          <w:rFonts w:ascii="Times New Roman" w:eastAsia="Times New Roman" w:hAnsi="Times New Roman"/>
-          <w:sz w:val="28"/>
-        </w:rPr>
-        <w:t>Software Design</w:t>
-      </w:r>
+        <w:spacing w:line="360" w:lineRule="auto"/>
+        <w:jc w:val="both"/>
+      </w:pPr>
     </w:p>
     <w:p>
       <w:pPr>
-        <w:spacing w:before="120" w:after="120" w:line="360" w:lineRule="auto"/>
-      </w:pPr>
-      <w:r>
-        <w:rPr>
-          <w:rFonts w:ascii="Times New Roman" w:eastAsia="Times New Roman" w:hAnsi="Times New Roman"/>
-          <w:sz w:val="28"/>
-        </w:rPr>
-        <w:t>User Interface</w:t>
+        <w:pStyle w:val="Heading3"/>
+        <w:spacing w:before="39"/>
+        <w:ind w:right="4680"/>
+        <w:jc w:val="both"/>
+        <w:rPr>
+          <w:b/>
+          <w:bCs w:val="0"/>
+          <w:i/>
+          <w:iCs/>
+          <w:color w:val="000000" w:themeColor="text1"/>
+          <w:sz w:val="22"/>
+        </w:rPr>
+      </w:pPr>
+      <w:bookmarkStart w:id="0" w:name="_Hlk211934454"/>
+      <w:r>
+        <w:rPr>
+          <w:b/>
+          <w:bCs w:val="0"/>
+          <w:noProof/>
+        </w:rPr>
+        <w:drawing>
+          <wp:anchor distT="0" distB="0" distL="114300" distR="114300" simplePos="0" relativeHeight="251664896" behindDoc="0" locked="0" layoutInCell="1" allowOverlap="1" wp14:anchorId="6BA9F2D6" wp14:editId="71D5FF2A">
+            <wp:simplePos x="0" y="0"/>
+            <wp:positionH relativeFrom="margin">
+              <wp:posOffset>4159885</wp:posOffset>
+            </wp:positionH>
+            <wp:positionV relativeFrom="margin">
+              <wp:posOffset>-410818</wp:posOffset>
+            </wp:positionV>
+            <wp:extent cx="1871345" cy="1084580"/>
+            <wp:effectExtent l="0" t="0" r="0" b="0"/>
+            <wp:wrapSquare wrapText="bothSides"/>
+            <wp:docPr id="565019070" name="Picture 3" descr="Logos - London Metropolitan University"/>
+            <wp:cNvGraphicFramePr>
+              <a:graphicFrameLocks xmlns:a="http://schemas.openxmlformats.org/drawingml/2006/main" noChangeAspect="1"/>
+            </wp:cNvGraphicFramePr>
+            <a:graphic xmlns:a="http://schemas.openxmlformats.org/drawingml/2006/main">
+              <a:graphicData uri="http://schemas.openxmlformats.org/drawingml/2006/picture">
+                <pic:pic xmlns:pic="http://schemas.openxmlformats.org/drawingml/2006/picture">
+                  <pic:nvPicPr>
+                    <pic:cNvPr id="0" name="Picture 6" descr="Logos - London Metropolitan University"/>
+                    <pic:cNvPicPr>
+                      <a:picLocks noChangeAspect="1" noChangeArrowheads="1"/>
+                    </pic:cNvPicPr>
+                  </pic:nvPicPr>
+                  <pic:blipFill>
+                    <a:blip r:embed="rId6">
+                      <a:extLst>
+                        <a:ext uri="{28A0092B-C50C-407E-A947-70E740481C1C}">
+                          <a14:useLocalDpi xmlns:a14="http://schemas.microsoft.com/office/drawing/2010/main" val="0"/>
+                        </a:ext>
+                      </a:extLst>
+                    </a:blip>
+                    <a:srcRect/>
+                    <a:stretch>
+                      <a:fillRect/>
+                    </a:stretch>
+                  </pic:blipFill>
+                  <pic:spPr bwMode="auto">
+                    <a:xfrm>
+                      <a:off x="0" y="0"/>
+                      <a:ext cx="1871345" cy="1084580"/>
+                    </a:xfrm>
+                    <a:prstGeom prst="rect">
+                      <a:avLst/>
+                    </a:prstGeom>
+                    <a:noFill/>
+                    <a:ln>
+                      <a:noFill/>
+                    </a:ln>
+                  </pic:spPr>
+                </pic:pic>
+              </a:graphicData>
+            </a:graphic>
+          </wp:anchor>
+        </w:drawing>
+      </w:r>
+      <w:r>
+        <w:rPr>
+          <w:b/>
+          <w:iCs/>
+          <w:color w:val="000000" w:themeColor="text1"/>
+          <w:sz w:val="22"/>
+        </w:rPr>
+        <w:t xml:space="preserve">Course Submission Cover Sheet </w:t>
       </w:r>
     </w:p>
     <w:p>
       <w:pPr>
-        <w:spacing w:before="120" w:after="120" w:line="360" w:lineRule="auto"/>
-      </w:pPr>
-      <w:r>
-        <w:rPr>
-          <w:rFonts w:ascii="Times New Roman" w:eastAsia="Times New Roman" w:hAnsi="Times New Roman"/>
-          <w:sz w:val="28"/>
-        </w:rPr>
-        <w:t>Validation and Exception Handling</w:t>
+        <w:pStyle w:val="Heading3"/>
+        <w:spacing w:before="39"/>
+        <w:ind w:right="3971"/>
+        <w:jc w:val="both"/>
+        <w:rPr>
+          <w:i/>
+          <w:iCs/>
+          <w:color w:val="000000" w:themeColor="text1"/>
+          <w:szCs w:val="24"/>
+        </w:rPr>
+      </w:pPr>
+      <w:r>
+        <w:rPr>
+          <w:iCs/>
+          <w:color w:val="000000" w:themeColor="text1"/>
+          <w:szCs w:val="24"/>
+        </w:rPr>
+        <w:t xml:space="preserve">Module: </w:t>
+      </w:r>
+      <w:r>
+        <w:rPr>
+          <w:iCs/>
+          <w:color w:val="000000" w:themeColor="text1"/>
+          <w:szCs w:val="24"/>
+        </w:rPr>
+        <w:t>Application Development</w:t>
       </w:r>
     </w:p>
     <w:p>
       <w:pPr>
-        <w:spacing w:before="240" w:after="120" w:line="360" w:lineRule="auto"/>
-      </w:pPr>
-      <w:r>
-        <w:rPr>
-          <w:rFonts w:ascii="Times New Roman" w:eastAsia="Times New Roman" w:hAnsi="Times New Roman"/>
-          <w:sz w:val="36"/>
-        </w:rPr>
-        <w:lastRenderedPageBreak/>
-        <w:t>Detailed Description of Classes</w:t>
+        <w:pStyle w:val="Heading3"/>
+        <w:spacing w:before="39"/>
+        <w:ind w:right="5446"/>
+        <w:jc w:val="both"/>
+        <w:rPr>
+          <w:i/>
+          <w:iCs/>
+          <w:color w:val="000000" w:themeColor="text1"/>
+          <w:szCs w:val="24"/>
+        </w:rPr>
+      </w:pPr>
+      <w:r>
+        <w:rPr>
+          <w:iCs/>
+          <w:color w:val="000000" w:themeColor="text1"/>
+          <w:szCs w:val="24"/>
+        </w:rPr>
+        <w:t>Assignment</w:t>
+      </w:r>
+      <w:r>
+        <w:rPr>
+          <w:iCs/>
+          <w:color w:val="000000" w:themeColor="text1"/>
+          <w:spacing w:val="-3"/>
+          <w:szCs w:val="24"/>
+        </w:rPr>
+        <w:t xml:space="preserve"> </w:t>
+      </w:r>
+      <w:r>
+        <w:rPr>
+          <w:iCs/>
+          <w:color w:val="000000" w:themeColor="text1"/>
+          <w:szCs w:val="24"/>
+        </w:rPr>
+        <w:t xml:space="preserve">no: 001 </w:t>
       </w:r>
     </w:p>
     <w:p>
       <w:pPr>
-        <w:spacing w:before="120" w:after="120" w:line="360" w:lineRule="auto"/>
-      </w:pPr>
-      <w:r>
-        <w:rPr>
-          <w:rFonts w:ascii="Times New Roman" w:eastAsia="Times New Roman" w:hAnsi="Times New Roman"/>
-          <w:sz w:val="28"/>
-        </w:rPr>
-        <w:t>Person Class</w:t>
+        <w:pStyle w:val="Heading3"/>
+        <w:spacing w:before="39"/>
+        <w:ind w:right="5446"/>
+        <w:jc w:val="both"/>
+        <w:rPr>
+          <w:i/>
+          <w:iCs/>
+          <w:color w:val="000000" w:themeColor="text1"/>
+          <w:szCs w:val="24"/>
+        </w:rPr>
+      </w:pPr>
+      <w:r>
+        <w:rPr>
+          <w:iCs/>
+          <w:color w:val="000000" w:themeColor="text1"/>
+          <w:szCs w:val="24"/>
+        </w:rPr>
+        <w:t>Weighting: 100% of the module</w:t>
+      </w:r>
+      <w:r>
+        <w:rPr>
+          <w:iCs/>
+          <w:color w:val="000000" w:themeColor="text1"/>
+          <w:spacing w:val="-7"/>
+          <w:szCs w:val="24"/>
+        </w:rPr>
+        <w:t xml:space="preserve"> </w:t>
+      </w:r>
+      <w:r>
+        <w:rPr>
+          <w:iCs/>
+          <w:color w:val="000000" w:themeColor="text1"/>
+          <w:szCs w:val="24"/>
+        </w:rPr>
+        <w:t>mark</w:t>
       </w:r>
     </w:p>
     <w:p>
       <w:pPr>
-        <w:spacing w:before="120" w:after="120" w:line="360" w:lineRule="auto"/>
-      </w:pPr>
-      <w:r>
-        <w:rPr>
-          <w:rFonts w:ascii="Times New Roman" w:eastAsia="Times New Roman" w:hAnsi="Times New Roman"/>
-          <w:sz w:val="28"/>
-        </w:rPr>
-        <w:t>Customer Class</w:t>
+        <w:pStyle w:val="Heading3"/>
+        <w:jc w:val="both"/>
+        <w:rPr>
+          <w:b/>
+          <w:bCs w:val="0"/>
+          <w:i/>
+          <w:iCs/>
+          <w:color w:val="000000" w:themeColor="text1"/>
+          <w:szCs w:val="24"/>
+        </w:rPr>
+      </w:pPr>
+      <w:r>
+        <w:rPr>
+          <w:iCs/>
+          <w:color w:val="000000" w:themeColor="text1"/>
+          <w:szCs w:val="24"/>
+        </w:rPr>
+        <w:t xml:space="preserve">Deadline: </w:t>
+      </w:r>
+      <w:r>
+        <w:rPr>
+          <w:iCs/>
+          <w:color w:val="000000" w:themeColor="text1"/>
+          <w:szCs w:val="24"/>
+        </w:rPr>
+        <w:t>11.59 PM</w:t>
+      </w:r>
+      <w:r>
+        <w:rPr>
+          <w:iCs/>
+          <w:color w:val="000000" w:themeColor="text1"/>
+          <w:szCs w:val="24"/>
+        </w:rPr>
+        <w:t xml:space="preserve"> </w:t>
+      </w:r>
+      <w:r>
+        <w:rPr>
+          <w:iCs/>
+          <w:color w:val="000000" w:themeColor="text1"/>
+          <w:szCs w:val="24"/>
+        </w:rPr>
+        <w:t>Tuesday</w:t>
+      </w:r>
+      <w:r>
+        <w:rPr>
+          <w:iCs/>
+          <w:color w:val="000000" w:themeColor="text1"/>
+          <w:szCs w:val="24"/>
+        </w:rPr>
+        <w:t xml:space="preserve"> the </w:t>
+      </w:r>
+      <w:r>
+        <w:rPr>
+          <w:iCs/>
+          <w:color w:val="000000" w:themeColor="text1"/>
+          <w:szCs w:val="24"/>
+        </w:rPr>
+        <w:t>30</w:t>
+      </w:r>
+      <w:r>
+        <w:rPr>
+          <w:iCs/>
+          <w:color w:val="000000" w:themeColor="text1"/>
+          <w:szCs w:val="24"/>
+          <w:vertAlign w:val="superscript"/>
+        </w:rPr>
+        <w:t>th</w:t>
+      </w:r>
+      <w:r>
+        <w:rPr>
+          <w:iCs/>
+          <w:color w:val="000000" w:themeColor="text1"/>
+          <w:szCs w:val="24"/>
+        </w:rPr>
+        <w:t xml:space="preserve"> June 2026</w:t>
       </w:r>
     </w:p>
     <w:p>
       <w:pPr>
-        <w:spacing w:before="120" w:after="120" w:line="360" w:lineRule="auto"/>
-      </w:pPr>
-      <w:r>
-        <w:rPr>
-          <w:rFonts w:ascii="Times New Roman" w:eastAsia="Times New Roman" w:hAnsi="Times New Roman"/>
-          <w:sz w:val="28"/>
-        </w:rPr>
-        <w:t>Admin Class</w:t>
+        <w:tabs>
+          <w:tab w:val="left" w:pos="4083"/>
+        </w:tabs>
+        <w:jc w:val="both"/>
+        <w:rPr>
+          <w:rFonts w:cstheme="majorBidi"/>
+          <w:bCs/>
+          <w:iCs/>
+          <w:sz w:val="24"/>
+          <w:szCs w:val="24"/>
+        </w:rPr>
+      </w:pPr>
+      <w:r>
+        <w:rPr>
+          <w:rFonts w:cstheme="majorBidi"/>
+          <w:bCs/>
+          <w:iCs/>
+          <w:sz w:val="24"/>
+          <w:szCs w:val="24"/>
+        </w:rPr>
+        <w:t xml:space="preserve"> Module Leader:</w:t>
+      </w:r>
+      <w:r>
+        <w:rPr>
+          <w:rFonts w:cstheme="majorBidi"/>
+          <w:bCs/>
+          <w:iCs/>
+          <w:spacing w:val="-1"/>
+          <w:sz w:val="24"/>
+          <w:szCs w:val="24"/>
+        </w:rPr>
+        <w:t xml:space="preserve"> </w:t>
+      </w:r>
+      <w:r>
+        <w:rPr>
+          <w:rFonts w:cstheme="majorBidi"/>
+          <w:bCs/>
+          <w:iCs/>
+          <w:spacing w:val="-1"/>
+          <w:sz w:val="24"/>
+          <w:szCs w:val="24"/>
+        </w:rPr>
+        <w:t>Ms.Shifani Mohideen</w:t>
+      </w:r>
+      <w:r>
+        <w:rPr>
+          <w:rFonts w:cstheme="majorBidi"/>
+          <w:bCs/>
+          <w:iCs/>
+          <w:sz w:val="24"/>
+          <w:szCs w:val="24"/>
+        </w:rPr>
+        <w:tab/>
+        <w:t xml:space="preserve">   </w:t>
+      </w:r>
+      <w:r>
+        <w:rPr>
+          <w:rFonts w:cstheme="majorBidi"/>
+          <w:bCs/>
+          <w:iCs/>
+          <w:sz w:val="24"/>
+          <w:szCs w:val="24"/>
+        </w:rPr>
+        <w:t xml:space="preserve">                       </w:t>
+      </w:r>
+      <w:r>
+        <w:rPr>
+          <w:rFonts w:cstheme="majorBidi"/>
+          <w:bCs/>
+          <w:iCs/>
+          <w:sz w:val="24"/>
+          <w:szCs w:val="24"/>
+        </w:rPr>
+        <w:t xml:space="preserve"> Student ID:</w:t>
+      </w:r>
+      <w:r>
+        <w:rPr>
+          <w:rFonts w:cstheme="majorBidi"/>
+          <w:bCs/>
+          <w:iCs/>
+          <w:sz w:val="24"/>
+          <w:szCs w:val="24"/>
+        </w:rPr>
+        <w:t xml:space="preserve"> E301118 / </w:t>
+      </w:r>
+      <w:r>
+        <w:rPr>
+          <w:rFonts w:cstheme="majorBidi"/>
+          <w:bCs/>
+          <w:iCs/>
+          <w:sz w:val="24"/>
+          <w:szCs w:val="24"/>
+        </w:rPr>
+        <w:t>25045082</w:t>
       </w:r>
     </w:p>
     <w:p>
       <w:pPr>
-        <w:spacing w:before="120" w:after="120" w:line="360" w:lineRule="auto"/>
-      </w:pPr>
-      <w:r>
-        <w:rPr>
-          <w:rFonts w:ascii="Times New Roman" w:eastAsia="Times New Roman" w:hAnsi="Times New Roman"/>
-          <w:sz w:val="28"/>
-        </w:rPr>
-        <w:t>Medicine Class</w:t>
+        <w:pStyle w:val="BodyText"/>
+        <w:spacing w:before="11"/>
+        <w:jc w:val="both"/>
+        <w:rPr>
+          <w:rFonts w:cstheme="majorBidi"/>
+          <w:sz w:val="24"/>
+          <w:szCs w:val="24"/>
+        </w:rPr>
+      </w:pPr>
+      <w:r>
+        <w:rPr>
+          <w:rFonts w:cstheme="majorBidi"/>
+          <w:sz w:val="24"/>
+          <w:szCs w:val="24"/>
+        </w:rPr>
+        <w:t xml:space="preserve">Please note that there are specific regulations concerning </w:t>
+      </w:r>
+      <w:r>
+        <w:rPr>
+          <w:rFonts w:cstheme="majorBidi"/>
+          <w:b/>
+          <w:bCs/>
+          <w:sz w:val="24"/>
+          <w:szCs w:val="24"/>
+        </w:rPr>
+        <w:t>the use of AI and Academic Misconduct</w:t>
+      </w:r>
+      <w:r>
+        <w:rPr>
+          <w:rFonts w:cstheme="majorBidi"/>
+          <w:sz w:val="24"/>
+          <w:szCs w:val="24"/>
+        </w:rPr>
+        <w:t>. Below are extracts from these regulations. By signing, you acknowledge that you have read and understood these extracts.</w:t>
       </w:r>
     </w:p>
     <w:p>
       <w:pPr>
-        <w:spacing w:before="120" w:after="120" w:line="360" w:lineRule="auto"/>
-      </w:pPr>
-      <w:r>
-        <w:rPr>
-          <w:rFonts w:ascii="Times New Roman" w:eastAsia="Times New Roman" w:hAnsi="Times New Roman"/>
-          <w:sz w:val="28"/>
-        </w:rPr>
-        <w:t>Order Class</w:t>
-      </w:r>
+        <w:pStyle w:val="BodyText"/>
+        <w:spacing w:before="11"/>
+        <w:jc w:val="both"/>
+        <w:rPr>
+          <w:rFonts w:cstheme="majorBidi"/>
+          <w:sz w:val="24"/>
+          <w:szCs w:val="24"/>
+          <w:u w:val="single"/>
+        </w:rPr>
+      </w:pPr>
+      <w:r>
+        <w:rPr>
+          <w:rFonts w:cstheme="majorBidi"/>
+          <w:sz w:val="24"/>
+          <w:szCs w:val="24"/>
+        </w:rPr>
+        <w:lastRenderedPageBreak/>
+        <w:t>(signature:)</w:t>
+      </w:r>
+      <w:r>
+        <w:rPr>
+          <w:rFonts w:cstheme="majorBidi"/>
+          <w:sz w:val="24"/>
+          <w:szCs w:val="24"/>
+          <w:u w:val="single"/>
+        </w:rPr>
+        <w:t xml:space="preserve"> </w:t>
+      </w:r>
+      <w:r>
+        <w:rPr>
+          <w:rFonts w:cstheme="majorBidi"/>
+          <w:sz w:val="24"/>
+          <w:szCs w:val="24"/>
+          <w:u w:val="single"/>
+        </w:rPr>
+        <w:tab/>
+      </w:r>
+      <w:r>
+        <w:rPr>
+          <w:rFonts w:cstheme="majorBidi"/>
+          <w:sz w:val="24"/>
+          <w:szCs w:val="24"/>
+          <w:u w:val="single"/>
+        </w:rPr>
+        <w:t xml:space="preserve">M.N Sahla Baanu </w:t>
+      </w:r>
+      <w:r>
+        <w:rPr>
+          <w:rFonts w:cstheme="majorBidi"/>
+          <w:sz w:val="24"/>
+          <w:szCs w:val="24"/>
+          <w:u w:val="single"/>
+        </w:rPr>
+        <w:tab/>
+        <w:t xml:space="preserve">  </w:t>
+      </w:r>
+      <w:r>
+        <w:rPr>
+          <w:rFonts w:cstheme="majorBidi"/>
+          <w:sz w:val="24"/>
+          <w:szCs w:val="24"/>
+          <w:u w:val="single"/>
+        </w:rPr>
+        <w:tab/>
+      </w:r>
+      <w:r>
+        <w:rPr>
+          <w:rFonts w:cstheme="majorBidi"/>
+          <w:sz w:val="24"/>
+          <w:szCs w:val="24"/>
+        </w:rPr>
+        <w:t xml:space="preserve">Date: </w:t>
+      </w:r>
+      <w:r>
+        <w:rPr>
+          <w:rFonts w:cstheme="majorBidi"/>
+          <w:sz w:val="24"/>
+          <w:szCs w:val="24"/>
+          <w:u w:val="single"/>
+        </w:rPr>
+        <w:t xml:space="preserve"> </w:t>
+      </w:r>
+      <w:r>
+        <w:rPr>
+          <w:rFonts w:cstheme="majorBidi"/>
+          <w:sz w:val="24"/>
+          <w:szCs w:val="24"/>
+          <w:u w:val="single"/>
+        </w:rPr>
+        <w:tab/>
+      </w:r>
+      <w:r>
+        <w:rPr>
+          <w:rFonts w:cstheme="majorBidi"/>
+          <w:sz w:val="24"/>
+          <w:szCs w:val="24"/>
+          <w:u w:val="single"/>
+        </w:rPr>
+        <w:tab/>
+      </w:r>
+      <w:r>
+        <w:rPr>
+          <w:rFonts w:cstheme="majorBidi"/>
+          <w:sz w:val="24"/>
+          <w:szCs w:val="24"/>
+          <w:u w:val="single"/>
+        </w:rPr>
+        <w:t>30/06/2026</w:t>
+      </w:r>
+      <w:r>
+        <w:rPr>
+          <w:rFonts w:cstheme="majorBidi"/>
+          <w:sz w:val="24"/>
+          <w:szCs w:val="24"/>
+          <w:u w:val="single"/>
+        </w:rPr>
+        <w:tab/>
+      </w:r>
+      <w:r>
+        <w:rPr>
+          <w:rFonts w:cstheme="majorBidi"/>
+          <w:noProof/>
+          <w:u w:val="single"/>
+        </w:rPr>
+        <mc:AlternateContent>
+          <mc:Choice Requires="wps">
+            <w:drawing>
+              <wp:anchor distT="0" distB="0" distL="114300" distR="114300" simplePos="0" relativeHeight="251659776" behindDoc="0" locked="0" layoutInCell="1" allowOverlap="1" wp14:anchorId="39AADF2D" wp14:editId="68E49189">
+                <wp:simplePos x="0" y="0"/>
+                <wp:positionH relativeFrom="column">
+                  <wp:posOffset>-101600</wp:posOffset>
+                </wp:positionH>
+                <wp:positionV relativeFrom="paragraph">
+                  <wp:posOffset>591820</wp:posOffset>
+                </wp:positionV>
+                <wp:extent cx="6138545" cy="5257800"/>
+                <wp:effectExtent l="0" t="0" r="14605" b="19050"/>
+                <wp:wrapSquare wrapText="bothSides"/>
+                <wp:docPr id="1768847203" name="Text Box 1"/>
+                <wp:cNvGraphicFramePr/>
+                <a:graphic xmlns:a="http://schemas.openxmlformats.org/drawingml/2006/main">
+                  <a:graphicData uri="http://schemas.microsoft.com/office/word/2010/wordprocessingShape">
+                    <wps:wsp>
+                      <wps:cNvSpPr txBox="1"/>
+                      <wps:spPr>
+                        <a:xfrm>
+                          <a:off x="0" y="0"/>
+                          <a:ext cx="6138545" cy="5257800"/>
+                        </a:xfrm>
+                        <a:prstGeom prst="rect">
+                          <a:avLst/>
+                        </a:prstGeom>
+                        <a:noFill/>
+                        <a:ln w="6350">
+                          <a:solidFill>
+                            <a:prstClr val="black"/>
+                          </a:solidFill>
+                        </a:ln>
+                      </wps:spPr>
+                      <wps:txbx>
+                        <w:txbxContent>
+                          <w:p>
+                            <w:pPr>
+                              <w:pStyle w:val="BodyText"/>
+                              <w:spacing w:before="52"/>
+                              <w:ind w:right="-4"/>
+                              <w:jc w:val="both"/>
+                              <w:rPr>
+                                <w:rFonts w:cstheme="majorBidi"/>
+                              </w:rPr>
+                            </w:pPr>
+                            <w:r>
+                              <w:rPr>
+                                <w:rFonts w:cstheme="majorBidi"/>
+                              </w:rPr>
+                              <w:t xml:space="preserve">This header sheet should be attached to the work you submit. </w:t>
+                            </w:r>
+                          </w:p>
+                          <w:p>
+                            <w:pPr>
+                              <w:jc w:val="both"/>
+                              <w:rPr>
+                                <w:rFonts w:cstheme="majorBidi"/>
+                              </w:rPr>
+                            </w:pPr>
+                            <w:r>
+                              <w:rPr>
+                                <w:rFonts w:cstheme="majorBidi"/>
+                              </w:rPr>
+                              <w:t xml:space="preserve">Academic Integrity means being honest in your academic work and your studies and making sure that you acknowledge the work of others and giving credit where you have used other people's ideas as part of presenting your arguments. Your assessment submissions must therefore always be entirely your own work, based on your own learning and appropriately referenced including how you have used Generative AI. The University regards the use of Generative AI applications by students to deceive to gain unfair advantage as </w:t>
+                            </w:r>
+                            <w:r>
+                              <w:rPr>
+                                <w:rFonts w:cstheme="majorBidi"/>
+                                <w:b/>
+                                <w:bCs/>
+                              </w:rPr>
+                              <w:t>academic misconduct</w:t>
+                            </w:r>
+                            <w:r>
+                              <w:rPr>
+                                <w:rFonts w:cstheme="majorBidi"/>
+                              </w:rPr>
+                              <w:t>. This usage includes:</w:t>
+                            </w:r>
+                          </w:p>
+                          <w:p>
+                            <w:pPr>
+                              <w:pStyle w:val="ListParagraph"/>
+                              <w:ind w:left="578"/>
+                              <w:jc w:val="both"/>
+                              <w:rPr>
+                                <w:rFonts w:cstheme="majorBidi"/>
+                              </w:rPr>
+                            </w:pPr>
+                          </w:p>
+                          <w:p>
+                            <w:pPr>
+                              <w:pStyle w:val="ListParagraph"/>
+                              <w:numPr>
+                                <w:ilvl w:val="0"/>
+                                <w:numId w:val="10"/>
+                              </w:numPr>
+                              <w:spacing w:after="0" w:line="240" w:lineRule="auto"/>
+                              <w:ind w:left="578"/>
+                              <w:jc w:val="both"/>
+                              <w:rPr>
+                                <w:rFonts w:cstheme="majorBidi"/>
+                              </w:rPr>
+                            </w:pPr>
+                            <w:r>
+                              <w:rPr>
+                                <w:rFonts w:eastAsiaTheme="majorEastAsia" w:cstheme="majorBidi"/>
+                                <w:b/>
+                                <w:bCs/>
+                              </w:rPr>
+                              <w:t>Plagiarism</w:t>
+                            </w:r>
+                            <w:r>
+                              <w:rPr>
+                                <w:rFonts w:cstheme="majorBidi"/>
+                              </w:rPr>
+                              <w:t>, where AI tools are used to generate output and ideas that are presented or submitted as if they were the student's own work, without proper citation or references.</w:t>
+                            </w:r>
+                          </w:p>
+                          <w:p>
+                            <w:pPr>
+                              <w:pStyle w:val="ListParagraph"/>
+                              <w:numPr>
+                                <w:ilvl w:val="0"/>
+                                <w:numId w:val="10"/>
+                              </w:numPr>
+                              <w:spacing w:after="0" w:line="240" w:lineRule="auto"/>
+                              <w:ind w:left="578"/>
+                              <w:jc w:val="both"/>
+                              <w:rPr>
+                                <w:rFonts w:cstheme="majorBidi"/>
+                              </w:rPr>
+                            </w:pPr>
+                            <w:r>
+                              <w:rPr>
+                                <w:rFonts w:cstheme="majorBidi"/>
+                              </w:rPr>
+                              <w:t>Where a complete assignment is created using Generative AI and represented as a student's own work, this will be regarded as </w:t>
+                            </w:r>
+                            <w:r>
+                              <w:rPr>
+                                <w:rFonts w:eastAsiaTheme="majorEastAsia" w:cstheme="majorBidi"/>
+                              </w:rPr>
+                              <w:t>contract cheating</w:t>
+                            </w:r>
+                            <w:r>
+                              <w:rPr>
+                                <w:rFonts w:cstheme="majorBidi"/>
+                              </w:rPr>
+                              <w:t xml:space="preserve"> in the same way as commissioning an 'Essay Mill' or other third party to complete your work. Further information can be found on : </w:t>
+                            </w:r>
+                            <w:hyperlink r:id="rId7" w:history="1">
+                              <w:r>
+                                <w:rPr>
+                                  <w:rStyle w:val="Hyperlink"/>
+                                  <w:rFonts w:eastAsiaTheme="majorEastAsia" w:cstheme="majorBidi"/>
+                                </w:rPr>
+                                <w:t>Guidance on the use of Artificial Intelligence.</w:t>
+                              </w:r>
+                            </w:hyperlink>
+                          </w:p>
+                          <w:p>
+                            <w:pPr>
+                              <w:jc w:val="both"/>
+                              <w:rPr>
+                                <w:rFonts w:cstheme="majorBidi"/>
+                              </w:rPr>
+                            </w:pPr>
+                          </w:p>
+                          <w:p>
+                            <w:pPr>
+                              <w:jc w:val="both"/>
+                              <w:rPr>
+                                <w:rFonts w:cstheme="majorBidi"/>
+                              </w:rPr>
+                            </w:pPr>
+                            <w:r>
+                              <w:rPr>
+                                <w:rFonts w:cstheme="majorBidi"/>
+                                <w:b/>
+                                <w:bCs/>
+                              </w:rPr>
+                              <w:t>Academic misconduct:</w:t>
+                            </w:r>
+                            <w:r>
+                              <w:rPr>
+                                <w:rFonts w:cstheme="majorBidi"/>
+                              </w:rPr>
+                              <w:t xml:space="preserve"> The University takes academic misconduct very seriously and seeks at all times to rigorously protect its academic standards. Plagiarism, collusion and other forms of cheating constitute academic misconduct, for which there is an explicit range of graduated penalties depending on the particular type of academic misconduct. The penalties that can be applied if academic misconduct is substantiated range from a reprimand to expulsion in very serious cases and for repeated instances of misconduct. You are also responsible for ensuring that all work submitted is your own and that it is appropriately referenced. The University does not tolerate cheating of any kind. You are strongly advised to familiarise yourself with the Academic Misconduct Policy and Procedure (</w:t>
+                            </w:r>
+                            <w:hyperlink r:id="rId8" w:history="1">
+                              <w:r>
+                                <w:rPr>
+                                  <w:rStyle w:val="Hyperlink"/>
+                                  <w:rFonts w:cstheme="majorBidi"/>
+                                </w:rPr>
+                                <w:t>Academic Misconduct</w:t>
+                              </w:r>
+                            </w:hyperlink>
+                            <w:r>
+                              <w:rPr>
+                                <w:rFonts w:cstheme="majorBidi"/>
+                              </w:rPr>
+                              <w:t>), which list a range of categories of academic misconduct and associated penalties, covering instances of academic misconduct (plagiarism, collusion, exam cheating).</w:t>
+                            </w:r>
+                          </w:p>
+                        </w:txbxContent>
+                      </wps:txbx>
+                      <wps:bodyPr rot="0" spcFirstLastPara="0" vertOverflow="overflow" horzOverflow="overflow" vert="horz" wrap="square" lIns="91440" tIns="45720" rIns="91440" bIns="45720" numCol="1" spcCol="0" rtlCol="0" fromWordArt="0" anchor="t" anchorCtr="0" forceAA="0" compatLnSpc="1">
+                        <a:prstTxWarp prst="textNoShape">
+                          <a:avLst/>
+                        </a:prstTxWarp>
+                        <a:noAutofit/>
+                      </wps:bodyPr>
+                    </wps:wsp>
+                  </a:graphicData>
+                </a:graphic>
+                <wp14:sizeRelH relativeFrom="margin">
+                  <wp14:pctWidth>0</wp14:pctWidth>
+                </wp14:sizeRelH>
+                <wp14:sizeRelV relativeFrom="margin">
+                  <wp14:pctHeight>0</wp14:pctHeight>
+                </wp14:sizeRelV>
+              </wp:anchor>
+            </w:drawing>
+          </mc:Choice>
+          <mc:Fallback>
+            <w:pict>
+              <v:shapetype w14:anchorId="39AADF2D" id="_x0000_t202" coordsize="21600,21600" o:spt="202" path="m,l,21600r21600,l21600,xe">
+                <v:stroke joinstyle="miter"/>
+                <v:path gradientshapeok="t" o:connecttype="rect"/>
+              </v:shapetype>
+              <v:shape id="Text Box 1" o:spid="_x0000_s1026" type="#_x0000_t202" style="position:absolute;left:0;text-align:left;margin-left:-8pt;margin-top:46.6pt;width:483.35pt;height:414pt;z-index:251659776;visibility:visible;mso-wrap-style:square;mso-width-percent:0;mso-height-percent:0;mso-wrap-distance-left:9pt;mso-wrap-distance-top:0;mso-wrap-distance-right:9pt;mso-wrap-distance-bottom:0;mso-position-horizontal:absolute;mso-position-horizontal-relative:text;mso-position-vertical:absolute;mso-position-vertical-relative:text;mso-width-percent:0;mso-height-percent:0;mso-width-relative:margin;mso-height-relative:margin;v-text-anchor:top" o:gfxdata="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" filled="f" strokeweight=".5pt">
+                <v:textbox>
+                  <w:txbxContent>
+                    <w:p>
+                      <w:pPr>
+                        <w:pStyle w:val="BodyText"/>
+                        <w:spacing w:before="52"/>
+                        <w:ind w:right="-4"/>
+                        <w:jc w:val="both"/>
+                        <w:rPr>
+                          <w:rFonts w:cstheme="majorBidi"/>
+                        </w:rPr>
+                      </w:pPr>
+                      <w:r>
+                        <w:rPr>
+                          <w:rFonts w:cstheme="majorBidi"/>
+                        </w:rPr>
+                        <w:t xml:space="preserve">This header sheet should be attached to the work you submit. </w:t>
+                      </w:r>
+                    </w:p>
+                    <w:p>
+                      <w:pPr>
+                        <w:jc w:val="both"/>
+                        <w:rPr>
+                          <w:rFonts w:cstheme="majorBidi"/>
+                        </w:rPr>
+                      </w:pPr>
+                      <w:r>
+                        <w:rPr>
+                          <w:rFonts w:cstheme="majorBidi"/>
+                        </w:rPr>
+                        <w:t xml:space="preserve">Academic Integrity means being honest in your academic work and your studies and making sure that you acknowledge the work of others and giving credit where you have used other people's ideas as part of presenting your arguments. Your assessment submissions must therefore always be entirely your own work, based on your own learning and appropriately referenced including how you have used Generative AI. The University regards the use of Generative AI applications by students to deceive to gain unfair advantage as </w:t>
+                      </w:r>
+                      <w:r>
+                        <w:rPr>
+                          <w:rFonts w:cstheme="majorBidi"/>
+                          <w:b/>
+                          <w:bCs/>
+                        </w:rPr>
+                        <w:t>academic misconduct</w:t>
+                      </w:r>
+                      <w:r>
+                        <w:rPr>
+                          <w:rFonts w:cstheme="majorBidi"/>
+                        </w:rPr>
+                        <w:t>. This usage includes:</w:t>
+                      </w:r>
+                    </w:p>
+                    <w:p>
+                      <w:pPr>
+                        <w:pStyle w:val="ListParagraph"/>
+                        <w:ind w:left="578"/>
+                        <w:jc w:val="both"/>
+                        <w:rPr>
+                          <w:rFonts w:cstheme="majorBidi"/>
+                        </w:rPr>
+                      </w:pPr>
+                    </w:p>
+                    <w:p>
+                      <w:pPr>
+                        <w:pStyle w:val="ListParagraph"/>
+                        <w:numPr>
+                          <w:ilvl w:val="0"/>
+                          <w:numId w:val="10"/>
+                        </w:numPr>
+                        <w:spacing w:after="0" w:line="240" w:lineRule="auto"/>
+                        <w:ind w:left="578"/>
+                        <w:jc w:val="both"/>
+                        <w:rPr>
+                          <w:rFonts w:cstheme="majorBidi"/>
+                        </w:rPr>
+                      </w:pPr>
+                      <w:r>
+                        <w:rPr>
+                          <w:rFonts w:eastAsiaTheme="majorEastAsia" w:cstheme="majorBidi"/>
+                          <w:b/>
+                          <w:bCs/>
+                        </w:rPr>
+                        <w:t>Plagiarism</w:t>
+                      </w:r>
+                      <w:r>
+                        <w:rPr>
+                          <w:rFonts w:cstheme="majorBidi"/>
+                        </w:rPr>
+                        <w:t>, where AI tools are used to generate output and ideas that are presented or submitted as if they were the student's own work, without proper citation or references.</w:t>
+                      </w:r>
+                    </w:p>
+                    <w:p>
+                      <w:pPr>
+                        <w:pStyle w:val="ListParagraph"/>
+                        <w:numPr>
+                          <w:ilvl w:val="0"/>
+                          <w:numId w:val="10"/>
+                        </w:numPr>
+                        <w:spacing w:after="0" w:line="240" w:lineRule="auto"/>
+                        <w:ind w:left="578"/>
+                        <w:jc w:val="both"/>
+                        <w:rPr>
+                          <w:rFonts w:cstheme="majorBidi"/>
+                        </w:rPr>
+                      </w:pPr>
+                      <w:r>
+                        <w:rPr>
+                          <w:rFonts w:cstheme="majorBidi"/>
+                        </w:rPr>
+                        <w:t>Where a complete assignment is created using Generative AI and represented as a student's own work, this will be regarded as </w:t>
+                      </w:r>
+                      <w:r>
+                        <w:rPr>
+                          <w:rFonts w:eastAsiaTheme="majorEastAsia" w:cstheme="majorBidi"/>
+                        </w:rPr>
+                        <w:t>contract cheating</w:t>
+                      </w:r>
+                      <w:r>
+                        <w:rPr>
+                          <w:rFonts w:cstheme="majorBidi"/>
+                        </w:rPr>
+                        <w:t xml:space="preserve"> in the same way as commissioning an 'Essay Mill' or other third party to complete your work. Further information can be found on : </w:t>
+                      </w:r>
+                      <w:hyperlink r:id="rId9" w:history="1">
+                        <w:r>
+                          <w:rPr>
+                            <w:rStyle w:val="Hyperlink"/>
+                            <w:rFonts w:eastAsiaTheme="majorEastAsia" w:cstheme="majorBidi"/>
+                          </w:rPr>
+                          <w:t>Guidance on the use of Artificial Intelligence.</w:t>
+                        </w:r>
+                      </w:hyperlink>
+                    </w:p>
+                    <w:p>
+                      <w:pPr>
+                        <w:jc w:val="both"/>
+                        <w:rPr>
+                          <w:rFonts w:cstheme="majorBidi"/>
+                        </w:rPr>
+                      </w:pPr>
+                    </w:p>
+                    <w:p>
+                      <w:pPr>
+                        <w:jc w:val="both"/>
+                        <w:rPr>
+                          <w:rFonts w:cstheme="majorBidi"/>
+                        </w:rPr>
+                      </w:pPr>
+                      <w:r>
+                        <w:rPr>
+                          <w:rFonts w:cstheme="majorBidi"/>
+                          <w:b/>
+                          <w:bCs/>
+                        </w:rPr>
+                        <w:t>Academic misconduct:</w:t>
+                      </w:r>
+                      <w:r>
+                        <w:rPr>
+                          <w:rFonts w:cstheme="majorBidi"/>
+                        </w:rPr>
+                        <w:t xml:space="preserve"> The University takes academic misconduct very seriously and seeks at all times to rigorously protect its academic standards. Plagiarism, collusion and other forms of cheating constitute academic misconduct, for which there is an explicit range of graduated penalties depending on the particular type of academic misconduct. The penalties that can be applied if academic misconduct is substantiated range from a reprimand to expulsion in very serious cases and for repeated instances of misconduct. You are also responsible for ensuring that all work submitted is your own and that it is appropriately referenced. The University does not tolerate cheating of any kind. You are strongly advised to familiarise yourself with the Academic Misconduct Policy and Procedure (</w:t>
+                      </w:r>
+                      <w:hyperlink r:id="rId10" w:history="1">
+                        <w:r>
+                          <w:rPr>
+                            <w:rStyle w:val="Hyperlink"/>
+                            <w:rFonts w:cstheme="majorBidi"/>
+                          </w:rPr>
+                          <w:t>Academic Misconduct</w:t>
+                        </w:r>
+                      </w:hyperlink>
+                      <w:r>
+                        <w:rPr>
+                          <w:rFonts w:cstheme="majorBidi"/>
+                        </w:rPr>
+                        <w:t>), which list a range of categories of academic misconduct and associated penalties, covering instances of academic misconduct (plagiarism, collusion, exam cheating).</w:t>
+                      </w:r>
+                    </w:p>
+                  </w:txbxContent>
+                </v:textbox>
+                <w10:wrap type="square"/>
+              </v:shape>
+            </w:pict>
+          </mc:Fallback>
+        </mc:AlternateContent>
+      </w:r>
+      <w:bookmarkEnd w:id="0"/>
     </w:p>
     <w:p>
       <w:pPr>
-        <w:spacing w:before="120" w:after="120" w:line="360" w:lineRule="auto"/>
-      </w:pPr>
-      <w:r>
-        <w:rPr>
-          <w:rFonts w:ascii="Times New Roman" w:eastAsia="Times New Roman" w:hAnsi="Times New Roman"/>
-          <w:sz w:val="28"/>
-        </w:rPr>
-        <w:t>OrderItem Class</w:t>
-      </w:r>
+        <w:pStyle w:val="BodyText"/>
+        <w:spacing w:before="11"/>
+        <w:jc w:val="both"/>
+        <w:rPr>
+          <w:rFonts w:cstheme="majorBidi"/>
+          <w:sz w:val="24"/>
+          <w:szCs w:val="24"/>
+          <w:u w:val="single"/>
+        </w:rPr>
+      </w:pPr>
     </w:p>
     <w:p>
       <w:pPr>
-        <w:spacing w:before="120" w:after="120" w:line="360" w:lineRule="auto"/>
-      </w:pPr>
-      <w:r>
-        <w:rPr>
-          <w:rFonts w:ascii="Times New Roman" w:eastAsia="Times New Roman" w:hAnsi="Times New Roman"/>
-          <w:sz w:val="28"/>
-        </w:rPr>
-        <w:t>Prescription Class</w:t>
+        <w:pStyle w:val="Heading1"/>
+      </w:pPr>
+      <w:r>
+        <w:t>Introduction</w:t>
       </w:r>
     </w:p>
     <w:p>
       <w:pPr>
-        <w:spacing w:before="240" w:after="120" w:line="360" w:lineRule="auto"/>
-      </w:pPr>
-      <w:r>
-        <w:rPr>
-          <w:rFonts w:ascii="Times New Roman" w:eastAsia="Times New Roman" w:hAnsi="Times New Roman"/>
-          <w:sz w:val="36"/>
-        </w:rPr>
-        <w:t>Search Algorithms Used in the Project</w:t>
+        <w:spacing w:line="360" w:lineRule="auto"/>
+        <w:jc w:val="both"/>
+      </w:pPr>
+      <w:r>
+        <w:rPr>
+          <w:rFonts w:ascii="Times New Roman" w:hAnsi="Times New Roman"/>
+          <w:sz w:val="24"/>
+        </w:rPr>
+        <w:t>SmartMed Pharmacy is a desktop Windows Forms application developed in C# using the .NET Framework 4.8. The system supports two user roles: administrators who manage inventory, customers, and orders, and customers who search for medicines, place orders, and track fulfilment status. The application follows a three-tier architecture separating presentation (SmartMed.UI), business logic (SmartMed.Business), and data access (SmartMed.Data) with persistence in Microsoft SQL Server.</w:t>
       </w:r>
     </w:p>
     <w:p>
       <w:pPr>
-        <w:spacing w:before="240" w:after="120" w:line="360" w:lineRule="auto"/>
-      </w:pPr>
-      <w:r>
-        <w:rPr>
-          <w:rFonts w:ascii="Times New Roman" w:eastAsia="Times New Roman" w:hAnsi="Times New Roman"/>
-          <w:sz w:val="36"/>
-        </w:rPr>
-        <w:t>Reflective Essay</w:t>
+        <w:spacing w:line="360" w:lineRule="auto"/>
+        <w:jc w:val="both"/>
+      </w:pPr>
+      <w:r>
+        <w:rPr>
+          <w:rFonts w:ascii="Times New Roman" w:hAnsi="Times New Roman"/>
+          <w:sz w:val="24"/>
+        </w:rPr>
+        <w:lastRenderedPageBreak/>
+        <w:t>This report documents how to run the software, describes the architecture and class design aligned with the coursework diagrams, explains the search algorithms used for medicine catalogue queries, and includes a reflective essay on the development experience. The implementation satisfies the mandatory functional requirements from the assignment brief, including login, registration, medicine CRUD, customer management, order processing, reports, dashboard, and linear search with filtering.</w:t>
       </w:r>
     </w:p>
     <w:p>
       <w:pPr>
-        <w:spacing w:before="120" w:after="120" w:line="360" w:lineRule="auto"/>
-      </w:pPr>
-      <w:r>
-        <w:rPr>
-          <w:rFonts w:ascii="Times New Roman" w:eastAsia="Times New Roman" w:hAnsi="Times New Roman"/>
-          <w:sz w:val="28"/>
-        </w:rPr>
-        <w:t>Experience with C# and Visual Studio</w:t>
+        <w:pStyle w:val="Heading1"/>
+        <w:spacing w:line="360" w:lineRule="auto"/>
+        <w:jc w:val="both"/>
+      </w:pPr>
+      <w:r>
+        <w:t>Detailed Instructions to Run the Program</w:t>
       </w:r>
     </w:p>
     <w:p>
       <w:pPr>
-        <w:spacing w:before="120" w:after="120" w:line="360" w:lineRule="auto"/>
-      </w:pPr>
-      <w:r>
-        <w:rPr>
-          <w:rFonts w:ascii="Times New Roman" w:eastAsia="Times New Roman" w:hAnsi="Times New Roman"/>
-          <w:sz w:val="28"/>
-        </w:rPr>
-        <w:t>Features Liked and Rationale</w:t>
+        <w:spacing w:line="360" w:lineRule="auto"/>
+      </w:pPr>
+      <w:r>
+        <w:rPr>
+          <w:rFonts w:ascii="Times New Roman" w:hAnsi="Times New Roman"/>
+          <w:sz w:val="24"/>
+        </w:rPr>
+        <w:t>Prerequisites:</w:t>
+      </w:r>
+      <w:r>
+        <w:rPr>
+          <w:rFonts w:ascii="Times New Roman" w:hAnsi="Times New Roman"/>
+          <w:sz w:val="24"/>
+        </w:rPr>
+        <w:br/>
+        <w:t>• Windows 10 or later with .NET Framework 4.8 installed.</w:t>
+      </w:r>
+      <w:r>
+        <w:rPr>
+          <w:rFonts w:ascii="Times New Roman" w:hAnsi="Times New Roman"/>
+          <w:sz w:val="24"/>
+        </w:rPr>
+        <w:br/>
+        <w:t>• Visual Studio 2019 or later with the .NET desktop development workload.</w:t>
+      </w:r>
+      <w:r>
+        <w:rPr>
+          <w:rFonts w:ascii="Times New Roman" w:hAnsi="Times New Roman"/>
+          <w:sz w:val="24"/>
+        </w:rPr>
+        <w:br/>
+        <w:t>• SQL Server Express, LocalDB, or full SQL Server with Windows Authentication.</w:t>
       </w:r>
     </w:p>
     <w:p>
       <w:pPr>
-        <w:spacing w:before="120" w:after="120" w:line="360" w:lineRule="auto"/>
-      </w:pPr>
-      <w:r>
-        <w:rPr>
-          <w:rFonts w:ascii="Times New Roman" w:eastAsia="Times New Roman" w:hAnsi="Times New Roman"/>
-          <w:sz w:val="28"/>
-        </w:rPr>
-        <w:t>Challenges Faced and Solutions Applied</w:t>
+        <w:spacing w:line="360" w:lineRule="auto"/>
+      </w:pPr>
+      <w:r>
+        <w:rPr>
+          <w:rFonts w:ascii="Times New Roman" w:hAnsi="Times New Roman"/>
+          <w:sz w:val="24"/>
+        </w:rPr>
+        <w:t>Database setup:</w:t>
+      </w:r>
+      <w:r>
+        <w:rPr>
+          <w:rFonts w:ascii="Times New Roman" w:hAnsi="Times New Roman"/>
+          <w:sz w:val="24"/>
+        </w:rPr>
+        <w:br/>
+        <w:t>1. Open SQL Server Management Studio (SSMS).</w:t>
+      </w:r>
+      <w:r>
+        <w:rPr>
+          <w:rFonts w:ascii="Times New Roman" w:hAnsi="Times New Roman"/>
+          <w:sz w:val="24"/>
+        </w:rPr>
+        <w:br/>
+        <w:t>2. Open the script Database/SmartMedDB.sql from the project folder.</w:t>
+      </w:r>
+      <w:r>
+        <w:rPr>
+          <w:rFonts w:ascii="Times New Roman" w:hAnsi="Times New Roman"/>
+          <w:sz w:val="24"/>
+        </w:rPr>
+        <w:br/>
+        <w:t>3. Execute the script. It creates the SmartMedDB database, all tables, constraints, and seed data.</w:t>
+      </w:r>
+      <w:r>
+        <w:rPr>
+          <w:rFonts w:ascii="Times New Roman" w:hAnsi="Times New Roman"/>
+          <w:sz w:val="24"/>
+        </w:rPr>
+        <w:br/>
+        <w:t>4. Default admin credentials: Username admin, Password admin123.</w:t>
+      </w:r>
+      <w:r>
+        <w:rPr>
+          <w:rFonts w:ascii="Times New Roman" w:hAnsi="Times New Roman"/>
+          <w:sz w:val="24"/>
+        </w:rPr>
+        <w:br/>
+        <w:t>5. Sample customer: john@email.com / customer123.</w:t>
       </w:r>
     </w:p>
     <w:p>
       <w:pPr>
-        <w:spacing w:before="120" w:after="120" w:line="360" w:lineRule="auto"/>
-      </w:pPr>
-      <w:r>
-        <w:rPr>
-          <w:rFonts w:ascii="Times New Roman" w:eastAsia="Times New Roman" w:hAnsi="Times New Roman"/>
-          <w:sz w:val="28"/>
-        </w:rPr>
-        <w:t>Future Improvements</w:t>
+        <w:spacing w:line="360" w:lineRule="auto"/>
+      </w:pPr>
+      <w:r>
+        <w:rPr>
+          <w:rFonts w:ascii="Times New Roman" w:hAnsi="Times New Roman"/>
+          <w:sz w:val="24"/>
+        </w:rPr>
+        <w:t>Connection string:</w:t>
+      </w:r>
+      <w:r>
+        <w:rPr>
+          <w:rFonts w:ascii="Times New Roman" w:hAnsi="Times New Roman"/>
+          <w:sz w:val="24"/>
+        </w:rPr>
+        <w:br/>
+        <w:t>1. Open SmartMed.UI/App.config.</w:t>
+      </w:r>
+      <w:r>
+        <w:rPr>
+          <w:rFonts w:ascii="Times New Roman" w:hAnsi="Times New Roman"/>
+          <w:sz w:val="24"/>
+        </w:rPr>
+        <w:br/>
+        <w:t>2. Adjust the SmartMedDB connection string if your SQL Server instance is not the default local instance (.). For LocalDB use: Data Source=(localdb)\MSSQLLocalDB;Initial Catalog=SmartMedDB;Integrated Security=True</w:t>
       </w:r>
     </w:p>
     <w:p>
       <w:pPr>
-        <w:spacing w:before="240" w:after="120" w:line="360" w:lineRule="auto"/>
-      </w:pPr>
-      <w:r>
-        <w:rPr>
-          <w:rFonts w:ascii="Times New Roman" w:eastAsia="Times New Roman" w:hAnsi="Times New Roman"/>
-          <w:sz w:val="36"/>
-        </w:rPr>
-        <w:t>Conclusion</w:t>
+        <w:spacing w:line="360" w:lineRule="auto"/>
+      </w:pPr>
+      <w:r>
+        <w:rPr>
+          <w:rFonts w:ascii="Times New Roman" w:hAnsi="Times New Roman"/>
+          <w:sz w:val="24"/>
+        </w:rPr>
+        <w:t>Build and run:</w:t>
+      </w:r>
+      <w:r>
+        <w:rPr>
+          <w:rFonts w:ascii="Times New Roman" w:hAnsi="Times New Roman"/>
+          <w:sz w:val="24"/>
+        </w:rPr>
+        <w:br/>
+        <w:t>1. Open SmartMed.sln in Visual Studio.</w:t>
+      </w:r>
+      <w:r>
+        <w:rPr>
+          <w:rFonts w:ascii="Times New Roman" w:hAnsi="Times New Roman"/>
+          <w:sz w:val="24"/>
+        </w:rPr>
+        <w:br/>
+        <w:t>2. Right-click SmartMed.UI and Set as Startup Project.</w:t>
+      </w:r>
+      <w:r>
+        <w:rPr>
+          <w:rFonts w:ascii="Times New Roman" w:hAnsi="Times New Roman"/>
+          <w:sz w:val="24"/>
+        </w:rPr>
+        <w:br/>
+        <w:t>3. Build → Build Solution (Ctrl+Shift+B). Alternatively run: dotnet build SmartMed.sln from the solution folder.</w:t>
+      </w:r>
+      <w:r>
+        <w:rPr>
+          <w:rFonts w:ascii="Times New Roman" w:hAnsi="Times New Roman"/>
+          <w:sz w:val="24"/>
+        </w:rPr>
+        <w:br/>
+        <w:t>4. Press F5 to start debugging. The Login form appears first.</w:t>
+      </w:r>
+      <w:r>
+        <w:rPr>
+          <w:rFonts w:ascii="Times New Roman" w:hAnsi="Times New Roman"/>
+          <w:sz w:val="24"/>
+        </w:rPr>
+        <w:br/>
+      </w:r>
+      <w:r>
+        <w:rPr>
+          <w:rFonts w:ascii="Times New Roman" w:hAnsi="Times New Roman"/>
+          <w:sz w:val="24"/>
+        </w:rPr>
+        <w:lastRenderedPageBreak/>
+        <w:t>5. Log in as admin (admin / admin123) to access the admin dashboard, or register a new customer account.</w:t>
       </w:r>
     </w:p>
     <w:p>
       <w:pPr>
-        <w:spacing w:before="240" w:after="120" w:line="360" w:lineRule="auto"/>
-      </w:pPr>
-      <w:r>
-        <w:rPr>
-          <w:rFonts w:ascii="Times New Roman" w:eastAsia="Times New Roman" w:hAnsi="Times New Roman"/>
-          <w:sz w:val="36"/>
-        </w:rPr>
-        <w:t>References</w:t>
+        <w:spacing w:line="360" w:lineRule="auto"/>
+      </w:pPr>
+      <w:r>
+        <w:rPr>
+          <w:rFonts w:ascii="Times New Roman" w:hAnsi="Times New Roman"/>
+          <w:sz w:val="24"/>
+        </w:rPr>
+        <w:t>Admin workflow: Dashboard overview → Manage Medicines → Manage Customers → Manage Orders → Reports.</w:t>
+      </w:r>
+      <w:r>
+        <w:rPr>
+          <w:rFonts w:ascii="Times New Roman" w:hAnsi="Times New Roman"/>
+          <w:sz w:val="24"/>
+        </w:rPr>
+        <w:br/>
+        <w:t>Customer workflow: Register or login → Search Medicines → Place Order (cart) → Track Orders → Profile.</w:t>
       </w:r>
     </w:p>
     <w:p>
       <w:pPr>
-        <w:spacing w:before="240" w:after="120" w:line="360" w:lineRule="auto"/>
-      </w:pPr>
-      <w:r>
-        <w:rPr>
-          <w:rFonts w:ascii="Times New Roman" w:eastAsia="Times New Roman" w:hAnsi="Times New Roman"/>
-          <w:sz w:val="36"/>
-        </w:rPr>
-        <w:t>Appendices</w:t>
+        <w:pStyle w:val="Heading1"/>
+        <w:spacing w:line="360" w:lineRule="auto"/>
+        <w:jc w:val="both"/>
+      </w:pPr>
+      <w:r>
+        <w:t>System Overview</w:t>
       </w:r>
     </w:p>
     <w:p>
       <w:pPr>
-        <w:spacing w:before="120" w:after="120" w:line="360" w:lineRule="auto"/>
-      </w:pPr>
-      <w:r>
-        <w:rPr>
-          <w:rFonts w:ascii="Times New Roman" w:eastAsia="Times New Roman" w:hAnsi="Times New Roman"/>
-          <w:sz w:val="28"/>
-        </w:rPr>
-        <w:t>Appendix A: Use Case Diagram</w:t>
+        <w:spacing w:line="360" w:lineRule="auto"/>
+        <w:jc w:val="both"/>
+      </w:pPr>
+      <w:r>
+        <w:rPr>
+          <w:rFonts w:ascii="Times New Roman" w:hAnsi="Times New Roman"/>
+          <w:sz w:val="24"/>
+        </w:rPr>
+        <w:t>The SmartMed system is a single-user-session desktop application. On startup, Program.cs launches LoginForm. Successful authentication stores the current user in Session (SmartMed.Business) and opens either AdminDashboardForm or CustomerDashboardForm based on role. Each dashboard provides navigation buttons to feature-specific forms. All database access is routed through repository classes in SmartMed.Data; WinForms code never opens SQL connections directly, preserving separation of concerns.</w:t>
       </w:r>
     </w:p>
     <w:p>
       <w:pPr>
-        <w:spacing w:before="120" w:after="120" w:line="360" w:lineRule="auto"/>
-      </w:pPr>
-      <w:r>
-        <w:rPr>
-          <w:rFonts w:ascii="Times New Roman" w:eastAsia="Times New Roman" w:hAnsi="Times New Roman"/>
-          <w:sz w:val="28"/>
-        </w:rPr>
-        <w:t>Appendix B: Entity-Relationship Diagram</w:t>
+        <w:pStyle w:val="Heading2"/>
+        <w:spacing w:line="360" w:lineRule="auto"/>
+        <w:jc w:val="both"/>
+      </w:pPr>
+      <w:r>
+        <w:t>Three-Layer Architecture</w:t>
       </w:r>
     </w:p>
     <w:p>
       <w:pPr>
-        <w:spacing w:before="120" w:after="120" w:line="360" w:lineRule="auto"/>
-      </w:pPr>
-      <w:r>
-        <w:rPr>
-          <w:rFonts w:ascii="Times New Roman" w:eastAsia="Times New Roman" w:hAnsi="Times New Roman"/>
-          <w:sz w:val="28"/>
-        </w:rPr>
+        <w:spacing w:line="360" w:lineRule="auto"/>
+        <w:jc w:val="both"/>
+      </w:pPr>
+      <w:r>
+        <w:rPr>
+          <w:rFonts w:ascii="Times New Roman" w:hAnsi="Times New Roman"/>
+          <w:sz w:val="24"/>
+        </w:rPr>
+        <w:t>Presentation Layer (SmartMed.UI): Windows Forms for login, registration, admin dashboards, medicine CRUD, customer management, order management, reports, medicine search, cart/checkout, order tracking, and profile editing.</w:t>
+      </w:r>
+    </w:p>
+    <w:p>
+      <w:pPr>
+        <w:spacing w:line="360" w:lineRule="auto"/>
+        <w:jc w:val="both"/>
+      </w:pPr>
+      <w:r>
+        <w:rPr>
+          <w:rFonts w:ascii="Times New Roman" w:hAnsi="Times New Roman"/>
+          <w:sz w:val="24"/>
+        </w:rPr>
+        <w:t>Business Layer (SmartMed.Business): Entity classes (Person, Customer, Admin, Medicine, Order, OrderItem, Prescription), ValidationHelper for input rules, SearchHelper for linear search and filtering, Session for authenticated user state, and service classes (AuthService, MedicineService, OrderService, CustomerService, DashboardService) that coordinate validation and repository calls.</w:t>
+      </w:r>
+    </w:p>
+    <w:p>
+      <w:pPr>
+        <w:spacing w:line="360" w:lineRule="auto"/>
+        <w:jc w:val="both"/>
+      </w:pPr>
+      <w:r>
+        <w:rPr>
+          <w:rFonts w:ascii="Times New Roman" w:hAnsi="Times New Roman"/>
+          <w:sz w:val="24"/>
+        </w:rPr>
+        <w:t>Data Access Layer (SmartMed.Data): DatabaseHelper wraps SqlConnection and parameterized commands. Repositories (AdminRepository, CustomerRepository, MedicineRepository, OrderRepository) implement CRUD and queries. Data models map to database rows.</w:t>
+      </w:r>
+    </w:p>
+    <w:p>
+      <w:pPr>
+        <w:spacing w:line="360" w:lineRule="auto"/>
+        <w:jc w:val="both"/>
+      </w:pPr>
+      <w:r>
+        <w:rPr>
+          <w:rFonts w:ascii="Times New Roman" w:hAnsi="Times New Roman"/>
+          <w:sz w:val="24"/>
+        </w:rPr>
+        <w:lastRenderedPageBreak/>
+        <w:t>Database Layer: SQL Server database SmartMedDB with tables Admin, Customer, Medicine, Order, OrderItem, and Prescription. Foreign keys link orders to customers and order items to orders and medicines. Order.Status is constrained to Pending, Ready for Pickup, or Delivered.</w:t>
+      </w:r>
+    </w:p>
+    <w:p>
+      <w:pPr>
+        <w:pStyle w:val="Heading2"/>
+        <w:spacing w:line="360" w:lineRule="auto"/>
+        <w:jc w:val="both"/>
+      </w:pPr>
+      <w:r>
+        <w:t>Use Case Diagram</w:t>
+      </w:r>
+    </w:p>
+    <w:p>
+      <w:pPr>
+        <w:spacing w:line="360" w:lineRule="auto"/>
+        <w:jc w:val="both"/>
+      </w:pPr>
+      <w:r>
+        <w:rPr>
+          <w:rFonts w:ascii="Times New Roman" w:hAnsi="Times New Roman"/>
+          <w:sz w:val="24"/>
+        </w:rPr>
+        <w:t>The use case diagram (Diagrams/Usecase.drawio) identifies Admin actors (login, manage medicines, manage customers, manage orders, reports, dashboard) and Customer actors (register, login, search medicines, place orders, track orders, manage profile). Include relationships show that placing an order includes searching medicines and that order management includes status updates. The implemented forms map directly to these use cases.</w:t>
+      </w:r>
+    </w:p>
+    <w:p>
+      <w:pPr>
+        <w:pStyle w:val="Heading2"/>
+        <w:spacing w:line="360" w:lineRule="auto"/>
+        <w:jc w:val="both"/>
+      </w:pPr>
+      <w:r>
+        <w:t>Entity-Relationship Diagram</w:t>
+      </w:r>
+    </w:p>
+    <w:p>
+      <w:pPr>
+        <w:spacing w:line="360" w:lineRule="auto"/>
+        <w:jc w:val="both"/>
+      </w:pPr>
+      <w:r>
+        <w:rPr>
+          <w:rFonts w:ascii="Times New Roman" w:hAnsi="Times New Roman"/>
+          <w:sz w:val="24"/>
+        </w:rPr>
+        <w:t>The ER diagram (Diagrams/ER.drawio) models six entities. Admin is independent. Customer places Orders (one-to-many). Order contains OrderItems (one-to-many). Medicine appears in OrderItems (many-to-many resolved via OrderItem). Customer uploads Prescriptions (one-to-many). Primary keys are identity integers. The SQL script Database/SmartMedDB.sql implements this schema with appropriate foreign keys and a CHECK constraint on order status.</w:t>
+      </w:r>
+    </w:p>
+    <w:p>
+      <w:pPr>
+        <w:pStyle w:val="Heading2"/>
+        <w:spacing w:line="360" w:lineRule="auto"/>
+        <w:jc w:val="both"/>
+      </w:pPr>
+      <w:r>
+        <w:t>Class Diagram</w:t>
+      </w:r>
+    </w:p>
+    <w:p>
+      <w:pPr>
+        <w:spacing w:line="360" w:lineRule="auto"/>
+        <w:jc w:val="both"/>
+      </w:pPr>
+      <w:r>
+        <w:rPr>
+          <w:rFonts w:ascii="Times New Roman" w:hAnsi="Times New Roman"/>
+          <w:sz w:val="24"/>
+        </w:rPr>
+        <w:t>The class diagram (Diagrams/Class.drawio) shows Person as an abstract base with Name, Email, Phone, and Password. Customer and Admin inherit from Person. Customer adds CustomerID, Address, Register(), and Login(). Admin adds AdminID, Username, and Login(). Medicine, Order, OrderItem, and Prescription are separate entity classes. Business layer classes mirror this design; data layer uses flat DTO-style models for efficient ADO.NET mapping.</w:t>
+      </w:r>
+    </w:p>
+    <w:p>
+      <w:pPr>
+        <w:pStyle w:val="Heading3"/>
+        <w:spacing w:line="360" w:lineRule="auto"/>
+        <w:jc w:val="both"/>
+      </w:pPr>
+      <w:r>
+        <w:t>Class Relationships</w:t>
+      </w:r>
+    </w:p>
+    <w:p>
+      <w:pPr>
+        <w:spacing w:line="360" w:lineRule="auto"/>
+        <w:jc w:val="both"/>
+      </w:pPr>
+      <w:r>
+        <w:rPr>
+          <w:rFonts w:ascii="Times New Roman" w:hAnsi="Times New Roman"/>
+          <w:sz w:val="24"/>
+        </w:rPr>
+        <w:t>Inheritance: Customer and Admin extend Person, enabling shared validation of email and password fields. Composition: Order aggregates OrderItem records; each OrderItem references a Medicine. Association: Order belongs to Customer; Prescription belongs to Customer. Services depend on repositories (dependency direction: Business → Data). UI forms depend on services only, not repositories, maintaining the vertical architecture shown in Diagrams/Architecture.drawio.</w:t>
+      </w:r>
+    </w:p>
+    <w:p>
+      <w:pPr>
+        <w:pStyle w:val="Heading1"/>
+        <w:spacing w:line="360" w:lineRule="auto"/>
+        <w:jc w:val="both"/>
+      </w:pPr>
+      <w:r>
+        <w:lastRenderedPageBreak/>
+        <w:t>Source Code Attribution</w:t>
+      </w:r>
+    </w:p>
+    <w:p>
+      <w:pPr>
+        <w:spacing w:line="360" w:lineRule="auto"/>
+        <w:jc w:val="both"/>
+      </w:pPr>
+      <w:r>
+        <w:rPr>
+          <w:rFonts w:ascii="Times New Roman" w:hAnsi="Times New Roman"/>
+          <w:sz w:val="24"/>
+        </w:rPr>
+        <w:t>All source code in this submission was written for the SmartMed coursework. Standard Microsoft .NET Framework libraries (System.Windows.Forms, System.Data.SqlClient, System.Configuration) are used as documented. No third-party UI frameworks were used. Diagram source files are original draw.io diagrams created for this module. Any external references (Microsoft documentation for ADO.NET and WinForms) informed API usage but were not copied as code.</w:t>
+      </w:r>
+    </w:p>
+    <w:p>
+      <w:pPr>
+        <w:pStyle w:val="Heading2"/>
+        <w:spacing w:line="360" w:lineRule="auto"/>
+        <w:jc w:val="both"/>
+      </w:pPr>
+      <w:r>
+        <w:t>Admin Features</w:t>
+      </w:r>
+    </w:p>
+    <w:p>
+      <w:pPr>
+        <w:spacing w:line="360" w:lineRule="auto"/>
+        <w:jc w:val="both"/>
+      </w:pPr>
+      <w:r>
+        <w:rPr>
+          <w:rFonts w:ascii="Times New Roman" w:hAnsi="Times New Roman"/>
+          <w:sz w:val="24"/>
+        </w:rPr>
+        <w:t>Login: AuthService validates admin username and password against the Admin table via AdminRepository. Empty fields are rejected by ValidationHelper before database access.</w:t>
+      </w:r>
+    </w:p>
+    <w:p>
+      <w:pPr>
+        <w:spacing w:line="360" w:lineRule="auto"/>
+        <w:jc w:val="both"/>
+      </w:pPr>
+      <w:r>
+        <w:rPr>
+          <w:rFonts w:ascii="Times New Roman" w:hAnsi="Times New Roman"/>
+          <w:sz w:val="24"/>
+        </w:rPr>
+        <w:t>Manage Medicines: MedicineManagementForm provides add, update, delete, and list operations. Fields include name, category, dosage, price, stock quantity, supplier, expiry date, and prescription requirement. Numeric validation ensures price and stock are valid.</w:t>
+      </w:r>
+    </w:p>
+    <w:p>
+      <w:pPr>
+        <w:spacing w:line="360" w:lineRule="auto"/>
+        <w:jc w:val="both"/>
+      </w:pPr>
+      <w:r>
+        <w:rPr>
+          <w:rFonts w:ascii="Times New Roman" w:hAnsi="Times New Roman"/>
+          <w:sz w:val="24"/>
+        </w:rPr>
+        <w:t>Manage Customers: CustomerManagementForm lists registered customers and allows administrators to update contact details.</w:t>
+      </w:r>
+    </w:p>
+    <w:p>
+      <w:pPr>
+        <w:spacing w:line="360" w:lineRule="auto"/>
+        <w:jc w:val="both"/>
+      </w:pPr>
+      <w:r>
+        <w:rPr>
+          <w:rFonts w:ascii="Times New Roman" w:hAnsi="Times New Roman"/>
+          <w:sz w:val="24"/>
+        </w:rPr>
+        <w:t>Manage Orders: OrderManagementForm displays all orders with customer name, date, status, and total. Administrators can change status to Pending, Ready for Pickup, or Delivered.</w:t>
+      </w:r>
+    </w:p>
+    <w:p>
+      <w:pPr>
+        <w:spacing w:line="360" w:lineRule="auto"/>
+        <w:jc w:val="both"/>
+      </w:pPr>
+      <w:r>
+        <w:rPr>
+          <w:rFonts w:ascii="Times New Roman" w:hAnsi="Times New Roman"/>
+          <w:sz w:val="24"/>
+        </w:rPr>
+        <w:t>Reports: ReportsForm shows sales totals, stock summary, and customer order history using queries from OrderRepository and MedicineRepository.</w:t>
+      </w:r>
+    </w:p>
+    <w:p>
+      <w:pPr>
+        <w:spacing w:line="360" w:lineRule="auto"/>
+        <w:jc w:val="both"/>
+      </w:pPr>
+      <w:r>
+        <w:rPr>
+          <w:rFonts w:ascii="Times New Roman" w:hAnsi="Times New Roman"/>
+          <w:sz w:val="24"/>
+        </w:rPr>
+        <w:t>Dashboard: AdminOverviewForm displays aggregate metrics (total sales, medicines in stock, active orders) via DashboardService.</w:t>
+      </w:r>
+    </w:p>
+    <w:p>
+      <w:pPr>
+        <w:pStyle w:val="Heading2"/>
+        <w:spacing w:line="360" w:lineRule="auto"/>
+        <w:jc w:val="both"/>
+      </w:pPr>
+      <w:r>
+        <w:t>Customer Features</w:t>
+      </w:r>
+    </w:p>
+    <w:p>
+      <w:pPr>
+        <w:spacing w:line="360" w:lineRule="auto"/>
+        <w:jc w:val="both"/>
+      </w:pPr>
+      <w:r>
+        <w:rPr>
+          <w:rFonts w:ascii="Times New Roman" w:hAnsi="Times New Roman"/>
+          <w:sz w:val="24"/>
+        </w:rPr>
+        <w:t>Registration: RegistrationForm collects full name, email, phone, address, password, and confirmation. ValidationHelper checks required fields, email format, and password match before CustomerRepository inserts a new row.</w:t>
+      </w:r>
+    </w:p>
+    <w:p>
+      <w:pPr>
+        <w:spacing w:line="360" w:lineRule="auto"/>
+        <w:jc w:val="both"/>
+      </w:pPr>
+      <w:r>
+        <w:rPr>
+          <w:rFonts w:ascii="Times New Roman" w:hAnsi="Times New Roman"/>
+          <w:sz w:val="24"/>
+        </w:rPr>
+        <w:lastRenderedPageBreak/>
+        <w:t>Login: Customers authenticate with email and password; Session stores the logged-in Customer object.</w:t>
+      </w:r>
+    </w:p>
+    <w:p>
+      <w:pPr>
+        <w:spacing w:line="360" w:lineRule="auto"/>
+        <w:jc w:val="both"/>
+      </w:pPr>
+      <w:r>
+        <w:rPr>
+          <w:rFonts w:ascii="Times New Roman" w:hAnsi="Times New Roman"/>
+          <w:sz w:val="24"/>
+        </w:rPr>
+        <w:t>Search Medicines: SearchMedicinesForm loads the catalogue and applies SearchHelper linear search by name, filter by category, and filter by price range. Results bind to a DataGridView.</w:t>
+      </w:r>
+    </w:p>
+    <w:p>
+      <w:pPr>
+        <w:spacing w:line="360" w:lineRule="auto"/>
+        <w:jc w:val="both"/>
+      </w:pPr>
+      <w:r>
+        <w:rPr>
+          <w:rFonts w:ascii="Times New Roman" w:hAnsi="Times New Roman"/>
+          <w:sz w:val="24"/>
+        </w:rPr>
+        <w:t>Place Orders: PlaceOrderForm lists available medicines, supports quantity entry, maintains an in-memory cart, and calls OrderService.PlaceOrder to insert Order and OrderItem rows and decrement stock.</w:t>
+      </w:r>
+    </w:p>
+    <w:p>
+      <w:pPr>
+        <w:spacing w:line="360" w:lineRule="auto"/>
+        <w:jc w:val="both"/>
+      </w:pPr>
+      <w:r>
+        <w:rPr>
+          <w:rFonts w:ascii="Times New Roman" w:hAnsi="Times New Roman"/>
+          <w:sz w:val="24"/>
+        </w:rPr>
+        <w:t>Track Orders: TrackOrdersForm lists the current customer's orders and statuses.</w:t>
+      </w:r>
+    </w:p>
+    <w:p>
+      <w:pPr>
+        <w:spacing w:line="360" w:lineRule="auto"/>
+        <w:jc w:val="both"/>
+      </w:pPr>
+      <w:r>
+        <w:rPr>
+          <w:rFonts w:ascii="Times New Roman" w:hAnsi="Times New Roman"/>
+          <w:sz w:val="24"/>
+        </w:rPr>
+        <w:t>Profile Management: ProfileManagementForm allows customers to update their contact information.</w:t>
+      </w:r>
+    </w:p>
+    <w:p>
+      <w:pPr>
+        <w:pStyle w:val="Heading2"/>
+        <w:spacing w:line="360" w:lineRule="auto"/>
+        <w:jc w:val="both"/>
+      </w:pPr>
+      <w:r>
+        <w:t>Additional Features</w:t>
+      </w:r>
+    </w:p>
+    <w:p>
+      <w:pPr>
+        <w:spacing w:line="360" w:lineRule="auto"/>
+        <w:jc w:val="both"/>
+      </w:pPr>
+      <w:r>
+        <w:rPr>
+          <w:rFonts w:ascii="Times New Roman" w:hAnsi="Times New Roman"/>
+          <w:sz w:val="24"/>
+        </w:rPr>
+        <w:t>Optional features from the brief (discounts, expiry notifications, prescription upload UI, PDF/Excel export) were deferred to prioritise mandatory marking-scheme tasks. The Prescription table and Prescription business class exist in the schema and model layer for future extension. Core order and inventory workflows are fully functional without these extras.</w:t>
+      </w:r>
+    </w:p>
+    <w:p>
+      <w:pPr>
+        <w:pStyle w:val="Heading1"/>
+        <w:spacing w:line="360" w:lineRule="auto"/>
+        <w:jc w:val="both"/>
+      </w:pPr>
+      <w:r>
+        <w:t>Programming Language and Platform</w:t>
+      </w:r>
+    </w:p>
+    <w:p>
+      <w:pPr>
+        <w:spacing w:line="360" w:lineRule="auto"/>
+        <w:jc w:val="both"/>
+      </w:pPr>
+      <w:r>
+        <w:rPr>
+          <w:rFonts w:ascii="Times New Roman" w:hAnsi="Times New Roman"/>
+          <w:sz w:val="24"/>
+        </w:rPr>
+        <w:t>The application is implemented in C# targeting .NET Framework 4.8. The UI project uses Windows Forms (System.Windows.Forms). The solution uses SDK-style projects compatible with Visual Studio 2019+ and the dotnet CLI build. This meets the requirement for Visual Studio 2015 or higher compatibility at the language and framework level.</w:t>
+      </w:r>
+    </w:p>
+    <w:p>
+      <w:pPr>
+        <w:pStyle w:val="Heading2"/>
+        <w:spacing w:line="360" w:lineRule="auto"/>
+        <w:jc w:val="both"/>
+      </w:pPr>
+      <w:r>
+        <w:t>Data Storage</w:t>
+      </w:r>
+    </w:p>
+    <w:p>
+      <w:pPr>
+        <w:spacing w:line="360" w:lineRule="auto"/>
+        <w:jc w:val="both"/>
+      </w:pPr>
+      <w:r>
+        <w:rPr>
+          <w:rFonts w:ascii="Times New Roman" w:hAnsi="Times New Roman"/>
+          <w:sz w:val="24"/>
+        </w:rPr>
+        <w:t>Persistent data is stored in Microsoft SQL Server. The connection string named SmartMedDB in App.config is read by DatabaseHelper using ConfigurationManager. Parameterized SQL prevents injection. Transactions are used when placing orders to ensure order header, line items, and stock updates succeed or roll back together.</w:t>
+      </w:r>
+    </w:p>
+    <w:p>
+      <w:pPr>
+        <w:pStyle w:val="Heading2"/>
+        <w:spacing w:line="360" w:lineRule="auto"/>
+        <w:jc w:val="both"/>
+      </w:pPr>
+      <w:r>
+        <w:lastRenderedPageBreak/>
+        <w:t>Software Design</w:t>
+      </w:r>
+    </w:p>
+    <w:p>
+      <w:pPr>
+        <w:spacing w:line="360" w:lineRule="auto"/>
+        <w:jc w:val="both"/>
+      </w:pPr>
+      <w:r>
+        <w:rPr>
+          <w:rFonts w:ascii="Times New Roman" w:hAnsi="Times New Roman"/>
+          <w:sz w:val="24"/>
+        </w:rPr>
+        <w:t>Object-oriented design uses inheritance (Person hierarchy), encapsulation (private repository calls inside services), and separation of layers. Each form handles only UI events; business rules live in services and helpers. Repositories isolate SQL syntax from the rest of the application, simplifying maintenance and testing.</w:t>
+      </w:r>
+    </w:p>
+    <w:p>
+      <w:pPr>
+        <w:pStyle w:val="Heading2"/>
+        <w:spacing w:line="360" w:lineRule="auto"/>
+        <w:jc w:val="both"/>
+      </w:pPr>
+      <w:r>
+        <w:t>User Interface</w:t>
+      </w:r>
+    </w:p>
+    <w:p>
+      <w:pPr>
+        <w:spacing w:line="360" w:lineRule="auto"/>
+        <w:jc w:val="both"/>
+      </w:pPr>
+      <w:r>
+        <w:rPr>
+          <w:rFonts w:ascii="Times New Roman" w:hAnsi="Times New Roman"/>
+          <w:sz w:val="24"/>
+        </w:rPr>
+        <w:t>Forms are built programmatically in code for portability (no designer files required). A consistent colour scheme uses blue tones matching project diagrams. Role-based navigation prevents customers from accessing admin forms. MessageBox displays validation errors and database exceptions in user-friendly language.</w:t>
+      </w:r>
+    </w:p>
+    <w:p>
+      <w:pPr>
+        <w:pStyle w:val="Heading2"/>
+        <w:spacing w:line="360" w:lineRule="auto"/>
+        <w:jc w:val="both"/>
+      </w:pPr>
+      <w:r>
+        <w:t>Validation and Exception Handling</w:t>
+      </w:r>
+    </w:p>
+    <w:p>
+      <w:pPr>
+        <w:spacing w:line="360" w:lineRule="auto"/>
+        <w:jc w:val="both"/>
+      </w:pPr>
+      <w:r>
+        <w:rPr>
+          <w:rFonts w:ascii="Times New Roman" w:hAnsi="Times New Roman"/>
+          <w:sz w:val="24"/>
+        </w:rPr>
+        <w:t>ValidationHelper provides IsNullOrEmpty, IsValidEmail, IsPositiveDecimal, and IsPositiveInteger checks used across login, registration, and medicine forms. Service and repository methods wrap database operations in try/catch blocks; SQLException messages are surfaced via MessageBox on the UI thread. Order placement validates stock availability before committing.</w:t>
+      </w:r>
+    </w:p>
+    <w:p>
+      <w:pPr>
+        <w:pStyle w:val="Heading2"/>
+        <w:spacing w:line="360" w:lineRule="auto"/>
+        <w:jc w:val="both"/>
+      </w:pPr>
+      <w:r>
+        <w:t>Person Class</w:t>
+      </w:r>
+    </w:p>
+    <w:p>
+      <w:pPr>
+        <w:spacing w:line="360" w:lineRule="auto"/>
+        <w:jc w:val="both"/>
+      </w:pPr>
+      <w:r>
+        <w:rPr>
+          <w:rFonts w:ascii="Times New Roman" w:hAnsi="Times New Roman"/>
+          <w:sz w:val="24"/>
+        </w:rPr>
+        <w:t>Person (SmartMed.Business.Models.Person) is the base class with properties: Name, Email, Phone, Password. It represents shared attributes for human users. Derived classes add role-specific identifiers and behaviour.</w:t>
+      </w:r>
+    </w:p>
+    <w:p>
+      <w:pPr>
+        <w:pStyle w:val="Heading2"/>
+        <w:spacing w:line="360" w:lineRule="auto"/>
+        <w:jc w:val="both"/>
+      </w:pPr>
+      <w:r>
+        <w:t>Customer Class</w:t>
+      </w:r>
+    </w:p>
+    <w:p>
+      <w:pPr>
+        <w:spacing w:line="360" w:lineRule="auto"/>
+        <w:jc w:val="both"/>
+      </w:pPr>
+      <w:r>
+        <w:rPr>
+          <w:rFonts w:ascii="Times New Roman" w:hAnsi="Times New Roman"/>
+          <w:sz w:val="24"/>
+        </w:rPr>
+        <w:t>Customer extends Person with CustomerID (int) and Address (string). Methods Register() and Login() are documented in the class diagram; the implemented workflow delegates to AuthService and CustomerRepository while Session holds the authenticated instance after login.</w:t>
+      </w:r>
+    </w:p>
+    <w:p>
+      <w:pPr>
+        <w:pStyle w:val="Heading2"/>
+        <w:spacing w:line="360" w:lineRule="auto"/>
+        <w:jc w:val="both"/>
+      </w:pPr>
+      <w:r>
+        <w:t>Admin Class</w:t>
+      </w:r>
+    </w:p>
+    <w:p>
+      <w:pPr>
+        <w:spacing w:line="360" w:lineRule="auto"/>
+        <w:jc w:val="both"/>
+      </w:pPr>
+      <w:r>
+        <w:rPr>
+          <w:rFonts w:ascii="Times New Roman" w:hAnsi="Times New Roman"/>
+          <w:sz w:val="24"/>
+        </w:rPr>
+        <w:t>Admin extends Person with AdminID (int) and Username (string). Admin login uses username rather than email. AuthService.LoginAdmin queries AdminRepository and populates Session.CurrentAdmin on success.</w:t>
+      </w:r>
+    </w:p>
+    <w:p>
+      <w:pPr>
+        <w:pStyle w:val="Heading2"/>
+        <w:spacing w:line="360" w:lineRule="auto"/>
+        <w:jc w:val="both"/>
+      </w:pPr>
+      <w:r>
+        <w:lastRenderedPageBreak/>
+        <w:t>Medicine Class</w:t>
+      </w:r>
+    </w:p>
+    <w:p>
+      <w:pPr>
+        <w:spacing w:line="360" w:lineRule="auto"/>
+        <w:jc w:val="both"/>
+      </w:pPr>
+      <w:r>
+        <w:rPr>
+          <w:rFonts w:ascii="Times New Roman" w:hAnsi="Times New Roman"/>
+          <w:sz w:val="24"/>
+        </w:rPr>
+        <w:t>Medicine encapsulates MedicineID, MedicineName, Category, Dosage, Price, StockQuantity, Supplier, ExpiryDate, and RequiresPrescription. MedicineService wraps MedicineRepository for CRUD used by admin and search features.</w:t>
+      </w:r>
+    </w:p>
+    <w:p>
+      <w:pPr>
+        <w:pStyle w:val="Heading2"/>
+        <w:spacing w:line="360" w:lineRule="auto"/>
+        <w:jc w:val="both"/>
+      </w:pPr>
+      <w:r>
+        <w:t>Order Class</w:t>
+      </w:r>
+    </w:p>
+    <w:p>
+      <w:pPr>
+        <w:spacing w:line="360" w:lineRule="auto"/>
+        <w:jc w:val="both"/>
+      </w:pPr>
+      <w:r>
+        <w:rPr>
+          <w:rFonts w:ascii="Times New Roman" w:hAnsi="Times New Roman"/>
+          <w:sz w:val="24"/>
+        </w:rPr>
+        <w:t>Order represents OrderID, CustomerID, OrderDate, Status, and TotalAmount. OrderService creates orders, lists by customer, and updates status for admin fulfilment.</w:t>
+      </w:r>
+    </w:p>
+    <w:p>
+      <w:pPr>
+        <w:pStyle w:val="Heading2"/>
+        <w:spacing w:line="360" w:lineRule="auto"/>
+        <w:jc w:val="both"/>
+      </w:pPr>
+      <w:r>
+        <w:t>OrderItem Class</w:t>
+      </w:r>
+    </w:p>
+    <w:p>
+      <w:pPr>
+        <w:spacing w:line="360" w:lineRule="auto"/>
+        <w:jc w:val="both"/>
+      </w:pPr>
+      <w:r>
+        <w:rPr>
+          <w:rFonts w:ascii="Times New Roman" w:hAnsi="Times New Roman"/>
+          <w:sz w:val="24"/>
+        </w:rPr>
+        <w:t>OrderItem links an order to a medicine with Quantity, UnitPrice, and Subtotal. Subtotal is calculated as Quantity × UnitPrice at the time of order placement to preserve historical pricing.</w:t>
+      </w:r>
+    </w:p>
+    <w:p>
+      <w:pPr>
+        <w:pStyle w:val="Heading2"/>
+        <w:spacing w:line="360" w:lineRule="auto"/>
+        <w:jc w:val="both"/>
+      </w:pPr>
+      <w:r>
+        <w:t>Prescription Class</w:t>
+      </w:r>
+    </w:p>
+    <w:p>
+      <w:pPr>
+        <w:spacing w:line="360" w:lineRule="auto"/>
+        <w:jc w:val="both"/>
+      </w:pPr>
+      <w:r>
+        <w:rPr>
+          <w:rFonts w:ascii="Times New Roman" w:hAnsi="Times New Roman"/>
+          <w:sz w:val="24"/>
+        </w:rPr>
+        <w:t>Prescription models PrescriptionID, CustomerID, PrescriptionFile path, UploadDate, and Status. The database table is created; upload UI is reserved for future enhancement.</w:t>
+      </w:r>
+    </w:p>
+    <w:p>
+      <w:pPr>
+        <w:pStyle w:val="Heading1"/>
+        <w:spacing w:line="360" w:lineRule="auto"/>
+        <w:jc w:val="both"/>
+      </w:pPr>
+      <w:r>
+        <w:t>Search Algorithms Used in the Project</w:t>
+      </w:r>
+    </w:p>
+    <w:p>
+      <w:pPr>
+        <w:spacing w:line="360" w:lineRule="auto"/>
+        <w:jc w:val="both"/>
+      </w:pPr>
+      <w:r>
+        <w:rPr>
+          <w:rFonts w:ascii="Times New Roman" w:hAnsi="Times New Roman"/>
+          <w:sz w:val="24"/>
+        </w:rPr>
+        <w:t>Medicine search uses linear search and filtering as required by the coursework. SearchHelper.SearchByName iterates the full medicine list once (O(n)), comparing each MedicineName to the keyword using case-insensitive Contains. FilterByCategory applies a second linear pass when a category filter is active. FilterByPriceRange iterates and retains items where Price falls between min and max inclusive.</w:t>
+      </w:r>
+    </w:p>
+    <w:p>
+      <w:pPr>
+        <w:spacing w:line="360" w:lineRule="auto"/>
+        <w:jc w:val="both"/>
+      </w:pPr>
+      <w:r>
+        <w:rPr>
+          <w:rFonts w:ascii="Times New Roman" w:hAnsi="Times New Roman"/>
+          <w:sz w:val="24"/>
+        </w:rPr>
+        <w:t>The composite Search method chains these operations: start with the full list, optionally narrow by name, then category, then price range. Each step produces a new filtered list. This is documented as linear search with filtering rather than binary search, which requires sorted data and was not necessary for the catalogue size.</w:t>
+      </w:r>
+    </w:p>
+    <w:p>
+      <w:pPr>
+        <w:spacing w:line="360" w:lineRule="auto"/>
+      </w:pPr>
+      <w:r>
+        <w:rPr>
+          <w:rFonts w:ascii="Times New Roman" w:hAnsi="Times New Roman"/>
+          <w:sz w:val="24"/>
+        </w:rPr>
+        <w:t>Pseudocode:</w:t>
+      </w:r>
+      <w:r>
+        <w:rPr>
+          <w:rFonts w:ascii="Times New Roman" w:hAnsi="Times New Roman"/>
+          <w:sz w:val="24"/>
+        </w:rPr>
+        <w:br/>
+        <w:t xml:space="preserve">  results = all medicines</w:t>
+      </w:r>
+      <w:r>
+        <w:rPr>
+          <w:rFonts w:ascii="Times New Roman" w:hAnsi="Times New Roman"/>
+          <w:sz w:val="24"/>
+        </w:rPr>
+        <w:br/>
+        <w:t xml:space="preserve">  if name provided: results = LinearSearchByName(results, name)</w:t>
+      </w:r>
+      <w:r>
+        <w:rPr>
+          <w:rFonts w:ascii="Times New Roman" w:hAnsi="Times New Roman"/>
+          <w:sz w:val="24"/>
+        </w:rPr>
+        <w:br/>
+      </w:r>
+      <w:r>
+        <w:rPr>
+          <w:rFonts w:ascii="Times New Roman" w:hAnsi="Times New Roman"/>
+          <w:sz w:val="24"/>
+        </w:rPr>
+        <w:lastRenderedPageBreak/>
+        <w:t xml:space="preserve">  if category provided: results = LinearFilterByCategory(results, category)</w:t>
+      </w:r>
+      <w:r>
+        <w:rPr>
+          <w:rFonts w:ascii="Times New Roman" w:hAnsi="Times New Roman"/>
+          <w:sz w:val="24"/>
+        </w:rPr>
+        <w:br/>
+        <w:t xml:space="preserve">  if price range provided: results = LinearFilterByPrice(results, min, max)</w:t>
+      </w:r>
+      <w:r>
+        <w:rPr>
+          <w:rFonts w:ascii="Times New Roman" w:hAnsi="Times New Roman"/>
+          <w:sz w:val="24"/>
+        </w:rPr>
+        <w:br/>
+        <w:t xml:space="preserve">  return results</w:t>
+      </w:r>
+    </w:p>
+    <w:p>
+      <w:pPr>
+        <w:spacing w:line="360" w:lineRule="auto"/>
+        <w:jc w:val="both"/>
+      </w:pPr>
+      <w:r>
+        <w:rPr>
+          <w:rFonts w:ascii="Times New Roman" w:hAnsi="Times New Roman"/>
+          <w:sz w:val="24"/>
+        </w:rPr>
+        <w:t>SearchMedicinesForm calls MedicineService.Search, which loads medicines from the database and delegates to SearchHelper.Search before binding results to the grid.</w:t>
+      </w:r>
+    </w:p>
+    <w:p>
+      <w:pPr>
+        <w:pStyle w:val="Heading1"/>
+        <w:spacing w:line="360" w:lineRule="auto"/>
+        <w:jc w:val="both"/>
+      </w:pPr>
+      <w:r>
+        <w:t>Experience with C# and Visual Studio</w:t>
+      </w:r>
+    </w:p>
+    <w:p>
+      <w:pPr>
+        <w:spacing w:line="360" w:lineRule="auto"/>
+        <w:jc w:val="both"/>
+      </w:pPr>
+      <w:r>
+        <w:rPr>
+          <w:rFonts w:ascii="Times New Roman" w:hAnsi="Times New Roman"/>
+          <w:sz w:val="24"/>
+        </w:rPr>
+        <w:t>Developing SmartMed strengthened my understanding of C# as an object-oriented language and of Visual Studio as an integrated environment for building desktop applications. Before this module my experience was limited to console programs; WinForms introduced event-driven programming where button clicks and form load events trigger methods that update the interface asynchronously from user input.</w:t>
+      </w:r>
+    </w:p>
+    <w:p>
+      <w:pPr>
+        <w:spacing w:line="360" w:lineRule="auto"/>
+        <w:jc w:val="both"/>
+      </w:pPr>
+      <w:r>
+        <w:rPr>
+          <w:rFonts w:ascii="Times New Roman" w:hAnsi="Times New Roman"/>
+          <w:sz w:val="24"/>
+        </w:rPr>
+        <w:t>Working with a multi-project solution clarified how references work: SmartMed.UI references Business, which references Data. Building the solution compiles dependencies in order. Debugging with breakpoints across layers showed how a click on Login propagates from LoginForm through AuthService to CustomerRepository and back. The Immediate Window and Watch panel helped inspect Session state during authentication.</w:t>
+      </w:r>
+    </w:p>
+    <w:p>
+      <w:pPr>
+        <w:spacing w:line="360" w:lineRule="auto"/>
+        <w:jc w:val="both"/>
+      </w:pPr>
+      <w:r>
+        <w:rPr>
+          <w:rFonts w:ascii="Times New Roman" w:hAnsi="Times New Roman"/>
+          <w:sz w:val="24"/>
+        </w:rPr>
+        <w:t>I used both Visual Studio and the dotnet CLI to build. SDK-style projects simplified the csproj files compared to older templates. Configuring App.config for the connection string reinforced the importance of externalising environment-specific settings rather than hard-coding server names in source code.</w:t>
+      </w:r>
+    </w:p>
+    <w:p>
+      <w:pPr>
+        <w:pStyle w:val="Heading2"/>
+        <w:spacing w:line="360" w:lineRule="auto"/>
+        <w:jc w:val="both"/>
+      </w:pPr>
+      <w:r>
+        <w:t>Features Liked and Rationale</w:t>
+      </w:r>
+    </w:p>
+    <w:p>
+      <w:pPr>
+        <w:spacing w:line="360" w:lineRule="auto"/>
+        <w:jc w:val="both"/>
+      </w:pPr>
+      <w:r>
+        <w:rPr>
+          <w:rFonts w:ascii="Times New Roman" w:hAnsi="Times New Roman"/>
+          <w:sz w:val="24"/>
+        </w:rPr>
+        <w:t>I particularly valued the three-tier architecture because it mirrors professional practice. When I needed to change how medicines were loaded, I edited MedicineRepository once while MedicineManagementForm and SearchMedicinesForm continued to call MedicineService unchanged. This separation reduced duplication and made the codebase easier to reason about.</w:t>
+      </w:r>
+    </w:p>
+    <w:p>
+      <w:pPr>
+        <w:spacing w:line="360" w:lineRule="auto"/>
+        <w:jc w:val="both"/>
+      </w:pPr>
+      <w:r>
+        <w:rPr>
+          <w:rFonts w:ascii="Times New Roman" w:hAnsi="Times New Roman"/>
+          <w:sz w:val="24"/>
+        </w:rPr>
+        <w:t xml:space="preserve">Windows Forms was approachable for rapid layout of grids, text boxes, and buttons. DataGridView data binding to lists of MedicineItem provided instant tabular display without </w:t>
+      </w:r>
+      <w:r>
+        <w:rPr>
+          <w:rFonts w:ascii="Times New Roman" w:hAnsi="Times New Roman"/>
+          <w:sz w:val="24"/>
+        </w:rPr>
+        <w:lastRenderedPageBreak/>
+        <w:t>manual row painting. The inheritance model for Person, Customer, and Admin made the domain model intuitive and aligned with the class diagram produced in the design phase.</w:t>
+      </w:r>
+    </w:p>
+    <w:p>
+      <w:pPr>
+        <w:spacing w:line="360" w:lineRule="auto"/>
+        <w:jc w:val="both"/>
+      </w:pPr>
+      <w:r>
+        <w:rPr>
+          <w:rFonts w:ascii="Times New Roman" w:hAnsi="Times New Roman"/>
+          <w:sz w:val="24"/>
+        </w:rPr>
+        <w:t>Implementing SearchHelper as a static utility class kept search logic testable and documented independently of the UI. I liked that linear search is easy to explain in documentation and sufficient for pharmacy catalogues that are not millions of rows.</w:t>
+      </w:r>
+    </w:p>
+    <w:p>
+      <w:pPr>
+        <w:pStyle w:val="Heading1"/>
+        <w:spacing w:line="360" w:lineRule="auto"/>
+        <w:jc w:val="both"/>
+      </w:pPr>
+      <w:r>
+        <w:t>Challenges Faced and Solutions Applied</w:t>
+      </w:r>
+    </w:p>
+    <w:p>
+      <w:pPr>
+        <w:spacing w:line="360" w:lineRule="auto"/>
+        <w:jc w:val="both"/>
+      </w:pPr>
+      <w:r>
+        <w:rPr>
+          <w:rFonts w:ascii="Times New Roman" w:hAnsi="Times New Roman"/>
+          <w:sz w:val="24"/>
+        </w:rPr>
+        <w:t>A significant challenge was ensuring the data layer could read the connection string when called from a class library. DatabaseHelper uses ConfigurationManager, which reads from the executing assembly's config file. The UI project's App.config is copied to SmartMed.exe.config on build, so running the executable provides the correct connection string to all layers.</w:t>
+      </w:r>
+    </w:p>
+    <w:p>
+      <w:pPr>
+        <w:spacing w:line="360" w:lineRule="auto"/>
+        <w:jc w:val="both"/>
+      </w:pPr>
+      <w:r>
+        <w:rPr>
+          <w:rFonts w:ascii="Times New Roman" w:hAnsi="Times New Roman"/>
+          <w:sz w:val="24"/>
+        </w:rPr>
+        <w:t>Order placement required transactional integrity: inserting an order, multiple order items, and updating stock had to succeed together. OrderRepository wraps these steps in a SqlTransaction so a failure mid-process rolls back partial changes.</w:t>
+      </w:r>
+    </w:p>
+    <w:p>
+      <w:pPr>
+        <w:spacing w:line="360" w:lineRule="auto"/>
+        <w:jc w:val="both"/>
+      </w:pPr>
+      <w:r>
+        <w:rPr>
+          <w:rFonts w:ascii="Times New Roman" w:hAnsi="Times New Roman"/>
+          <w:sz w:val="24"/>
+        </w:rPr>
+        <w:t>Another challenge was keeping WinForms code-behind thin while still showing helpful errors. I standardised on try/catch in event handlers that display ex.Message in MessageBox, while repositories throw descriptive exceptions for constraint violations.</w:t>
+      </w:r>
+    </w:p>
+    <w:p>
+      <w:pPr>
+        <w:spacing w:line="360" w:lineRule="auto"/>
+        <w:jc w:val="both"/>
+      </w:pPr>
+      <w:r>
+        <w:rPr>
+          <w:rFonts w:ascii="Times New Roman" w:hAnsi="Times New Roman"/>
+          <w:sz w:val="24"/>
+        </w:rPr>
+        <w:t>Building forms entirely in code (without the designer) was initially verbose but avoided merge conflicts and kept the repository self-contained for submission. I reused patterns for grid setup, button placement, and BackColor theming across admin and customer forms.</w:t>
+      </w:r>
+    </w:p>
+    <w:p>
+      <w:pPr>
+        <w:spacing w:line="360" w:lineRule="auto"/>
+        <w:jc w:val="both"/>
+      </w:pPr>
+      <w:r>
+        <w:rPr>
+          <w:rFonts w:ascii="Times New Roman" w:hAnsi="Times New Roman"/>
+          <w:sz w:val="24"/>
+        </w:rPr>
+        <w:t>Mapping between Business models and Data models (e.g. Customer vs CustomerUser) required discipline. Services translate between layers when needed, keeping ADO.NET details out of the business entities.</w:t>
+      </w:r>
+    </w:p>
+    <w:p>
+      <w:pPr>
+        <w:pStyle w:val="Heading1"/>
+        <w:spacing w:line="360" w:lineRule="auto"/>
+        <w:jc w:val="both"/>
+      </w:pPr>
+      <w:r>
+        <w:t>Future Improvements</w:t>
+      </w:r>
+    </w:p>
+    <w:p>
+      <w:pPr>
+        <w:spacing w:line="360" w:lineRule="auto"/>
+        <w:jc w:val="both"/>
+      </w:pPr>
+      <w:r>
+        <w:rPr>
+          <w:rFonts w:ascii="Times New Roman" w:hAnsi="Times New Roman"/>
+          <w:sz w:val="24"/>
+        </w:rPr>
+        <w:t xml:space="preserve">Future versions could add prescription file upload with validation, email notifications when order status changes, and export of reports to PDF or Excel using libraries such as iTextSharp or </w:t>
+      </w:r>
+      <w:r>
+        <w:rPr>
+          <w:rFonts w:ascii="Times New Roman" w:hAnsi="Times New Roman"/>
+          <w:sz w:val="24"/>
+        </w:rPr>
+        <w:lastRenderedPageBreak/>
+        <w:t>ClosedXML. Role-based admin permissions could distinguish pharmacists from managers. A barcode scanner integration would speed stock intake. For larger catalogues, indexing and full-text search in SQL Server could supplement client-side linear search. Unit tests for ValidationHelper and SearchHelper would improve regression safety. Migrating to .NET 6+ WinForms would enable cross-platform considerations, though deployment targets remain Windows for pharmacy workstations.</w:t>
+      </w:r>
+    </w:p>
+    <w:p>
+      <w:pPr>
+        <w:pStyle w:val="Heading1"/>
+        <w:spacing w:line="360" w:lineRule="auto"/>
+        <w:jc w:val="both"/>
+      </w:pPr>
+      <w:r>
+        <w:t>Conclusion</w:t>
+      </w:r>
+    </w:p>
+    <w:p>
+      <w:pPr>
+        <w:spacing w:line="360" w:lineRule="auto"/>
+        <w:jc w:val="both"/>
+      </w:pPr>
+      <w:r>
+        <w:rPr>
+          <w:rFonts w:ascii="Times New Roman" w:hAnsi="Times New Roman"/>
+          <w:sz w:val="24"/>
+        </w:rPr>
+        <w:t>SmartMed delivers a working pharmacy management desktop application that meets the coursework functional and technical requirements. The design diagrams guided implementation of the database schema, class structure, and layered architecture. Mandatory features—authentication, medicine CRUD, customer search with linear filtering, order lifecycle, reports, and dashboard—are implemented and runnable against SQL Server seed data. The project improved my skills in C#, WinForms, ADO.NET, and structured OOP design. Documentation and reflective analysis consolidate learning outcomes for assessment.</w:t>
+      </w:r>
+    </w:p>
+    <w:p>
+      <w:pPr>
+        <w:pStyle w:val="Heading1"/>
+        <w:spacing w:line="360" w:lineRule="auto"/>
+        <w:jc w:val="both"/>
+      </w:pPr>
+      <w:r>
+        <w:t>References</w:t>
+      </w:r>
+    </w:p>
+    <w:p>
+      <w:pPr>
+        <w:spacing w:line="360" w:lineRule="auto"/>
+        <w:jc w:val="both"/>
+      </w:pPr>
+      <w:r>
+        <w:rPr>
+          <w:rFonts w:ascii="Times New Roman" w:hAnsi="Times New Roman"/>
+          <w:sz w:val="24"/>
+        </w:rPr>
+        <w:t>Microsoft (2024). ADO.NET documentation. https://learn.microsoft.com/en-us/dotnet/framework/data/adonet/</w:t>
+      </w:r>
+    </w:p>
+    <w:p>
+      <w:pPr>
+        <w:spacing w:line="360" w:lineRule="auto"/>
+        <w:jc w:val="both"/>
+      </w:pPr>
+      <w:r>
+        <w:rPr>
+          <w:rFonts w:ascii="Times New Roman" w:hAnsi="Times New Roman"/>
+          <w:sz w:val="24"/>
+        </w:rPr>
+        <w:t>Microsoft (2024). Windows Forms documentation. https://learn.microsoft.com/en-us/dotnet/desktop/winforms/</w:t>
+      </w:r>
+    </w:p>
+    <w:p>
+      <w:pPr>
+        <w:spacing w:line="360" w:lineRule="auto"/>
+        <w:jc w:val="both"/>
+      </w:pPr>
+      <w:r>
+        <w:rPr>
+          <w:rFonts w:ascii="Times New Roman" w:hAnsi="Times New Roman"/>
+          <w:sz w:val="24"/>
+        </w:rPr>
+        <w:t>Module coursework brief: Document.md (SmartMed Pharmacy specification).</w:t>
+      </w:r>
+    </w:p>
+    <w:p>
+      <w:pPr>
+        <w:pStyle w:val="Heading2"/>
+        <w:spacing w:line="360" w:lineRule="auto"/>
+        <w:jc w:val="both"/>
+      </w:pPr>
+      <w:r>
+        <w:t>Appendix A: Use Case Diagram</w:t>
+      </w:r>
+    </w:p>
+    <w:p>
+      <w:pPr>
+        <w:spacing w:line="360" w:lineRule="auto"/>
+        <w:jc w:val="both"/>
+      </w:pPr>
+      <w:r>
+        <w:rPr>
+          <w:rFonts w:ascii="Times New Roman" w:hAnsi="Times New Roman"/>
+          <w:sz w:val="24"/>
+        </w:rPr>
+        <w:t>See Diagrams/Usecase.drawio — export as PNG for printed submission if required.</w:t>
+      </w:r>
+    </w:p>
+    <w:p>
+      <w:pPr>
+        <w:pStyle w:val="Heading2"/>
+        <w:spacing w:line="360" w:lineRule="auto"/>
+        <w:jc w:val="both"/>
+      </w:pPr>
+      <w:r>
+        <w:t>Appendix B: Entity-Relationship Diagram</w:t>
+      </w:r>
+    </w:p>
+    <w:p>
+      <w:pPr>
+        <w:spacing w:line="360" w:lineRule="auto"/>
+        <w:jc w:val="both"/>
+      </w:pPr>
+      <w:r>
+        <w:rPr>
+          <w:rFonts w:ascii="Times New Roman" w:hAnsi="Times New Roman"/>
+          <w:sz w:val="24"/>
+        </w:rPr>
+        <w:t>See Diagrams/ER.drawio — Chen notation with Admin, Customer, Medicine, Order, OrderItem, Prescription.</w:t>
+      </w:r>
+    </w:p>
+    <w:p>
+      <w:pPr>
+        <w:pStyle w:val="Heading2"/>
+        <w:spacing w:line="360" w:lineRule="auto"/>
+        <w:jc w:val="both"/>
+      </w:pPr>
+      <w:r>
         <w:lastRenderedPageBreak/>
         <w:t>Appendix C: Class Diagram</w:t>
       </w:r>
     </w:p>
     <w:p>
       <w:pPr>
-        <w:spacing w:before="120" w:after="120" w:line="360" w:lineRule="auto"/>
-      </w:pPr>
-      <w:r>
-        <w:rPr>
-          <w:rFonts w:ascii="Times New Roman" w:eastAsia="Times New Roman" w:hAnsi="Times New Roman"/>
-          <w:sz w:val="28"/>
-        </w:rPr>
+        <w:spacing w:line="360" w:lineRule="auto"/>
+        <w:jc w:val="both"/>
+      </w:pPr>
+      <w:r>
+        <w:rPr>
+          <w:rFonts w:ascii="Times New Roman" w:hAnsi="Times New Roman"/>
+          <w:sz w:val="24"/>
+        </w:rPr>
+        <w:t>See Diagrams/Class.drawio — Person inheritance, entity classes, and relationships.</w:t>
+      </w:r>
+    </w:p>
+    <w:p>
+      <w:pPr>
+        <w:pStyle w:val="Heading2"/>
+        <w:spacing w:line="360" w:lineRule="auto"/>
+        <w:jc w:val="both"/>
+      </w:pPr>
+      <w:r>
         <w:t>Appendix D: Architecture Diagram</w:t>
+      </w:r>
+    </w:p>
+    <w:p>
+      <w:pPr>
+        <w:spacing w:line="360" w:lineRule="auto"/>
+        <w:jc w:val="both"/>
+      </w:pPr>
+      <w:r>
+        <w:rPr>
+          <w:rFonts w:ascii="Times New Roman" w:hAnsi="Times New Roman"/>
+          <w:sz w:val="24"/>
+        </w:rPr>
+        <w:t>See Diagrams/Architecture.drawio — vertical flow: Presentation → Business → Data Access → SQL Server.</w:t>
       </w:r>
     </w:p>
     <w:sectPr>
@@ -756,6 +2786,232 @@
       </w:pPr>
       <w:rPr>
         <w:rFonts w:ascii="Symbol" w:hAnsi="Symbol" w:hint="default"/>
+      </w:rPr>
+    </w:lvl>
+  </w:abstractNum>
+  <w:abstractNum w:abstractNumId="9" w15:restartNumberingAfterBreak="0">
+    <w:nsid w:val="01415BA8"/>
+    <w:multiLevelType w:val="hybridMultilevel"/>
+    <w:tmpl w:val="6AEA3052"/>
+    <w:lvl w:ilvl="0" w:tplc="08090001">
+      <w:start w:val="1"/>
+      <w:numFmt w:val="bullet"/>
+      <w:lvlText w:val=""/>
+      <w:lvlJc w:val="left"/>
+      <w:pPr>
+        <w:ind w:left="720" w:hanging="360"/>
+      </w:pPr>
+      <w:rPr>
+        <w:rFonts w:ascii="Symbol" w:hAnsi="Symbol" w:hint="default"/>
+      </w:rPr>
+    </w:lvl>
+    <w:lvl w:ilvl="1" w:tplc="08090003" w:tentative="1">
+      <w:start w:val="1"/>
+      <w:numFmt w:val="bullet"/>
+      <w:lvlText w:val="o"/>
+      <w:lvlJc w:val="left"/>
+      <w:pPr>
+        <w:ind w:left="1440" w:hanging="360"/>
+      </w:pPr>
+      <w:rPr>
+        <w:rFonts w:ascii="Courier New" w:hAnsi="Courier New" w:cs="Courier New" w:hint="default"/>
+      </w:rPr>
+    </w:lvl>
+    <w:lvl w:ilvl="2" w:tplc="08090005" w:tentative="1">
+      <w:start w:val="1"/>
+      <w:numFmt w:val="bullet"/>
+      <w:lvlText w:val=""/>
+      <w:lvlJc w:val="left"/>
+      <w:pPr>
+        <w:ind w:left="2160" w:hanging="360"/>
+      </w:pPr>
+      <w:rPr>
+        <w:rFonts w:ascii="Wingdings" w:hAnsi="Wingdings" w:hint="default"/>
+      </w:rPr>
+    </w:lvl>
+    <w:lvl w:ilvl="3" w:tplc="08090001" w:tentative="1">
+      <w:start w:val="1"/>
+      <w:numFmt w:val="bullet"/>
+      <w:lvlText w:val=""/>
+      <w:lvlJc w:val="left"/>
+      <w:pPr>
+        <w:ind w:left="2880" w:hanging="360"/>
+      </w:pPr>
+      <w:rPr>
+        <w:rFonts w:ascii="Symbol" w:hAnsi="Symbol" w:hint="default"/>
+      </w:rPr>
+    </w:lvl>
+    <w:lvl w:ilvl="4" w:tplc="08090003" w:tentative="1">
+      <w:start w:val="1"/>
+      <w:numFmt w:val="bullet"/>
+      <w:lvlText w:val="o"/>
+      <w:lvlJc w:val="left"/>
+      <w:pPr>
+        <w:ind w:left="3600" w:hanging="360"/>
+      </w:pPr>
+      <w:rPr>
+        <w:rFonts w:ascii="Courier New" w:hAnsi="Courier New" w:cs="Courier New" w:hint="default"/>
+      </w:rPr>
+    </w:lvl>
+    <w:lvl w:ilvl="5" w:tplc="08090005" w:tentative="1">
+      <w:start w:val="1"/>
+      <w:numFmt w:val="bullet"/>
+      <w:lvlText w:val=""/>
+      <w:lvlJc w:val="left"/>
+      <w:pPr>
+        <w:ind w:left="4320" w:hanging="360"/>
+      </w:pPr>
+      <w:rPr>
+        <w:rFonts w:ascii="Wingdings" w:hAnsi="Wingdings" w:hint="default"/>
+      </w:rPr>
+    </w:lvl>
+    <w:lvl w:ilvl="6" w:tplc="08090001" w:tentative="1">
+      <w:start w:val="1"/>
+      <w:numFmt w:val="bullet"/>
+      <w:lvlText w:val=""/>
+      <w:lvlJc w:val="left"/>
+      <w:pPr>
+        <w:ind w:left="5040" w:hanging="360"/>
+      </w:pPr>
+      <w:rPr>
+        <w:rFonts w:ascii="Symbol" w:hAnsi="Symbol" w:hint="default"/>
+      </w:rPr>
+    </w:lvl>
+    <w:lvl w:ilvl="7" w:tplc="08090003" w:tentative="1">
+      <w:start w:val="1"/>
+      <w:numFmt w:val="bullet"/>
+      <w:lvlText w:val="o"/>
+      <w:lvlJc w:val="left"/>
+      <w:pPr>
+        <w:ind w:left="5760" w:hanging="360"/>
+      </w:pPr>
+      <w:rPr>
+        <w:rFonts w:ascii="Courier New" w:hAnsi="Courier New" w:cs="Courier New" w:hint="default"/>
+      </w:rPr>
+    </w:lvl>
+    <w:lvl w:ilvl="8" w:tplc="08090005" w:tentative="1">
+      <w:start w:val="1"/>
+      <w:numFmt w:val="bullet"/>
+      <w:lvlText w:val=""/>
+      <w:lvlJc w:val="left"/>
+      <w:pPr>
+        <w:ind w:left="6480" w:hanging="360"/>
+      </w:pPr>
+      <w:rPr>
+        <w:rFonts w:ascii="Wingdings" w:hAnsi="Wingdings" w:hint="default"/>
+      </w:rPr>
+    </w:lvl>
+  </w:abstractNum>
+  <w:abstractNum w:abstractNumId="10" w15:restartNumberingAfterBreak="0">
+    <w:nsid w:val="083A37C5"/>
+    <w:multiLevelType w:val="hybridMultilevel"/>
+    <w:tmpl w:val="A9862990"/>
+    <w:lvl w:ilvl="0" w:tplc="AAB8D0A4">
+      <w:numFmt w:val="bullet"/>
+      <w:lvlText w:val="-"/>
+      <w:lvlJc w:val="left"/>
+      <w:pPr>
+        <w:ind w:left="720" w:hanging="360"/>
+      </w:pPr>
+      <w:rPr>
+        <w:rFonts w:ascii="Times New Roman" w:eastAsia="Times New Roman" w:hAnsi="Times New Roman" w:cs="Times New Roman" w:hint="default"/>
+        <w:sz w:val="28"/>
+      </w:rPr>
+    </w:lvl>
+    <w:lvl w:ilvl="1" w:tplc="04090003" w:tentative="1">
+      <w:start w:val="1"/>
+      <w:numFmt w:val="bullet"/>
+      <w:lvlText w:val="o"/>
+      <w:lvlJc w:val="left"/>
+      <w:pPr>
+        <w:ind w:left="1440" w:hanging="360"/>
+      </w:pPr>
+      <w:rPr>
+        <w:rFonts w:ascii="Courier New" w:hAnsi="Courier New" w:cs="Courier New" w:hint="default"/>
+      </w:rPr>
+    </w:lvl>
+    <w:lvl w:ilvl="2" w:tplc="04090005" w:tentative="1">
+      <w:start w:val="1"/>
+      <w:numFmt w:val="bullet"/>
+      <w:lvlText w:val=""/>
+      <w:lvlJc w:val="left"/>
+      <w:pPr>
+        <w:ind w:left="2160" w:hanging="360"/>
+      </w:pPr>
+      <w:rPr>
+        <w:rFonts w:ascii="Wingdings" w:hAnsi="Wingdings" w:hint="default"/>
+      </w:rPr>
+    </w:lvl>
+    <w:lvl w:ilvl="3" w:tplc="04090001" w:tentative="1">
+      <w:start w:val="1"/>
+      <w:numFmt w:val="bullet"/>
+      <w:lvlText w:val=""/>
+      <w:lvlJc w:val="left"/>
+      <w:pPr>
+        <w:ind w:left="2880" w:hanging="360"/>
+      </w:pPr>
+      <w:rPr>
+        <w:rFonts w:ascii="Symbol" w:hAnsi="Symbol" w:hint="default"/>
+      </w:rPr>
+    </w:lvl>
+    <w:lvl w:ilvl="4" w:tplc="04090003" w:tentative="1">
+      <w:start w:val="1"/>
+      <w:numFmt w:val="bullet"/>
+      <w:lvlText w:val="o"/>
+      <w:lvlJc w:val="left"/>
+      <w:pPr>
+        <w:ind w:left="3600" w:hanging="360"/>
+      </w:pPr>
+      <w:rPr>
+        <w:rFonts w:ascii="Courier New" w:hAnsi="Courier New" w:cs="Courier New" w:hint="default"/>
+      </w:rPr>
+    </w:lvl>
+    <w:lvl w:ilvl="5" w:tplc="04090005" w:tentative="1">
+      <w:start w:val="1"/>
+      <w:numFmt w:val="bullet"/>
+      <w:lvlText w:val=""/>
+      <w:lvlJc w:val="left"/>
+      <w:pPr>
+        <w:ind w:left="4320" w:hanging="360"/>
+      </w:pPr>
+      <w:rPr>
+        <w:rFonts w:ascii="Wingdings" w:hAnsi="Wingdings" w:hint="default"/>
+      </w:rPr>
+    </w:lvl>
+    <w:lvl w:ilvl="6" w:tplc="04090001" w:tentative="1">
+      <w:start w:val="1"/>
+      <w:numFmt w:val="bullet"/>
+      <w:lvlText w:val=""/>
+      <w:lvlJc w:val="left"/>
+      <w:pPr>
+        <w:ind w:left="5040" w:hanging="360"/>
+      </w:pPr>
+      <w:rPr>
+        <w:rFonts w:ascii="Symbol" w:hAnsi="Symbol" w:hint="default"/>
+      </w:rPr>
+    </w:lvl>
+    <w:lvl w:ilvl="7" w:tplc="04090003" w:tentative="1">
+      <w:start w:val="1"/>
+      <w:numFmt w:val="bullet"/>
+      <w:lvlText w:val="o"/>
+      <w:lvlJc w:val="left"/>
+      <w:pPr>
+        <w:ind w:left="5760" w:hanging="360"/>
+      </w:pPr>
+      <w:rPr>
+        <w:rFonts w:ascii="Courier New" w:hAnsi="Courier New" w:cs="Courier New" w:hint="default"/>
+      </w:rPr>
+    </w:lvl>
+    <w:lvl w:ilvl="8" w:tplc="04090005" w:tentative="1">
+      <w:start w:val="1"/>
+      <w:numFmt w:val="bullet"/>
+      <w:lvlText w:val=""/>
+      <w:lvlJc w:val="left"/>
+      <w:pPr>
+        <w:ind w:left="6480" w:hanging="360"/>
+      </w:pPr>
+      <w:rPr>
+        <w:rFonts w:ascii="Wingdings" w:hAnsi="Wingdings" w:hint="default"/>
       </w:rPr>
     </w:lvl>
   </w:abstractNum>
@@ -785,6 +3041,12 @@
   </w:num>
   <w:num w:numId="9" w16cid:durableId="1992561534">
     <w:abstractNumId w:val="0"/>
+  </w:num>
+  <w:num w:numId="10" w16cid:durableId="276371633">
+    <w:abstractNumId w:val="9"/>
+  </w:num>
+  <w:num w:numId="11" w16cid:durableId="228349719">
+    <w:abstractNumId w:val="10"/>
   </w:num>
 </w:numbering>
 </file>
@@ -986,7 +3248,7 @@
     <w:lsdException w:name="Medium Shading 2 Accent 1" w:uiPriority="64"/>
     <w:lsdException w:name="Medium List 1 Accent 1" w:uiPriority="65"/>
     <w:lsdException w:name="Revision" w:semiHidden="1"/>
-    <w:lsdException w:name="List Paragraph" w:uiPriority="34" w:qFormat="1"/>
+    <w:lsdException w:name="List Paragraph" w:uiPriority="1" w:qFormat="1"/>
     <w:lsdException w:name="Quote" w:uiPriority="29" w:qFormat="1"/>
     <w:lsdException w:name="Intense Quote" w:uiPriority="30" w:qFormat="1"/>
     <w:lsdException w:name="Medium List 2 Accent 1" w:uiPriority="66"/>
@@ -1237,7 +3499,7 @@
     <w:uiPriority w:val="9"/>
     <w:unhideWhenUsed/>
     <w:qFormat/>
-    <w:rsid w:val="00FC693F"/>
+    <w:rsid w:val="00173212"/>
     <w:pPr>
       <w:keepNext/>
       <w:keepLines/>
@@ -1245,10 +3507,10 @@
       <w:outlineLvl w:val="2"/>
     </w:pPr>
     <w:rPr>
-      <w:rFonts w:asciiTheme="majorHAnsi" w:eastAsiaTheme="majorEastAsia" w:hAnsiTheme="majorHAnsi" w:cstheme="majorBidi"/>
-      <w:b/>
+      <w:rFonts w:eastAsiaTheme="majorEastAsia" w:cstheme="majorBidi"/>
       <w:bCs/>
-      <w:color w:val="4F81BD" w:themeColor="accent1"/>
+      <w:color w:val="004BE2"/>
+      <w:sz w:val="24"/>
     </w:rPr>
   </w:style>
   <w:style w:type="paragraph" w:styleId="Heading4">
@@ -1394,7 +3656,6 @@
   <w:style w:type="character" w:default="1" w:styleId="DefaultParagraphFont">
     <w:name w:val="Default Paragraph Font"/>
     <w:uiPriority w:val="1"/>
-    <w:semiHidden/>
     <w:unhideWhenUsed/>
   </w:style>
   <w:style w:type="table" w:default="1" w:styleId="TableNormal">
@@ -1504,12 +3765,12 @@
     <w:basedOn w:val="DefaultParagraphFont"/>
     <w:link w:val="Heading3"/>
     <w:uiPriority w:val="9"/>
-    <w:rsid w:val="00FC693F"/>
+    <w:rsid w:val="00173212"/>
     <w:rPr>
-      <w:rFonts w:asciiTheme="majorHAnsi" w:eastAsiaTheme="majorEastAsia" w:hAnsiTheme="majorHAnsi" w:cstheme="majorBidi"/>
-      <w:b/>
+      <w:rFonts w:asciiTheme="majorBidi" w:eastAsiaTheme="majorEastAsia" w:hAnsiTheme="majorBidi" w:cstheme="majorBidi"/>
       <w:bCs/>
-      <w:color w:val="4F81BD" w:themeColor="accent1"/>
+      <w:color w:val="004BE2"/>
+      <w:sz w:val="24"/>
     </w:rPr>
   </w:style>
   <w:style w:type="paragraph" w:styleId="Title">
@@ -1593,7 +3854,7 @@
   <w:style w:type="paragraph" w:styleId="ListParagraph">
     <w:name w:val="List Paragraph"/>
     <w:basedOn w:val="Normal"/>
-    <w:uiPriority w:val="34"/>
+    <w:uiPriority w:val="1"/>
     <w:qFormat/>
     <w:rsid w:val="00FC693F"/>
     <w:pPr>
@@ -12167,6 +14428,17 @@
         <w:shd w:val="clear" w:color="auto" w:fill="FBCAA2" w:themeFill="accent6" w:themeFillTint="7F"/>
       </w:tcPr>
     </w:tblStylePr>
+  </w:style>
+  <w:style w:type="character" w:styleId="Hyperlink">
+    <w:name w:val="Hyperlink"/>
+    <w:basedOn w:val="DefaultParagraphFont"/>
+    <w:uiPriority w:val="99"/>
+    <w:unhideWhenUsed/>
+    <w:rsid w:val="00F8511F"/>
+    <w:rPr>
+      <w:color w:val="0000FF" w:themeColor="hyperlink"/>
+      <w:u w:val="single"/>
+    </w:rPr>
   </w:style>
 </w:styles>
 </file>

</xml_diff>

<commit_message>
Add course submission cover sheet and detailed assessment guidelines for SmartMed Pharmacy project. Include academic integrity regulations, software development tasks, and deliverables requirements to ensure clarity for students.
</commit_message>
<xml_diff>
--- a/Report/SmartMed Report.docx
+++ b/Report/SmartMed Report.docx
@@ -127,38 +127,24 @@
           <w:szCs w:val="48"/>
         </w:rPr>
       </w:pPr>
+      <w:proofErr w:type="spellStart"/>
       <w:r>
         <w:rPr>
           <w:color w:val="002060"/>
           <w:sz w:val="48"/>
           <w:szCs w:val="48"/>
         </w:rPr>
-        <w:t>SmartMed Pharmacy System</w:t>
-      </w:r>
-    </w:p>
-    <w:p>
-      <w:pPr>
-        <w:spacing w:line="360" w:lineRule="auto"/>
-        <w:jc w:val="both"/>
-      </w:pPr>
-    </w:p>
-    <w:p>
-      <w:pPr>
-        <w:spacing w:line="360" w:lineRule="auto"/>
-        <w:jc w:val="both"/>
-      </w:pPr>
-    </w:p>
-    <w:p>
-      <w:pPr>
-        <w:spacing w:line="360" w:lineRule="auto"/>
-        <w:jc w:val="both"/>
-      </w:pPr>
-    </w:p>
-    <w:p>
-      <w:pPr>
-        <w:spacing w:line="360" w:lineRule="auto"/>
-        <w:jc w:val="both"/>
-      </w:pPr>
+        <w:t>SmartMed</w:t>
+      </w:r>
+      <w:proofErr w:type="spellEnd"/>
+      <w:r>
+        <w:rPr>
+          <w:color w:val="002060"/>
+          <w:sz w:val="48"/>
+          <w:szCs w:val="48"/>
+        </w:rPr>
+        <w:t xml:space="preserve"> Pharmacy System</w:t>
+      </w:r>
     </w:p>
     <w:p>
       <w:pPr>
@@ -254,6 +240,7 @@
           <w:bCs w:val="0"/>
           <w:noProof/>
         </w:rPr>
+        <w:lastRenderedPageBreak/>
         <w:drawing>
           <wp:anchor distT="0" distB="0" distL="114300" distR="114300" simplePos="0" relativeHeight="251664896" behindDoc="0" locked="0" layoutInCell="1" allowOverlap="1" wp14:anchorId="6BA9F2D6" wp14:editId="71D5FF2A">
             <wp:simplePos x="0" y="0"/>
@@ -482,6 +469,7 @@
         </w:rPr>
         <w:t xml:space="preserve"> the </w:t>
       </w:r>
+      <w:proofErr w:type="gramStart"/>
       <w:r>
         <w:rPr>
           <w:iCs/>
@@ -499,6 +487,7 @@
         </w:rPr>
         <w:t>th</w:t>
       </w:r>
+      <w:proofErr w:type="gramEnd"/>
       <w:r>
         <w:rPr>
           <w:iCs/>
@@ -543,6 +532,8 @@
         </w:rPr>
         <w:t xml:space="preserve"> </w:t>
       </w:r>
+      <w:proofErr w:type="spellStart"/>
+      <w:proofErr w:type="gramStart"/>
       <w:r>
         <w:rPr>
           <w:rFonts w:cstheme="majorBidi"/>
@@ -552,18 +543,20 @@
           <w:sz w:val="24"/>
           <w:szCs w:val="24"/>
         </w:rPr>
-        <w:t>Ms.Shifani Mohideen</w:t>
-      </w:r>
+        <w:t>Ms.Shifani</w:t>
+      </w:r>
+      <w:proofErr w:type="spellEnd"/>
+      <w:proofErr w:type="gramEnd"/>
       <w:r>
         <w:rPr>
           <w:rFonts w:cstheme="majorBidi"/>
           <w:bCs/>
           <w:iCs/>
+          <w:spacing w:val="-1"/>
           <w:sz w:val="24"/>
           <w:szCs w:val="24"/>
         </w:rPr>
-        <w:tab/>
-        <w:t xml:space="preserve">   </w:t>
+        <w:t xml:space="preserve"> Mohideen</w:t>
       </w:r>
       <w:r>
         <w:rPr>
@@ -573,7 +566,8 @@
           <w:sz w:val="24"/>
           <w:szCs w:val="24"/>
         </w:rPr>
-        <w:t xml:space="preserve">                       </w:t>
+        <w:tab/>
+        <w:t xml:space="preserve">   </w:t>
       </w:r>
       <w:r>
         <w:rPr>
@@ -583,7 +577,7 @@
           <w:sz w:val="24"/>
           <w:szCs w:val="24"/>
         </w:rPr>
-        <w:t xml:space="preserve"> Student ID:</w:t>
+        <w:t xml:space="preserve">                       </w:t>
       </w:r>
       <w:r>
         <w:rPr>
@@ -593,7 +587,7 @@
           <w:sz w:val="24"/>
           <w:szCs w:val="24"/>
         </w:rPr>
-        <w:t xml:space="preserve"> E301118 / </w:t>
+        <w:t xml:space="preserve"> Student ID:</w:t>
       </w:r>
       <w:r>
         <w:rPr>
@@ -603,6 +597,16 @@
           <w:sz w:val="24"/>
           <w:szCs w:val="24"/>
         </w:rPr>
+        <w:t xml:space="preserve"> E301118 / </w:t>
+      </w:r>
+      <w:r>
+        <w:rPr>
+          <w:rFonts w:cstheme="majorBidi"/>
+          <w:bCs/>
+          <w:iCs/>
+          <w:sz w:val="24"/>
+          <w:szCs w:val="24"/>
+        </w:rPr>
         <w:t>25045082</w:t>
       </w:r>
     </w:p>
@@ -662,8 +666,25 @@
           <w:sz w:val="24"/>
           <w:szCs w:val="24"/>
         </w:rPr>
-        <w:lastRenderedPageBreak/>
-        <w:t>(signature:)</w:t>
+        <w:t>(</w:t>
+      </w:r>
+      <w:proofErr w:type="gramStart"/>
+      <w:r>
+        <w:rPr>
+          <w:rFonts w:cstheme="majorBidi"/>
+          <w:sz w:val="24"/>
+          <w:szCs w:val="24"/>
+        </w:rPr>
+        <w:t>signature</w:t>
+      </w:r>
+      <w:proofErr w:type="gramEnd"/>
+      <w:r>
+        <w:rPr>
+          <w:rFonts w:cstheme="majorBidi"/>
+          <w:sz w:val="24"/>
+          <w:szCs w:val="24"/>
+        </w:rPr>
+        <w:t>:)</w:t>
       </w:r>
       <w:r>
         <w:rPr>
@@ -683,6 +704,7 @@
         </w:rPr>
         <w:tab/>
       </w:r>
+      <w:proofErr w:type="gramStart"/>
       <w:r>
         <w:rPr>
           <w:rFonts w:cstheme="majorBidi"/>
@@ -690,8 +712,9 @@
           <w:szCs w:val="24"/>
           <w:u w:val="single"/>
         </w:rPr>
-        <w:t xml:space="preserve">M.N Sahla Baanu </w:t>
-      </w:r>
+        <w:t>M.N</w:t>
+      </w:r>
+      <w:proofErr w:type="gramEnd"/>
       <w:r>
         <w:rPr>
           <w:rFonts w:cstheme="majorBidi"/>
@@ -699,6 +722,16 @@
           <w:szCs w:val="24"/>
           <w:u w:val="single"/>
         </w:rPr>
+        <w:t xml:space="preserve"> Sahla Baanu </w:t>
+      </w:r>
+      <w:proofErr w:type="gramStart"/>
+      <w:r>
+        <w:rPr>
+          <w:rFonts w:cstheme="majorBidi"/>
+          <w:sz w:val="24"/>
+          <w:szCs w:val="24"/>
+          <w:u w:val="single"/>
+        </w:rPr>
         <w:tab/>
         <w:t xml:space="preserve">  </w:t>
       </w:r>
@@ -711,13 +744,23 @@
         </w:rPr>
         <w:tab/>
       </w:r>
+      <w:proofErr w:type="gramEnd"/>
       <w:r>
         <w:rPr>
           <w:rFonts w:cstheme="majorBidi"/>
           <w:sz w:val="24"/>
           <w:szCs w:val="24"/>
         </w:rPr>
-        <w:t xml:space="preserve">Date: </w:t>
+        <w:t>Date</w:t>
+      </w:r>
+      <w:proofErr w:type="gramStart"/>
+      <w:r>
+        <w:rPr>
+          <w:rFonts w:cstheme="majorBidi"/>
+          <w:sz w:val="24"/>
+          <w:szCs w:val="24"/>
+        </w:rPr>
+        <w:t xml:space="preserve">: </w:t>
       </w:r>
       <w:r>
         <w:rPr>
@@ -753,7 +796,17 @@
           <w:szCs w:val="24"/>
           <w:u w:val="single"/>
         </w:rPr>
-        <w:t>30/06/2026</w:t>
+        <w:t>30</w:t>
+      </w:r>
+      <w:proofErr w:type="gramEnd"/>
+      <w:r>
+        <w:rPr>
+          <w:rFonts w:cstheme="majorBidi"/>
+          <w:sz w:val="24"/>
+          <w:szCs w:val="24"/>
+          <w:u w:val="single"/>
+        </w:rPr>
+        <w:t>/06/2026</w:t>
       </w:r>
       <w:r>
         <w:rPr>
@@ -1206,6 +1259,7 @@
         <w:pStyle w:val="Heading1"/>
       </w:pPr>
       <w:r>
+        <w:lastRenderedPageBreak/>
         <w:t>Introduction</w:t>
       </w:r>
     </w:p>
@@ -1214,12 +1268,69 @@
         <w:spacing w:line="360" w:lineRule="auto"/>
         <w:jc w:val="both"/>
       </w:pPr>
-      <w:r>
-        <w:rPr>
-          <w:rFonts w:ascii="Times New Roman" w:hAnsi="Times New Roman"/>
-          <w:sz w:val="24"/>
-        </w:rPr>
-        <w:t>SmartMed Pharmacy is a desktop Windows Forms application developed in C# using the .NET Framework 4.8. The system supports two user roles: administrators who manage inventory, customers, and orders, and customers who search for medicines, place orders, and track fulfilment status. The application follows a three-tier architecture separating presentation (SmartMed.UI), business logic (SmartMed.Business), and data access (SmartMed.Data) with persistence in Microsoft SQL Server.</w:t>
+      <w:proofErr w:type="spellStart"/>
+      <w:r>
+        <w:rPr>
+          <w:rFonts w:ascii="Times New Roman" w:hAnsi="Times New Roman"/>
+          <w:sz w:val="24"/>
+        </w:rPr>
+        <w:t>SmartMed</w:t>
+      </w:r>
+      <w:proofErr w:type="spellEnd"/>
+      <w:r>
+        <w:rPr>
+          <w:rFonts w:ascii="Times New Roman" w:hAnsi="Times New Roman"/>
+          <w:sz w:val="24"/>
+        </w:rPr>
+        <w:t xml:space="preserve"> Pharmacy is a desktop Windows Forms application developed in C# using the .NET Framework 4.8. The system supports two user roles: administrators who manage inventory, customers, and orders, and customers who search for medicines, place orders, and track fulfilment status. The application follows a three-tier architecture separating presentation (</w:t>
+      </w:r>
+      <w:proofErr w:type="spellStart"/>
+      <w:r>
+        <w:rPr>
+          <w:rFonts w:ascii="Times New Roman" w:hAnsi="Times New Roman"/>
+          <w:sz w:val="24"/>
+        </w:rPr>
+        <w:t>SmartMed.UI</w:t>
+      </w:r>
+      <w:proofErr w:type="spellEnd"/>
+      <w:r>
+        <w:rPr>
+          <w:rFonts w:ascii="Times New Roman" w:hAnsi="Times New Roman"/>
+          <w:sz w:val="24"/>
+        </w:rPr>
+        <w:t>), business logic (</w:t>
+      </w:r>
+      <w:proofErr w:type="spellStart"/>
+      <w:r>
+        <w:rPr>
+          <w:rFonts w:ascii="Times New Roman" w:hAnsi="Times New Roman"/>
+          <w:sz w:val="24"/>
+        </w:rPr>
+        <w:t>SmartMed.Business</w:t>
+      </w:r>
+      <w:proofErr w:type="spellEnd"/>
+      <w:r>
+        <w:rPr>
+          <w:rFonts w:ascii="Times New Roman" w:hAnsi="Times New Roman"/>
+          <w:sz w:val="24"/>
+        </w:rPr>
+        <w:t>), and data access (</w:t>
+      </w:r>
+      <w:proofErr w:type="spellStart"/>
+      <w:r>
+        <w:rPr>
+          <w:rFonts w:ascii="Times New Roman" w:hAnsi="Times New Roman"/>
+          <w:sz w:val="24"/>
+        </w:rPr>
+        <w:t>SmartMed.Data</w:t>
+      </w:r>
+      <w:proofErr w:type="spellEnd"/>
+      <w:r>
+        <w:rPr>
+          <w:rFonts w:ascii="Times New Roman" w:hAnsi="Times New Roman"/>
+          <w:sz w:val="24"/>
+        </w:rPr>
+        <w:t>) with persistence in Microsoft SQL Server.</w:t>
       </w:r>
     </w:p>
     <w:p>
@@ -1232,7 +1343,6 @@
           <w:rFonts w:ascii="Times New Roman" w:hAnsi="Times New Roman"/>
           <w:sz w:val="24"/>
         </w:rPr>
-        <w:lastRenderedPageBreak/>
         <w:t>This report documents how to run the software, describes the architecture and class design aligned with the coursework diagrams, explains the search algorithms used for medicine catalogue queries, and includes a reflective essay on the development experience. The implementation satisfies the mandatory functional requirements from the assignment brief, including login, registration, medicine CRUD, customer management, order processing, reports, dashboard, and linear search with filtering.</w:t>
       </w:r>
     </w:p>
@@ -1279,7 +1389,23 @@
           <w:sz w:val="24"/>
         </w:rPr>
         <w:br/>
-        <w:t>• SQL Server Express, LocalDB, or full SQL Server with Windows Authentication.</w:t>
+        <w:t xml:space="preserve">• SQL Server Express, </w:t>
+      </w:r>
+      <w:proofErr w:type="spellStart"/>
+      <w:r>
+        <w:rPr>
+          <w:rFonts w:ascii="Times New Roman" w:hAnsi="Times New Roman"/>
+          <w:sz w:val="24"/>
+        </w:rPr>
+        <w:t>LocalDB</w:t>
+      </w:r>
+      <w:proofErr w:type="spellEnd"/>
+      <w:r>
+        <w:rPr>
+          <w:rFonts w:ascii="Times New Roman" w:hAnsi="Times New Roman"/>
+          <w:sz w:val="24"/>
+        </w:rPr>
+        <w:t>, or full SQL Server with Windows Authentication.</w:t>
       </w:r>
     </w:p>
     <w:p>
@@ -1299,7 +1425,22 @@
           <w:sz w:val="24"/>
         </w:rPr>
         <w:br/>
-        <w:t>1. Open SQL Server Management Studio (SSMS).</w:t>
+      </w:r>
+      <w:proofErr w:type="gramStart"/>
+      <w:r>
+        <w:rPr>
+          <w:rFonts w:ascii="Times New Roman" w:hAnsi="Times New Roman"/>
+          <w:sz w:val="24"/>
+        </w:rPr>
+        <w:t>1</w:t>
+      </w:r>
+      <w:proofErr w:type="gramEnd"/>
+      <w:r>
+        <w:rPr>
+          <w:rFonts w:ascii="Times New Roman" w:hAnsi="Times New Roman"/>
+          <w:sz w:val="24"/>
+        </w:rPr>
+        <w:t>. Open SQL Server Management Studio (SSMS).</w:t>
       </w:r>
       <w:r>
         <w:rPr>
@@ -1307,7 +1448,38 @@
           <w:sz w:val="24"/>
         </w:rPr>
         <w:br/>
-        <w:t>2. Open the script Database/SmartMedDB.sql from the project folder.</w:t>
+      </w:r>
+      <w:proofErr w:type="gramStart"/>
+      <w:r>
+        <w:rPr>
+          <w:rFonts w:ascii="Times New Roman" w:hAnsi="Times New Roman"/>
+          <w:sz w:val="24"/>
+        </w:rPr>
+        <w:t>2</w:t>
+      </w:r>
+      <w:proofErr w:type="gramEnd"/>
+      <w:r>
+        <w:rPr>
+          <w:rFonts w:ascii="Times New Roman" w:hAnsi="Times New Roman"/>
+          <w:sz w:val="24"/>
+        </w:rPr>
+        <w:t>. Open the script Database/</w:t>
+      </w:r>
+      <w:proofErr w:type="spellStart"/>
+      <w:r>
+        <w:rPr>
+          <w:rFonts w:ascii="Times New Roman" w:hAnsi="Times New Roman"/>
+          <w:sz w:val="24"/>
+        </w:rPr>
+        <w:t>SmartMedDB.sql</w:t>
+      </w:r>
+      <w:proofErr w:type="spellEnd"/>
+      <w:r>
+        <w:rPr>
+          <w:rFonts w:ascii="Times New Roman" w:hAnsi="Times New Roman"/>
+          <w:sz w:val="24"/>
+        </w:rPr>
+        <w:t xml:space="preserve"> from the project folder.</w:t>
       </w:r>
       <w:r>
         <w:rPr>
@@ -1315,7 +1487,38 @@
           <w:sz w:val="24"/>
         </w:rPr>
         <w:br/>
-        <w:t>3. Execute the script. It creates the SmartMedDB database, all tables, constraints, and seed data.</w:t>
+      </w:r>
+      <w:proofErr w:type="gramStart"/>
+      <w:r>
+        <w:rPr>
+          <w:rFonts w:ascii="Times New Roman" w:hAnsi="Times New Roman"/>
+          <w:sz w:val="24"/>
+        </w:rPr>
+        <w:t>3</w:t>
+      </w:r>
+      <w:proofErr w:type="gramEnd"/>
+      <w:r>
+        <w:rPr>
+          <w:rFonts w:ascii="Times New Roman" w:hAnsi="Times New Roman"/>
+          <w:sz w:val="24"/>
+        </w:rPr>
+        <w:t xml:space="preserve">. Execute the script. It creates the </w:t>
+      </w:r>
+      <w:proofErr w:type="spellStart"/>
+      <w:r>
+        <w:rPr>
+          <w:rFonts w:ascii="Times New Roman" w:hAnsi="Times New Roman"/>
+          <w:sz w:val="24"/>
+        </w:rPr>
+        <w:t>SmartMedDB</w:t>
+      </w:r>
+      <w:proofErr w:type="spellEnd"/>
+      <w:r>
+        <w:rPr>
+          <w:rFonts w:ascii="Times New Roman" w:hAnsi="Times New Roman"/>
+          <w:sz w:val="24"/>
+        </w:rPr>
+        <w:t xml:space="preserve"> database, all tables, constraints, and seed data.</w:t>
       </w:r>
       <w:r>
         <w:rPr>
@@ -1323,7 +1526,22 @@
           <w:sz w:val="24"/>
         </w:rPr>
         <w:br/>
-        <w:t>4. Default admin credentials: Username admin, Password admin123.</w:t>
+      </w:r>
+      <w:proofErr w:type="gramStart"/>
+      <w:r>
+        <w:rPr>
+          <w:rFonts w:ascii="Times New Roman" w:hAnsi="Times New Roman"/>
+          <w:sz w:val="24"/>
+        </w:rPr>
+        <w:t>4</w:t>
+      </w:r>
+      <w:proofErr w:type="gramEnd"/>
+      <w:r>
+        <w:rPr>
+          <w:rFonts w:ascii="Times New Roman" w:hAnsi="Times New Roman"/>
+          <w:sz w:val="24"/>
+        </w:rPr>
+        <w:t>. Default admin credentials: Username admin, Password admin123.</w:t>
       </w:r>
       <w:r>
         <w:rPr>
@@ -1331,7 +1549,22 @@
           <w:sz w:val="24"/>
         </w:rPr>
         <w:br/>
-        <w:t>5. Sample customer: john@email.com / customer123.</w:t>
+      </w:r>
+      <w:proofErr w:type="gramStart"/>
+      <w:r>
+        <w:rPr>
+          <w:rFonts w:ascii="Times New Roman" w:hAnsi="Times New Roman"/>
+          <w:sz w:val="24"/>
+        </w:rPr>
+        <w:t>5</w:t>
+      </w:r>
+      <w:proofErr w:type="gramEnd"/>
+      <w:r>
+        <w:rPr>
+          <w:rFonts w:ascii="Times New Roman" w:hAnsi="Times New Roman"/>
+          <w:sz w:val="24"/>
+        </w:rPr>
+        <w:t>. Sample customer: john@email.com / customer123.</w:t>
       </w:r>
     </w:p>
     <w:p>
@@ -1351,7 +1584,54 @@
           <w:sz w:val="24"/>
         </w:rPr>
         <w:br/>
-        <w:t>1. Open SmartMed.UI/App.config.</w:t>
+      </w:r>
+      <w:proofErr w:type="gramStart"/>
+      <w:r>
+        <w:rPr>
+          <w:rFonts w:ascii="Times New Roman" w:hAnsi="Times New Roman"/>
+          <w:sz w:val="24"/>
+        </w:rPr>
+        <w:t>1</w:t>
+      </w:r>
+      <w:proofErr w:type="gramEnd"/>
+      <w:r>
+        <w:rPr>
+          <w:rFonts w:ascii="Times New Roman" w:hAnsi="Times New Roman"/>
+          <w:sz w:val="24"/>
+        </w:rPr>
+        <w:t xml:space="preserve">. Open </w:t>
+      </w:r>
+      <w:proofErr w:type="spellStart"/>
+      <w:r>
+        <w:rPr>
+          <w:rFonts w:ascii="Times New Roman" w:hAnsi="Times New Roman"/>
+          <w:sz w:val="24"/>
+        </w:rPr>
+        <w:t>SmartMed.UI</w:t>
+      </w:r>
+      <w:proofErr w:type="spellEnd"/>
+      <w:r>
+        <w:rPr>
+          <w:rFonts w:ascii="Times New Roman" w:hAnsi="Times New Roman"/>
+          <w:sz w:val="24"/>
+        </w:rPr>
+        <w:t>/</w:t>
+      </w:r>
+      <w:proofErr w:type="spellStart"/>
+      <w:r>
+        <w:rPr>
+          <w:rFonts w:ascii="Times New Roman" w:hAnsi="Times New Roman"/>
+          <w:sz w:val="24"/>
+        </w:rPr>
+        <w:t>App.config</w:t>
+      </w:r>
+      <w:proofErr w:type="spellEnd"/>
+      <w:r>
+        <w:rPr>
+          <w:rFonts w:ascii="Times New Roman" w:hAnsi="Times New Roman"/>
+          <w:sz w:val="24"/>
+        </w:rPr>
+        <w:t>.</w:t>
       </w:r>
       <w:r>
         <w:rPr>
@@ -1359,7 +1639,114 @@
           <w:sz w:val="24"/>
         </w:rPr>
         <w:br/>
-        <w:t>2. Adjust the SmartMedDB connection string if your SQL Server instance is not the default local instance (.). For LocalDB use: Data Source=(localdb)\MSSQLLocalDB;Initial Catalog=SmartMedDB;Integrated Security=True</w:t>
+      </w:r>
+      <w:proofErr w:type="gramStart"/>
+      <w:r>
+        <w:rPr>
+          <w:rFonts w:ascii="Times New Roman" w:hAnsi="Times New Roman"/>
+          <w:sz w:val="24"/>
+        </w:rPr>
+        <w:t>2</w:t>
+      </w:r>
+      <w:proofErr w:type="gramEnd"/>
+      <w:r>
+        <w:rPr>
+          <w:rFonts w:ascii="Times New Roman" w:hAnsi="Times New Roman"/>
+          <w:sz w:val="24"/>
+        </w:rPr>
+        <w:t xml:space="preserve">. Adjust the </w:t>
+      </w:r>
+      <w:proofErr w:type="spellStart"/>
+      <w:r>
+        <w:rPr>
+          <w:rFonts w:ascii="Times New Roman" w:hAnsi="Times New Roman"/>
+          <w:sz w:val="24"/>
+        </w:rPr>
+        <w:t>SmartMedDB</w:t>
+      </w:r>
+      <w:proofErr w:type="spellEnd"/>
+      <w:r>
+        <w:rPr>
+          <w:rFonts w:ascii="Times New Roman" w:hAnsi="Times New Roman"/>
+          <w:sz w:val="24"/>
+        </w:rPr>
+        <w:t xml:space="preserve"> connection string if your SQL Server instance is not the default local </w:t>
+      </w:r>
+      <w:r>
+        <w:rPr>
+          <w:rFonts w:ascii="Times New Roman" w:hAnsi="Times New Roman"/>
+          <w:sz w:val="24"/>
+        </w:rPr>
+        <w:lastRenderedPageBreak/>
+        <w:t xml:space="preserve">instance (.). For </w:t>
+      </w:r>
+      <w:proofErr w:type="spellStart"/>
+      <w:r>
+        <w:rPr>
+          <w:rFonts w:ascii="Times New Roman" w:hAnsi="Times New Roman"/>
+          <w:sz w:val="24"/>
+        </w:rPr>
+        <w:t>LocalDB</w:t>
+      </w:r>
+      <w:proofErr w:type="spellEnd"/>
+      <w:r>
+        <w:rPr>
+          <w:rFonts w:ascii="Times New Roman" w:hAnsi="Times New Roman"/>
+          <w:sz w:val="24"/>
+        </w:rPr>
+        <w:t xml:space="preserve"> use: Data Source=(</w:t>
+      </w:r>
+      <w:proofErr w:type="spellStart"/>
+      <w:r>
+        <w:rPr>
+          <w:rFonts w:ascii="Times New Roman" w:hAnsi="Times New Roman"/>
+          <w:sz w:val="24"/>
+        </w:rPr>
+        <w:t>localdb</w:t>
+      </w:r>
+      <w:proofErr w:type="spellEnd"/>
+      <w:r>
+        <w:rPr>
+          <w:rFonts w:ascii="Times New Roman" w:hAnsi="Times New Roman"/>
+          <w:sz w:val="24"/>
+        </w:rPr>
+        <w:t>)\</w:t>
+      </w:r>
+      <w:proofErr w:type="spellStart"/>
+      <w:proofErr w:type="gramStart"/>
+      <w:r>
+        <w:rPr>
+          <w:rFonts w:ascii="Times New Roman" w:hAnsi="Times New Roman"/>
+          <w:sz w:val="24"/>
+        </w:rPr>
+        <w:t>MSSQLLocalDB;Initial</w:t>
+      </w:r>
+      <w:proofErr w:type="spellEnd"/>
+      <w:proofErr w:type="gramEnd"/>
+      <w:r>
+        <w:rPr>
+          <w:rFonts w:ascii="Times New Roman" w:hAnsi="Times New Roman"/>
+          <w:sz w:val="24"/>
+        </w:rPr>
+        <w:t xml:space="preserve"> Catalog=</w:t>
+      </w:r>
+      <w:proofErr w:type="spellStart"/>
+      <w:proofErr w:type="gramStart"/>
+      <w:r>
+        <w:rPr>
+          <w:rFonts w:ascii="Times New Roman" w:hAnsi="Times New Roman"/>
+          <w:sz w:val="24"/>
+        </w:rPr>
+        <w:t>SmartMedDB;Integrated</w:t>
+      </w:r>
+      <w:proofErr w:type="spellEnd"/>
+      <w:proofErr w:type="gramEnd"/>
+      <w:r>
+        <w:rPr>
+          <w:rFonts w:ascii="Times New Roman" w:hAnsi="Times New Roman"/>
+          <w:sz w:val="24"/>
+        </w:rPr>
+        <w:t xml:space="preserve"> Security=True</w:t>
       </w:r>
     </w:p>
     <w:p>
@@ -1379,7 +1766,22 @@
           <w:sz w:val="24"/>
         </w:rPr>
         <w:br/>
-        <w:t>1. Open SmartMed.sln in Visual Studio.</w:t>
+      </w:r>
+      <w:proofErr w:type="gramStart"/>
+      <w:r>
+        <w:rPr>
+          <w:rFonts w:ascii="Times New Roman" w:hAnsi="Times New Roman"/>
+          <w:sz w:val="24"/>
+        </w:rPr>
+        <w:t>1</w:t>
+      </w:r>
+      <w:proofErr w:type="gramEnd"/>
+      <w:r>
+        <w:rPr>
+          <w:rFonts w:ascii="Times New Roman" w:hAnsi="Times New Roman"/>
+          <w:sz w:val="24"/>
+        </w:rPr>
+        <w:t>. Open SmartMed.sln in Visual Studio.</w:t>
       </w:r>
       <w:r>
         <w:rPr>
@@ -1387,7 +1789,38 @@
           <w:sz w:val="24"/>
         </w:rPr>
         <w:br/>
-        <w:t>2. Right-click SmartMed.UI and Set as Startup Project.</w:t>
+      </w:r>
+      <w:proofErr w:type="gramStart"/>
+      <w:r>
+        <w:rPr>
+          <w:rFonts w:ascii="Times New Roman" w:hAnsi="Times New Roman"/>
+          <w:sz w:val="24"/>
+        </w:rPr>
+        <w:t>2</w:t>
+      </w:r>
+      <w:proofErr w:type="gramEnd"/>
+      <w:r>
+        <w:rPr>
+          <w:rFonts w:ascii="Times New Roman" w:hAnsi="Times New Roman"/>
+          <w:sz w:val="24"/>
+        </w:rPr>
+        <w:t xml:space="preserve">. Right-click </w:t>
+      </w:r>
+      <w:proofErr w:type="spellStart"/>
+      <w:r>
+        <w:rPr>
+          <w:rFonts w:ascii="Times New Roman" w:hAnsi="Times New Roman"/>
+          <w:sz w:val="24"/>
+        </w:rPr>
+        <w:t>SmartMed.UI</w:t>
+      </w:r>
+      <w:proofErr w:type="spellEnd"/>
+      <w:r>
+        <w:rPr>
+          <w:rFonts w:ascii="Times New Roman" w:hAnsi="Times New Roman"/>
+          <w:sz w:val="24"/>
+        </w:rPr>
+        <w:t xml:space="preserve"> and Set as Startup Project.</w:t>
       </w:r>
       <w:r>
         <w:rPr>
@@ -1395,7 +1828,38 @@
           <w:sz w:val="24"/>
         </w:rPr>
         <w:br/>
-        <w:t>3. Build → Build Solution (Ctrl+Shift+B). Alternatively run: dotnet build SmartMed.sln from the solution folder.</w:t>
+      </w:r>
+      <w:proofErr w:type="gramStart"/>
+      <w:r>
+        <w:rPr>
+          <w:rFonts w:ascii="Times New Roman" w:hAnsi="Times New Roman"/>
+          <w:sz w:val="24"/>
+        </w:rPr>
+        <w:t>3</w:t>
+      </w:r>
+      <w:proofErr w:type="gramEnd"/>
+      <w:r>
+        <w:rPr>
+          <w:rFonts w:ascii="Times New Roman" w:hAnsi="Times New Roman"/>
+          <w:sz w:val="24"/>
+        </w:rPr>
+        <w:t>. Build → Build Solution (</w:t>
+      </w:r>
+      <w:proofErr w:type="spellStart"/>
+      <w:r>
+        <w:rPr>
+          <w:rFonts w:ascii="Times New Roman" w:hAnsi="Times New Roman"/>
+          <w:sz w:val="24"/>
+        </w:rPr>
+        <w:t>Ctrl+Shift+B</w:t>
+      </w:r>
+      <w:proofErr w:type="spellEnd"/>
+      <w:r>
+        <w:rPr>
+          <w:rFonts w:ascii="Times New Roman" w:hAnsi="Times New Roman"/>
+          <w:sz w:val="24"/>
+        </w:rPr>
+        <w:t>). Alternatively run: dotnet build SmartMed.sln from the solution folder.</w:t>
       </w:r>
       <w:r>
         <w:rPr>
@@ -1403,7 +1867,22 @@
           <w:sz w:val="24"/>
         </w:rPr>
         <w:br/>
-        <w:t>4. Press F5 to start debugging. The Login form appears first.</w:t>
+      </w:r>
+      <w:proofErr w:type="gramStart"/>
+      <w:r>
+        <w:rPr>
+          <w:rFonts w:ascii="Times New Roman" w:hAnsi="Times New Roman"/>
+          <w:sz w:val="24"/>
+        </w:rPr>
+        <w:t>4</w:t>
+      </w:r>
+      <w:proofErr w:type="gramEnd"/>
+      <w:r>
+        <w:rPr>
+          <w:rFonts w:ascii="Times New Roman" w:hAnsi="Times New Roman"/>
+          <w:sz w:val="24"/>
+        </w:rPr>
+        <w:t>. Press F5 to start debugging. The Login form appears first.</w:t>
       </w:r>
       <w:r>
         <w:rPr>
@@ -1412,13 +1891,37 @@
         </w:rPr>
         <w:br/>
       </w:r>
-      <w:r>
-        <w:rPr>
-          <w:rFonts w:ascii="Times New Roman" w:hAnsi="Times New Roman"/>
-          <w:sz w:val="24"/>
-        </w:rPr>
-        <w:lastRenderedPageBreak/>
-        <w:t>5. Log in as admin (admin / admin123) to access the admin dashboard, or register a new customer account.</w:t>
+      <w:proofErr w:type="gramStart"/>
+      <w:r>
+        <w:rPr>
+          <w:rFonts w:ascii="Times New Roman" w:hAnsi="Times New Roman"/>
+          <w:sz w:val="24"/>
+        </w:rPr>
+        <w:t>5</w:t>
+      </w:r>
+      <w:proofErr w:type="gramEnd"/>
+      <w:r>
+        <w:rPr>
+          <w:rFonts w:ascii="Times New Roman" w:hAnsi="Times New Roman"/>
+          <w:sz w:val="24"/>
+        </w:rPr>
+        <w:t xml:space="preserve">. Log in as admin (admin / admin123) to access the admin </w:t>
+      </w:r>
+      <w:proofErr w:type="gramStart"/>
+      <w:r>
+        <w:rPr>
+          <w:rFonts w:ascii="Times New Roman" w:hAnsi="Times New Roman"/>
+          <w:sz w:val="24"/>
+        </w:rPr>
+        <w:t>dashboard, or</w:t>
+      </w:r>
+      <w:proofErr w:type="gramEnd"/>
+      <w:r>
+        <w:rPr>
+          <w:rFonts w:ascii="Times New Roman" w:hAnsi="Times New Roman"/>
+          <w:sz w:val="24"/>
+        </w:rPr>
+        <w:t xml:space="preserve"> register a new customer account.</w:t>
       </w:r>
     </w:p>
     <w:p>
@@ -1461,7 +1964,119 @@
           <w:rFonts w:ascii="Times New Roman" w:hAnsi="Times New Roman"/>
           <w:sz w:val="24"/>
         </w:rPr>
-        <w:t>The SmartMed system is a single-user-session desktop application. On startup, Program.cs launches LoginForm. Successful authentication stores the current user in Session (SmartMed.Business) and opens either AdminDashboardForm or CustomerDashboardForm based on role. Each dashboard provides navigation buttons to feature-specific forms. All database access is routed through repository classes in SmartMed.Data; WinForms code never opens SQL connections directly, preserving separation of concerns.</w:t>
+        <w:t xml:space="preserve">The </w:t>
+      </w:r>
+      <w:proofErr w:type="spellStart"/>
+      <w:r>
+        <w:rPr>
+          <w:rFonts w:ascii="Times New Roman" w:hAnsi="Times New Roman"/>
+          <w:sz w:val="24"/>
+        </w:rPr>
+        <w:t>SmartMed</w:t>
+      </w:r>
+      <w:proofErr w:type="spellEnd"/>
+      <w:r>
+        <w:rPr>
+          <w:rFonts w:ascii="Times New Roman" w:hAnsi="Times New Roman"/>
+          <w:sz w:val="24"/>
+        </w:rPr>
+        <w:t xml:space="preserve"> system is a single-user-session desktop application. On startup, </w:t>
+      </w:r>
+      <w:proofErr w:type="spellStart"/>
+      <w:r>
+        <w:rPr>
+          <w:rFonts w:ascii="Times New Roman" w:hAnsi="Times New Roman"/>
+          <w:sz w:val="24"/>
+        </w:rPr>
+        <w:t>Program.cs</w:t>
+      </w:r>
+      <w:proofErr w:type="spellEnd"/>
+      <w:r>
+        <w:rPr>
+          <w:rFonts w:ascii="Times New Roman" w:hAnsi="Times New Roman"/>
+          <w:sz w:val="24"/>
+        </w:rPr>
+        <w:t xml:space="preserve"> launches </w:t>
+      </w:r>
+      <w:proofErr w:type="spellStart"/>
+      <w:r>
+        <w:rPr>
+          <w:rFonts w:ascii="Times New Roman" w:hAnsi="Times New Roman"/>
+          <w:sz w:val="24"/>
+        </w:rPr>
+        <w:t>LoginForm</w:t>
+      </w:r>
+      <w:proofErr w:type="spellEnd"/>
+      <w:r>
+        <w:rPr>
+          <w:rFonts w:ascii="Times New Roman" w:hAnsi="Times New Roman"/>
+          <w:sz w:val="24"/>
+        </w:rPr>
+        <w:t>. Successful authentication stores the current user in Session (</w:t>
+      </w:r>
+      <w:proofErr w:type="spellStart"/>
+      <w:r>
+        <w:rPr>
+          <w:rFonts w:ascii="Times New Roman" w:hAnsi="Times New Roman"/>
+          <w:sz w:val="24"/>
+        </w:rPr>
+        <w:t>SmartMed.Business</w:t>
+      </w:r>
+      <w:proofErr w:type="spellEnd"/>
+      <w:r>
+        <w:rPr>
+          <w:rFonts w:ascii="Times New Roman" w:hAnsi="Times New Roman"/>
+          <w:sz w:val="24"/>
+        </w:rPr>
+        <w:t xml:space="preserve">) and opens either </w:t>
+      </w:r>
+      <w:proofErr w:type="spellStart"/>
+      <w:r>
+        <w:rPr>
+          <w:rFonts w:ascii="Times New Roman" w:hAnsi="Times New Roman"/>
+          <w:sz w:val="24"/>
+        </w:rPr>
+        <w:t>AdminDashboardForm</w:t>
+      </w:r>
+      <w:proofErr w:type="spellEnd"/>
+      <w:r>
+        <w:rPr>
+          <w:rFonts w:ascii="Times New Roman" w:hAnsi="Times New Roman"/>
+          <w:sz w:val="24"/>
+        </w:rPr>
+        <w:t xml:space="preserve"> or </w:t>
+      </w:r>
+      <w:proofErr w:type="spellStart"/>
+      <w:r>
+        <w:rPr>
+          <w:rFonts w:ascii="Times New Roman" w:hAnsi="Times New Roman"/>
+          <w:sz w:val="24"/>
+        </w:rPr>
+        <w:t>CustomerDashboardForm</w:t>
+      </w:r>
+      <w:proofErr w:type="spellEnd"/>
+      <w:r>
+        <w:rPr>
+          <w:rFonts w:ascii="Times New Roman" w:hAnsi="Times New Roman"/>
+          <w:sz w:val="24"/>
+        </w:rPr>
+        <w:t xml:space="preserve"> based on role. Each dashboard provides navigation buttons to feature-specific forms. All database access is routed through repository classes in </w:t>
+      </w:r>
+      <w:proofErr w:type="spellStart"/>
+      <w:r>
+        <w:rPr>
+          <w:rFonts w:ascii="Times New Roman" w:hAnsi="Times New Roman"/>
+          <w:sz w:val="24"/>
+        </w:rPr>
+        <w:t>SmartMed.Data</w:t>
+      </w:r>
+      <w:proofErr w:type="spellEnd"/>
+      <w:r>
+        <w:rPr>
+          <w:rFonts w:ascii="Times New Roman" w:hAnsi="Times New Roman"/>
+          <w:sz w:val="24"/>
+        </w:rPr>
+        <w:t>; WinForms code never opens SQL connections directly, preserving separation of concerns.</w:t>
       </w:r>
     </w:p>
     <w:p>
@@ -1484,7 +2099,23 @@
           <w:rFonts w:ascii="Times New Roman" w:hAnsi="Times New Roman"/>
           <w:sz w:val="24"/>
         </w:rPr>
-        <w:t>Presentation Layer (SmartMed.UI): Windows Forms for login, registration, admin dashboards, medicine CRUD, customer management, order management, reports, medicine search, cart/checkout, order tracking, and profile editing.</w:t>
+        <w:t>Presentation Layer (</w:t>
+      </w:r>
+      <w:proofErr w:type="spellStart"/>
+      <w:r>
+        <w:rPr>
+          <w:rFonts w:ascii="Times New Roman" w:hAnsi="Times New Roman"/>
+          <w:sz w:val="24"/>
+        </w:rPr>
+        <w:t>SmartMed.UI</w:t>
+      </w:r>
+      <w:proofErr w:type="spellEnd"/>
+      <w:r>
+        <w:rPr>
+          <w:rFonts w:ascii="Times New Roman" w:hAnsi="Times New Roman"/>
+          <w:sz w:val="24"/>
+        </w:rPr>
+        <w:t>): Windows Forms for login, registration, admin dashboards, medicine CRUD, customer management, order management, reports, medicine search, cart/checkout, order tracking, and profile editing.</w:t>
       </w:r>
     </w:p>
     <w:p>
@@ -1497,7 +2128,159 @@
           <w:rFonts w:ascii="Times New Roman" w:hAnsi="Times New Roman"/>
           <w:sz w:val="24"/>
         </w:rPr>
-        <w:t>Business Layer (SmartMed.Business): Entity classes (Person, Customer, Admin, Medicine, Order, OrderItem, Prescription), ValidationHelper for input rules, SearchHelper for linear search and filtering, Session for authenticated user state, and service classes (AuthService, MedicineService, OrderService, CustomerService, DashboardService) that coordinate validation and repository calls.</w:t>
+        <w:t>Business Layer (</w:t>
+      </w:r>
+      <w:proofErr w:type="spellStart"/>
+      <w:r>
+        <w:rPr>
+          <w:rFonts w:ascii="Times New Roman" w:hAnsi="Times New Roman"/>
+          <w:sz w:val="24"/>
+        </w:rPr>
+        <w:t>SmartMed.Business</w:t>
+      </w:r>
+      <w:proofErr w:type="spellEnd"/>
+      <w:r>
+        <w:rPr>
+          <w:rFonts w:ascii="Times New Roman" w:hAnsi="Times New Roman"/>
+          <w:sz w:val="24"/>
+        </w:rPr>
+        <w:t xml:space="preserve">): Entity classes (Person, Customer, Admin, Medicine, Order, </w:t>
+      </w:r>
+      <w:proofErr w:type="spellStart"/>
+      <w:r>
+        <w:rPr>
+          <w:rFonts w:ascii="Times New Roman" w:hAnsi="Times New Roman"/>
+          <w:sz w:val="24"/>
+        </w:rPr>
+        <w:t>OrderItem</w:t>
+      </w:r>
+      <w:proofErr w:type="spellEnd"/>
+      <w:r>
+        <w:rPr>
+          <w:rFonts w:ascii="Times New Roman" w:hAnsi="Times New Roman"/>
+          <w:sz w:val="24"/>
+        </w:rPr>
+        <w:t xml:space="preserve">, Prescription), </w:t>
+      </w:r>
+      <w:proofErr w:type="spellStart"/>
+      <w:r>
+        <w:rPr>
+          <w:rFonts w:ascii="Times New Roman" w:hAnsi="Times New Roman"/>
+          <w:sz w:val="24"/>
+        </w:rPr>
+        <w:t>ValidationHelper</w:t>
+      </w:r>
+      <w:proofErr w:type="spellEnd"/>
+      <w:r>
+        <w:rPr>
+          <w:rFonts w:ascii="Times New Roman" w:hAnsi="Times New Roman"/>
+          <w:sz w:val="24"/>
+        </w:rPr>
+        <w:t xml:space="preserve"> for input rules, </w:t>
+      </w:r>
+      <w:proofErr w:type="spellStart"/>
+      <w:r>
+        <w:rPr>
+          <w:rFonts w:ascii="Times New Roman" w:hAnsi="Times New Roman"/>
+          <w:sz w:val="24"/>
+        </w:rPr>
+        <w:t>SearchHelper</w:t>
+      </w:r>
+      <w:proofErr w:type="spellEnd"/>
+      <w:r>
+        <w:rPr>
+          <w:rFonts w:ascii="Times New Roman" w:hAnsi="Times New Roman"/>
+          <w:sz w:val="24"/>
+        </w:rPr>
+        <w:t xml:space="preserve"> for linear search </w:t>
+      </w:r>
+      <w:r>
+        <w:rPr>
+          <w:rFonts w:ascii="Times New Roman" w:hAnsi="Times New Roman"/>
+          <w:sz w:val="24"/>
+        </w:rPr>
+        <w:lastRenderedPageBreak/>
+        <w:t>and filtering, Session for authenticated user state, and service classes (</w:t>
+      </w:r>
+      <w:proofErr w:type="spellStart"/>
+      <w:r>
+        <w:rPr>
+          <w:rFonts w:ascii="Times New Roman" w:hAnsi="Times New Roman"/>
+          <w:sz w:val="24"/>
+        </w:rPr>
+        <w:t>AuthService</w:t>
+      </w:r>
+      <w:proofErr w:type="spellEnd"/>
+      <w:r>
+        <w:rPr>
+          <w:rFonts w:ascii="Times New Roman" w:hAnsi="Times New Roman"/>
+          <w:sz w:val="24"/>
+        </w:rPr>
+        <w:t xml:space="preserve">, </w:t>
+      </w:r>
+      <w:proofErr w:type="spellStart"/>
+      <w:r>
+        <w:rPr>
+          <w:rFonts w:ascii="Times New Roman" w:hAnsi="Times New Roman"/>
+          <w:sz w:val="24"/>
+        </w:rPr>
+        <w:t>MedicineService</w:t>
+      </w:r>
+      <w:proofErr w:type="spellEnd"/>
+      <w:r>
+        <w:rPr>
+          <w:rFonts w:ascii="Times New Roman" w:hAnsi="Times New Roman"/>
+          <w:sz w:val="24"/>
+        </w:rPr>
+        <w:t xml:space="preserve">, </w:t>
+      </w:r>
+      <w:proofErr w:type="spellStart"/>
+      <w:r>
+        <w:rPr>
+          <w:rFonts w:ascii="Times New Roman" w:hAnsi="Times New Roman"/>
+          <w:sz w:val="24"/>
+        </w:rPr>
+        <w:t>OrderService</w:t>
+      </w:r>
+      <w:proofErr w:type="spellEnd"/>
+      <w:r>
+        <w:rPr>
+          <w:rFonts w:ascii="Times New Roman" w:hAnsi="Times New Roman"/>
+          <w:sz w:val="24"/>
+        </w:rPr>
+        <w:t xml:space="preserve">, </w:t>
+      </w:r>
+      <w:proofErr w:type="spellStart"/>
+      <w:r>
+        <w:rPr>
+          <w:rFonts w:ascii="Times New Roman" w:hAnsi="Times New Roman"/>
+          <w:sz w:val="24"/>
+        </w:rPr>
+        <w:t>CustomerService</w:t>
+      </w:r>
+      <w:proofErr w:type="spellEnd"/>
+      <w:r>
+        <w:rPr>
+          <w:rFonts w:ascii="Times New Roman" w:hAnsi="Times New Roman"/>
+          <w:sz w:val="24"/>
+        </w:rPr>
+        <w:t xml:space="preserve">, </w:t>
+      </w:r>
+      <w:proofErr w:type="spellStart"/>
+      <w:r>
+        <w:rPr>
+          <w:rFonts w:ascii="Times New Roman" w:hAnsi="Times New Roman"/>
+          <w:sz w:val="24"/>
+        </w:rPr>
+        <w:t>DashboardService</w:t>
+      </w:r>
+      <w:proofErr w:type="spellEnd"/>
+      <w:r>
+        <w:rPr>
+          <w:rFonts w:ascii="Times New Roman" w:hAnsi="Times New Roman"/>
+          <w:sz w:val="24"/>
+        </w:rPr>
+        <w:t>) that coordinate validation and repository calls.</w:t>
       </w:r>
     </w:p>
     <w:p>
@@ -1510,7 +2293,119 @@
           <w:rFonts w:ascii="Times New Roman" w:hAnsi="Times New Roman"/>
           <w:sz w:val="24"/>
         </w:rPr>
-        <w:t>Data Access Layer (SmartMed.Data): DatabaseHelper wraps SqlConnection and parameterized commands. Repositories (AdminRepository, CustomerRepository, MedicineRepository, OrderRepository) implement CRUD and queries. Data models map to database rows.</w:t>
+        <w:t>Data Access Layer (</w:t>
+      </w:r>
+      <w:proofErr w:type="spellStart"/>
+      <w:r>
+        <w:rPr>
+          <w:rFonts w:ascii="Times New Roman" w:hAnsi="Times New Roman"/>
+          <w:sz w:val="24"/>
+        </w:rPr>
+        <w:t>SmartMed.Data</w:t>
+      </w:r>
+      <w:proofErr w:type="spellEnd"/>
+      <w:r>
+        <w:rPr>
+          <w:rFonts w:ascii="Times New Roman" w:hAnsi="Times New Roman"/>
+          <w:sz w:val="24"/>
+        </w:rPr>
+        <w:t xml:space="preserve">): </w:t>
+      </w:r>
+      <w:proofErr w:type="spellStart"/>
+      <w:r>
+        <w:rPr>
+          <w:rFonts w:ascii="Times New Roman" w:hAnsi="Times New Roman"/>
+          <w:sz w:val="24"/>
+        </w:rPr>
+        <w:t>DatabaseHelper</w:t>
+      </w:r>
+      <w:proofErr w:type="spellEnd"/>
+      <w:r>
+        <w:rPr>
+          <w:rFonts w:ascii="Times New Roman" w:hAnsi="Times New Roman"/>
+          <w:sz w:val="24"/>
+        </w:rPr>
+        <w:t xml:space="preserve"> wraps </w:t>
+      </w:r>
+      <w:proofErr w:type="spellStart"/>
+      <w:r>
+        <w:rPr>
+          <w:rFonts w:ascii="Times New Roman" w:hAnsi="Times New Roman"/>
+          <w:sz w:val="24"/>
+        </w:rPr>
+        <w:t>SqlConnection</w:t>
+      </w:r>
+      <w:proofErr w:type="spellEnd"/>
+      <w:r>
+        <w:rPr>
+          <w:rFonts w:ascii="Times New Roman" w:hAnsi="Times New Roman"/>
+          <w:sz w:val="24"/>
+        </w:rPr>
+        <w:t xml:space="preserve"> and parameterized commands. Repositories (</w:t>
+      </w:r>
+      <w:proofErr w:type="spellStart"/>
+      <w:r>
+        <w:rPr>
+          <w:rFonts w:ascii="Times New Roman" w:hAnsi="Times New Roman"/>
+          <w:sz w:val="24"/>
+        </w:rPr>
+        <w:t>AdminRepository</w:t>
+      </w:r>
+      <w:proofErr w:type="spellEnd"/>
+      <w:r>
+        <w:rPr>
+          <w:rFonts w:ascii="Times New Roman" w:hAnsi="Times New Roman"/>
+          <w:sz w:val="24"/>
+        </w:rPr>
+        <w:t xml:space="preserve">, </w:t>
+      </w:r>
+      <w:proofErr w:type="spellStart"/>
+      <w:r>
+        <w:rPr>
+          <w:rFonts w:ascii="Times New Roman" w:hAnsi="Times New Roman"/>
+          <w:sz w:val="24"/>
+        </w:rPr>
+        <w:t>CustomerRepository</w:t>
+      </w:r>
+      <w:proofErr w:type="spellEnd"/>
+      <w:r>
+        <w:rPr>
+          <w:rFonts w:ascii="Times New Roman" w:hAnsi="Times New Roman"/>
+          <w:sz w:val="24"/>
+        </w:rPr>
+        <w:t xml:space="preserve">, </w:t>
+      </w:r>
+      <w:proofErr w:type="spellStart"/>
+      <w:r>
+        <w:rPr>
+          <w:rFonts w:ascii="Times New Roman" w:hAnsi="Times New Roman"/>
+          <w:sz w:val="24"/>
+        </w:rPr>
+        <w:t>MedicineRepository</w:t>
+      </w:r>
+      <w:proofErr w:type="spellEnd"/>
+      <w:r>
+        <w:rPr>
+          <w:rFonts w:ascii="Times New Roman" w:hAnsi="Times New Roman"/>
+          <w:sz w:val="24"/>
+        </w:rPr>
+        <w:t xml:space="preserve">, </w:t>
+      </w:r>
+      <w:proofErr w:type="spellStart"/>
+      <w:r>
+        <w:rPr>
+          <w:rFonts w:ascii="Times New Roman" w:hAnsi="Times New Roman"/>
+          <w:sz w:val="24"/>
+        </w:rPr>
+        <w:t>OrderRepository</w:t>
+      </w:r>
+      <w:proofErr w:type="spellEnd"/>
+      <w:r>
+        <w:rPr>
+          <w:rFonts w:ascii="Times New Roman" w:hAnsi="Times New Roman"/>
+          <w:sz w:val="24"/>
+        </w:rPr>
+        <w:t>) implement CRUD and queries. Data models map to database rows.</w:t>
       </w:r>
     </w:p>
     <w:p>
@@ -1523,8 +2418,64 @@
           <w:rFonts w:ascii="Times New Roman" w:hAnsi="Times New Roman"/>
           <w:sz w:val="24"/>
         </w:rPr>
-        <w:lastRenderedPageBreak/>
-        <w:t>Database Layer: SQL Server database SmartMedDB with tables Admin, Customer, Medicine, Order, OrderItem, and Prescription. Foreign keys link orders to customers and order items to orders and medicines. Order.Status is constrained to Pending, Ready for Pickup, or Delivered.</w:t>
+        <w:t xml:space="preserve">Database Layer: SQL Server database </w:t>
+      </w:r>
+      <w:proofErr w:type="spellStart"/>
+      <w:r>
+        <w:rPr>
+          <w:rFonts w:ascii="Times New Roman" w:hAnsi="Times New Roman"/>
+          <w:sz w:val="24"/>
+        </w:rPr>
+        <w:t>SmartMedDB</w:t>
+      </w:r>
+      <w:proofErr w:type="spellEnd"/>
+      <w:r>
+        <w:rPr>
+          <w:rFonts w:ascii="Times New Roman" w:hAnsi="Times New Roman"/>
+          <w:sz w:val="24"/>
+        </w:rPr>
+        <w:t xml:space="preserve"> with tables Admin, Customer, Medicine, Order, </w:t>
+      </w:r>
+      <w:proofErr w:type="spellStart"/>
+      <w:r>
+        <w:rPr>
+          <w:rFonts w:ascii="Times New Roman" w:hAnsi="Times New Roman"/>
+          <w:sz w:val="24"/>
+        </w:rPr>
+        <w:t>OrderItem</w:t>
+      </w:r>
+      <w:proofErr w:type="spellEnd"/>
+      <w:r>
+        <w:rPr>
+          <w:rFonts w:ascii="Times New Roman" w:hAnsi="Times New Roman"/>
+          <w:sz w:val="24"/>
+        </w:rPr>
+        <w:t xml:space="preserve">, and Prescription. Foreign keys link orders to customers and order items to orders and medicines. </w:t>
+      </w:r>
+      <w:proofErr w:type="spellStart"/>
+      <w:r>
+        <w:rPr>
+          <w:rFonts w:ascii="Times New Roman" w:hAnsi="Times New Roman"/>
+          <w:sz w:val="24"/>
+        </w:rPr>
+        <w:t>Order</w:t>
+      </w:r>
+      <w:proofErr w:type="gramStart"/>
+      <w:r>
+        <w:rPr>
+          <w:rFonts w:ascii="Times New Roman" w:hAnsi="Times New Roman"/>
+          <w:sz w:val="24"/>
+        </w:rPr>
+        <w:t>.Status</w:t>
+      </w:r>
+      <w:proofErr w:type="spellEnd"/>
+      <w:proofErr w:type="gramEnd"/>
+      <w:r>
+        <w:rPr>
+          <w:rFonts w:ascii="Times New Roman" w:hAnsi="Times New Roman"/>
+          <w:sz w:val="24"/>
+        </w:rPr>
+        <w:t xml:space="preserve"> is constrained to Pending, Ready for Pickup, or Delivered.</w:t>
       </w:r>
     </w:p>
     <w:p>
@@ -1547,7 +2498,55 @@
           <w:rFonts w:ascii="Times New Roman" w:hAnsi="Times New Roman"/>
           <w:sz w:val="24"/>
         </w:rPr>
-        <w:t>The use case diagram (Diagrams/Usecase.drawio) identifies Admin actors (login, manage medicines, manage customers, manage orders, reports, dashboard) and Customer actors (register, login, search medicines, place orders, track orders, manage profile). Include relationships show that placing an order includes searching medicines and that order management includes status updates. The implemented forms map directly to these use cases.</w:t>
+        <w:t>The use case diagram (Diagrams/</w:t>
+      </w:r>
+      <w:proofErr w:type="spellStart"/>
+      <w:r>
+        <w:rPr>
+          <w:rFonts w:ascii="Times New Roman" w:hAnsi="Times New Roman"/>
+          <w:sz w:val="24"/>
+        </w:rPr>
+        <w:t>Usecase.drawio</w:t>
+      </w:r>
+      <w:proofErr w:type="spellEnd"/>
+      <w:r>
+        <w:rPr>
+          <w:rFonts w:ascii="Times New Roman" w:hAnsi="Times New Roman"/>
+          <w:sz w:val="24"/>
+        </w:rPr>
+        <w:t xml:space="preserve">) </w:t>
+      </w:r>
+      <w:proofErr w:type="gramStart"/>
+      <w:r>
+        <w:rPr>
+          <w:rFonts w:ascii="Times New Roman" w:hAnsi="Times New Roman"/>
+          <w:sz w:val="24"/>
+        </w:rPr>
+        <w:t>identifies</w:t>
+      </w:r>
+      <w:proofErr w:type="gramEnd"/>
+      <w:r>
+        <w:rPr>
+          <w:rFonts w:ascii="Times New Roman" w:hAnsi="Times New Roman"/>
+          <w:sz w:val="24"/>
+        </w:rPr>
+        <w:t xml:space="preserve"> Admin actors (login, manage medicines, manage customers, manage orders, reports, dashboard) and Customer actors (register, login, search medicines, place orders, track orders, manage profile). </w:t>
+      </w:r>
+      <w:proofErr w:type="gramStart"/>
+      <w:r>
+        <w:rPr>
+          <w:rFonts w:ascii="Times New Roman" w:hAnsi="Times New Roman"/>
+          <w:sz w:val="24"/>
+        </w:rPr>
+        <w:t>Include</w:t>
+      </w:r>
+      <w:proofErr w:type="gramEnd"/>
+      <w:r>
+        <w:rPr>
+          <w:rFonts w:ascii="Times New Roman" w:hAnsi="Times New Roman"/>
+          <w:sz w:val="24"/>
+        </w:rPr>
+        <w:t xml:space="preserve"> relationships show that placing an order includes searching medicines and that order management includes status updates. The implemented forms map directly to these use cases.</w:t>
       </w:r>
     </w:p>
     <w:p>
@@ -1570,7 +2569,199 @@
           <w:rFonts w:ascii="Times New Roman" w:hAnsi="Times New Roman"/>
           <w:sz w:val="24"/>
         </w:rPr>
-        <w:t>The ER diagram (Diagrams/ER.drawio) models six entities. Admin is independent. Customer places Orders (one-to-many). Order contains OrderItems (one-to-many). Medicine appears in OrderItems (many-to-many resolved via OrderItem). Customer uploads Prescriptions (one-to-many). Primary keys are identity integers. The SQL script Database/SmartMedDB.sql implements this schema with appropriate foreign keys and a CHECK constraint on order status.</w:t>
+        <w:t>The ER diagram (Diagrams/</w:t>
+      </w:r>
+      <w:proofErr w:type="spellStart"/>
+      <w:r>
+        <w:rPr>
+          <w:rFonts w:ascii="Times New Roman" w:hAnsi="Times New Roman"/>
+          <w:sz w:val="24"/>
+        </w:rPr>
+        <w:t>ER.drawio</w:t>
+      </w:r>
+      <w:proofErr w:type="spellEnd"/>
+      <w:r>
+        <w:rPr>
+          <w:rFonts w:ascii="Times New Roman" w:hAnsi="Times New Roman"/>
+          <w:sz w:val="24"/>
+        </w:rPr>
+        <w:t>) models six entities. Admin is independent. Customer places Orders (one-to-</w:t>
+      </w:r>
+      <w:proofErr w:type="gramStart"/>
+      <w:r>
+        <w:rPr>
+          <w:rFonts w:ascii="Times New Roman" w:hAnsi="Times New Roman"/>
+          <w:sz w:val="24"/>
+        </w:rPr>
+        <w:t>many</w:t>
+      </w:r>
+      <w:proofErr w:type="gramEnd"/>
+      <w:r>
+        <w:rPr>
+          <w:rFonts w:ascii="Times New Roman" w:hAnsi="Times New Roman"/>
+          <w:sz w:val="24"/>
+        </w:rPr>
+        <w:t xml:space="preserve">). Order </w:t>
+      </w:r>
+      <w:proofErr w:type="gramStart"/>
+      <w:r>
+        <w:rPr>
+          <w:rFonts w:ascii="Times New Roman" w:hAnsi="Times New Roman"/>
+          <w:sz w:val="24"/>
+        </w:rPr>
+        <w:t>contains</w:t>
+      </w:r>
+      <w:proofErr w:type="gramEnd"/>
+      <w:r>
+        <w:rPr>
+          <w:rFonts w:ascii="Times New Roman" w:hAnsi="Times New Roman"/>
+          <w:sz w:val="24"/>
+        </w:rPr>
+        <w:t xml:space="preserve"> </w:t>
+      </w:r>
+      <w:proofErr w:type="spellStart"/>
+      <w:r>
+        <w:rPr>
+          <w:rFonts w:ascii="Times New Roman" w:hAnsi="Times New Roman"/>
+          <w:sz w:val="24"/>
+        </w:rPr>
+        <w:t>OrderItems</w:t>
+      </w:r>
+      <w:proofErr w:type="spellEnd"/>
+      <w:r>
+        <w:rPr>
+          <w:rFonts w:ascii="Times New Roman" w:hAnsi="Times New Roman"/>
+          <w:sz w:val="24"/>
+        </w:rPr>
+        <w:t xml:space="preserve"> (one-to-</w:t>
+      </w:r>
+      <w:proofErr w:type="gramStart"/>
+      <w:r>
+        <w:rPr>
+          <w:rFonts w:ascii="Times New Roman" w:hAnsi="Times New Roman"/>
+          <w:sz w:val="24"/>
+        </w:rPr>
+        <w:t>many</w:t>
+      </w:r>
+      <w:proofErr w:type="gramEnd"/>
+      <w:r>
+        <w:rPr>
+          <w:rFonts w:ascii="Times New Roman" w:hAnsi="Times New Roman"/>
+          <w:sz w:val="24"/>
+        </w:rPr>
+        <w:t xml:space="preserve">). Medicine appears in </w:t>
+      </w:r>
+      <w:proofErr w:type="spellStart"/>
+      <w:r>
+        <w:rPr>
+          <w:rFonts w:ascii="Times New Roman" w:hAnsi="Times New Roman"/>
+          <w:sz w:val="24"/>
+        </w:rPr>
+        <w:t>OrderItems</w:t>
+      </w:r>
+      <w:proofErr w:type="spellEnd"/>
+      <w:r>
+        <w:rPr>
+          <w:rFonts w:ascii="Times New Roman" w:hAnsi="Times New Roman"/>
+          <w:sz w:val="24"/>
+        </w:rPr>
+        <w:t xml:space="preserve"> (</w:t>
+      </w:r>
+      <w:proofErr w:type="gramStart"/>
+      <w:r>
+        <w:rPr>
+          <w:rFonts w:ascii="Times New Roman" w:hAnsi="Times New Roman"/>
+          <w:sz w:val="24"/>
+        </w:rPr>
+        <w:t>many</w:t>
+      </w:r>
+      <w:proofErr w:type="gramEnd"/>
+      <w:r>
+        <w:rPr>
+          <w:rFonts w:ascii="Times New Roman" w:hAnsi="Times New Roman"/>
+          <w:sz w:val="24"/>
+        </w:rPr>
+        <w:t>-to-</w:t>
+      </w:r>
+      <w:proofErr w:type="gramStart"/>
+      <w:r>
+        <w:rPr>
+          <w:rFonts w:ascii="Times New Roman" w:hAnsi="Times New Roman"/>
+          <w:sz w:val="24"/>
+        </w:rPr>
+        <w:t>many</w:t>
+      </w:r>
+      <w:proofErr w:type="gramEnd"/>
+      <w:r>
+        <w:rPr>
+          <w:rFonts w:ascii="Times New Roman" w:hAnsi="Times New Roman"/>
+          <w:sz w:val="24"/>
+        </w:rPr>
+        <w:t xml:space="preserve"> resolved via </w:t>
+      </w:r>
+      <w:proofErr w:type="spellStart"/>
+      <w:r>
+        <w:rPr>
+          <w:rFonts w:ascii="Times New Roman" w:hAnsi="Times New Roman"/>
+          <w:sz w:val="24"/>
+        </w:rPr>
+        <w:t>OrderItem</w:t>
+      </w:r>
+      <w:proofErr w:type="spellEnd"/>
+      <w:r>
+        <w:rPr>
+          <w:rFonts w:ascii="Times New Roman" w:hAnsi="Times New Roman"/>
+          <w:sz w:val="24"/>
+        </w:rPr>
+        <w:t>). Customer uploads Prescriptions (one-to-</w:t>
+      </w:r>
+      <w:proofErr w:type="gramStart"/>
+      <w:r>
+        <w:rPr>
+          <w:rFonts w:ascii="Times New Roman" w:hAnsi="Times New Roman"/>
+          <w:sz w:val="24"/>
+        </w:rPr>
+        <w:t>many</w:t>
+      </w:r>
+      <w:proofErr w:type="gramEnd"/>
+      <w:r>
+        <w:rPr>
+          <w:rFonts w:ascii="Times New Roman" w:hAnsi="Times New Roman"/>
+          <w:sz w:val="24"/>
+        </w:rPr>
+        <w:t>). Primary keys are identity integers. The SQL script Database/</w:t>
+      </w:r>
+      <w:proofErr w:type="spellStart"/>
+      <w:r>
+        <w:rPr>
+          <w:rFonts w:ascii="Times New Roman" w:hAnsi="Times New Roman"/>
+          <w:sz w:val="24"/>
+        </w:rPr>
+        <w:t>SmartMedDB.sql</w:t>
+      </w:r>
+      <w:proofErr w:type="spellEnd"/>
+      <w:r>
+        <w:rPr>
+          <w:rFonts w:ascii="Times New Roman" w:hAnsi="Times New Roman"/>
+          <w:sz w:val="24"/>
+        </w:rPr>
+        <w:t xml:space="preserve"> implements this schema with </w:t>
+      </w:r>
+      <w:proofErr w:type="gramStart"/>
+      <w:r>
+        <w:rPr>
+          <w:rFonts w:ascii="Times New Roman" w:hAnsi="Times New Roman"/>
+          <w:sz w:val="24"/>
+        </w:rPr>
+        <w:t>appropriate foreign</w:t>
+      </w:r>
+      <w:proofErr w:type="gramEnd"/>
+      <w:r>
+        <w:rPr>
+          <w:rFonts w:ascii="Times New Roman" w:hAnsi="Times New Roman"/>
+          <w:sz w:val="24"/>
+        </w:rPr>
+        <w:t xml:space="preserve"> keys and a CHECK constraint on order status.</w:t>
       </w:r>
     </w:p>
     <w:p>
@@ -1593,7 +2784,119 @@
           <w:rFonts w:ascii="Times New Roman" w:hAnsi="Times New Roman"/>
           <w:sz w:val="24"/>
         </w:rPr>
-        <w:t>The class diagram (Diagrams/Class.drawio) shows Person as an abstract base with Name, Email, Phone, and Password. Customer and Admin inherit from Person. Customer adds CustomerID, Address, Register(), and Login(). Admin adds AdminID, Username, and Login(). Medicine, Order, OrderItem, and Prescription are separate entity classes. Business layer classes mirror this design; data layer uses flat DTO-style models for efficient ADO.NET mapping.</w:t>
+        <w:t>The class diagram (Diagrams/</w:t>
+      </w:r>
+      <w:proofErr w:type="spellStart"/>
+      <w:r>
+        <w:rPr>
+          <w:rFonts w:ascii="Times New Roman" w:hAnsi="Times New Roman"/>
+          <w:sz w:val="24"/>
+        </w:rPr>
+        <w:t>Class.drawio</w:t>
+      </w:r>
+      <w:proofErr w:type="spellEnd"/>
+      <w:r>
+        <w:rPr>
+          <w:rFonts w:ascii="Times New Roman" w:hAnsi="Times New Roman"/>
+          <w:sz w:val="24"/>
+        </w:rPr>
+        <w:t xml:space="preserve">) shows Person as an abstract base with Name, Email, Phone, and Password. Customer and Admin inherit from Person. Customer adds </w:t>
+      </w:r>
+      <w:proofErr w:type="spellStart"/>
+      <w:r>
+        <w:rPr>
+          <w:rFonts w:ascii="Times New Roman" w:hAnsi="Times New Roman"/>
+          <w:sz w:val="24"/>
+        </w:rPr>
+        <w:t>CustomerID</w:t>
+      </w:r>
+      <w:proofErr w:type="spellEnd"/>
+      <w:r>
+        <w:rPr>
+          <w:rFonts w:ascii="Times New Roman" w:hAnsi="Times New Roman"/>
+          <w:sz w:val="24"/>
+        </w:rPr>
+        <w:t xml:space="preserve">, Address, </w:t>
+      </w:r>
+      <w:proofErr w:type="gramStart"/>
+      <w:r>
+        <w:rPr>
+          <w:rFonts w:ascii="Times New Roman" w:hAnsi="Times New Roman"/>
+          <w:sz w:val="24"/>
+        </w:rPr>
+        <w:t>Register(</w:t>
+      </w:r>
+      <w:proofErr w:type="gramEnd"/>
+      <w:r>
+        <w:rPr>
+          <w:rFonts w:ascii="Times New Roman" w:hAnsi="Times New Roman"/>
+          <w:sz w:val="24"/>
+        </w:rPr>
+        <w:t xml:space="preserve">), and </w:t>
+      </w:r>
+      <w:proofErr w:type="gramStart"/>
+      <w:r>
+        <w:rPr>
+          <w:rFonts w:ascii="Times New Roman" w:hAnsi="Times New Roman"/>
+          <w:sz w:val="24"/>
+        </w:rPr>
+        <w:t>Login(</w:t>
+      </w:r>
+      <w:proofErr w:type="gramEnd"/>
+      <w:r>
+        <w:rPr>
+          <w:rFonts w:ascii="Times New Roman" w:hAnsi="Times New Roman"/>
+          <w:sz w:val="24"/>
+        </w:rPr>
+        <w:t xml:space="preserve">). Admin adds </w:t>
+      </w:r>
+      <w:proofErr w:type="spellStart"/>
+      <w:r>
+        <w:rPr>
+          <w:rFonts w:ascii="Times New Roman" w:hAnsi="Times New Roman"/>
+          <w:sz w:val="24"/>
+        </w:rPr>
+        <w:t>AdminID</w:t>
+      </w:r>
+      <w:proofErr w:type="spellEnd"/>
+      <w:r>
+        <w:rPr>
+          <w:rFonts w:ascii="Times New Roman" w:hAnsi="Times New Roman"/>
+          <w:sz w:val="24"/>
+        </w:rPr>
+        <w:t xml:space="preserve">, Username, and </w:t>
+      </w:r>
+      <w:proofErr w:type="gramStart"/>
+      <w:r>
+        <w:rPr>
+          <w:rFonts w:ascii="Times New Roman" w:hAnsi="Times New Roman"/>
+          <w:sz w:val="24"/>
+        </w:rPr>
+        <w:t>Login(</w:t>
+      </w:r>
+      <w:proofErr w:type="gramEnd"/>
+      <w:r>
+        <w:rPr>
+          <w:rFonts w:ascii="Times New Roman" w:hAnsi="Times New Roman"/>
+          <w:sz w:val="24"/>
+        </w:rPr>
+        <w:t xml:space="preserve">). Medicine, Order, </w:t>
+      </w:r>
+      <w:proofErr w:type="spellStart"/>
+      <w:r>
+        <w:rPr>
+          <w:rFonts w:ascii="Times New Roman" w:hAnsi="Times New Roman"/>
+          <w:sz w:val="24"/>
+        </w:rPr>
+        <w:t>OrderItem</w:t>
+      </w:r>
+      <w:proofErr w:type="spellEnd"/>
+      <w:r>
+        <w:rPr>
+          <w:rFonts w:ascii="Times New Roman" w:hAnsi="Times New Roman"/>
+          <w:sz w:val="24"/>
+        </w:rPr>
+        <w:t>, and Prescription are separate entity classes. Business layer classes mirror this design; data layer uses flat DTO-style models for efficient ADO.NET mapping.</w:t>
       </w:r>
     </w:p>
     <w:p>
@@ -1603,6 +2906,7 @@
         <w:jc w:val="both"/>
       </w:pPr>
       <w:r>
+        <w:lastRenderedPageBreak/>
         <w:t>Class Relationships</w:t>
       </w:r>
     </w:p>
@@ -1616,7 +2920,71 @@
           <w:rFonts w:ascii="Times New Roman" w:hAnsi="Times New Roman"/>
           <w:sz w:val="24"/>
         </w:rPr>
-        <w:t>Inheritance: Customer and Admin extend Person, enabling shared validation of email and password fields. Composition: Order aggregates OrderItem records; each OrderItem references a Medicine. Association: Order belongs to Customer; Prescription belongs to Customer. Services depend on repositories (dependency direction: Business → Data). UI forms depend on services only, not repositories, maintaining the vertical architecture shown in Diagrams/Architecture.drawio.</w:t>
+        <w:t xml:space="preserve">Inheritance: Customer and Admin extend Person, enabling shared validation of email and password fields. Composition: Order aggregates </w:t>
+      </w:r>
+      <w:proofErr w:type="spellStart"/>
+      <w:r>
+        <w:rPr>
+          <w:rFonts w:ascii="Times New Roman" w:hAnsi="Times New Roman"/>
+          <w:sz w:val="24"/>
+        </w:rPr>
+        <w:t>OrderItem</w:t>
+      </w:r>
+      <w:proofErr w:type="spellEnd"/>
+      <w:r>
+        <w:rPr>
+          <w:rFonts w:ascii="Times New Roman" w:hAnsi="Times New Roman"/>
+          <w:sz w:val="24"/>
+        </w:rPr>
+        <w:t xml:space="preserve"> records; each </w:t>
+      </w:r>
+      <w:proofErr w:type="spellStart"/>
+      <w:r>
+        <w:rPr>
+          <w:rFonts w:ascii="Times New Roman" w:hAnsi="Times New Roman"/>
+          <w:sz w:val="24"/>
+        </w:rPr>
+        <w:t>OrderItem</w:t>
+      </w:r>
+      <w:proofErr w:type="spellEnd"/>
+      <w:r>
+        <w:rPr>
+          <w:rFonts w:ascii="Times New Roman" w:hAnsi="Times New Roman"/>
+          <w:sz w:val="24"/>
+        </w:rPr>
+        <w:t xml:space="preserve"> references a Medicine. Association: Order belongs to Customer; Prescription belongs to Customer. Services depend on repositories (dependency direction: Business → Data). UI forms depend on services only, not repositories, </w:t>
+      </w:r>
+      <w:proofErr w:type="gramStart"/>
+      <w:r>
+        <w:rPr>
+          <w:rFonts w:ascii="Times New Roman" w:hAnsi="Times New Roman"/>
+          <w:sz w:val="24"/>
+        </w:rPr>
+        <w:t>maintaining</w:t>
+      </w:r>
+      <w:proofErr w:type="gramEnd"/>
+      <w:r>
+        <w:rPr>
+          <w:rFonts w:ascii="Times New Roman" w:hAnsi="Times New Roman"/>
+          <w:sz w:val="24"/>
+        </w:rPr>
+        <w:t xml:space="preserve"> the vertical architecture shown in Diagrams/</w:t>
+      </w:r>
+      <w:proofErr w:type="spellStart"/>
+      <w:r>
+        <w:rPr>
+          <w:rFonts w:ascii="Times New Roman" w:hAnsi="Times New Roman"/>
+          <w:sz w:val="24"/>
+        </w:rPr>
+        <w:t>Architecture.drawio</w:t>
+      </w:r>
+      <w:proofErr w:type="spellEnd"/>
+      <w:r>
+        <w:rPr>
+          <w:rFonts w:ascii="Times New Roman" w:hAnsi="Times New Roman"/>
+          <w:sz w:val="24"/>
+        </w:rPr>
+        <w:t>.</w:t>
       </w:r>
     </w:p>
     <w:p>
@@ -1626,7 +2994,6 @@
         <w:jc w:val="both"/>
       </w:pPr>
       <w:r>
-        <w:lastRenderedPageBreak/>
         <w:t>Source Code Attribution</w:t>
       </w:r>
     </w:p>
@@ -1640,7 +3007,75 @@
           <w:rFonts w:ascii="Times New Roman" w:hAnsi="Times New Roman"/>
           <w:sz w:val="24"/>
         </w:rPr>
-        <w:t>All source code in this submission was written for the SmartMed coursework. Standard Microsoft .NET Framework libraries (System.Windows.Forms, System.Data.SqlClient, System.Configuration) are used as documented. No third-party UI frameworks were used. Diagram source files are original draw.io diagrams created for this module. Any external references (Microsoft documentation for ADO.NET and WinForms) informed API usage but were not copied as code.</w:t>
+        <w:t xml:space="preserve">All source code in this submission was written for the </w:t>
+      </w:r>
+      <w:proofErr w:type="spellStart"/>
+      <w:r>
+        <w:rPr>
+          <w:rFonts w:ascii="Times New Roman" w:hAnsi="Times New Roman"/>
+          <w:sz w:val="24"/>
+        </w:rPr>
+        <w:t>SmartMed</w:t>
+      </w:r>
+      <w:proofErr w:type="spellEnd"/>
+      <w:r>
+        <w:rPr>
+          <w:rFonts w:ascii="Times New Roman" w:hAnsi="Times New Roman"/>
+          <w:sz w:val="24"/>
+        </w:rPr>
+        <w:t xml:space="preserve"> coursework. Standard Microsoft .NET Framework libraries (</w:t>
+      </w:r>
+      <w:proofErr w:type="spellStart"/>
+      <w:proofErr w:type="gramStart"/>
+      <w:r>
+        <w:rPr>
+          <w:rFonts w:ascii="Times New Roman" w:hAnsi="Times New Roman"/>
+          <w:sz w:val="24"/>
+        </w:rPr>
+        <w:t>System.Windows.Forms</w:t>
+      </w:r>
+      <w:proofErr w:type="spellEnd"/>
+      <w:proofErr w:type="gramEnd"/>
+      <w:r>
+        <w:rPr>
+          <w:rFonts w:ascii="Times New Roman" w:hAnsi="Times New Roman"/>
+          <w:sz w:val="24"/>
+        </w:rPr>
+        <w:t xml:space="preserve">, </w:t>
+      </w:r>
+      <w:proofErr w:type="spellStart"/>
+      <w:proofErr w:type="gramStart"/>
+      <w:r>
+        <w:rPr>
+          <w:rFonts w:ascii="Times New Roman" w:hAnsi="Times New Roman"/>
+          <w:sz w:val="24"/>
+        </w:rPr>
+        <w:t>System.Data.SqlClient</w:t>
+      </w:r>
+      <w:proofErr w:type="spellEnd"/>
+      <w:proofErr w:type="gramEnd"/>
+      <w:r>
+        <w:rPr>
+          <w:rFonts w:ascii="Times New Roman" w:hAnsi="Times New Roman"/>
+          <w:sz w:val="24"/>
+        </w:rPr>
+        <w:t xml:space="preserve">, </w:t>
+      </w:r>
+      <w:proofErr w:type="spellStart"/>
+      <w:r>
+        <w:rPr>
+          <w:rFonts w:ascii="Times New Roman" w:hAnsi="Times New Roman"/>
+          <w:sz w:val="24"/>
+        </w:rPr>
+        <w:t>System.Configuration</w:t>
+      </w:r>
+      <w:proofErr w:type="spellEnd"/>
+      <w:r>
+        <w:rPr>
+          <w:rFonts w:ascii="Times New Roman" w:hAnsi="Times New Roman"/>
+          <w:sz w:val="24"/>
+        </w:rPr>
+        <w:t>) are used as documented. No third-party UI frameworks were used. Diagram source files are original draw.io diagrams created for this module. Any external references (Microsoft documentation for ADO.NET and WinForms) informed API usage but were not copied as code.</w:t>
       </w:r>
     </w:p>
     <w:p>
@@ -1663,7 +3098,71 @@
           <w:rFonts w:ascii="Times New Roman" w:hAnsi="Times New Roman"/>
           <w:sz w:val="24"/>
         </w:rPr>
-        <w:t>Login: AuthService validates admin username and password against the Admin table via AdminRepository. Empty fields are rejected by ValidationHelper before database access.</w:t>
+        <w:t xml:space="preserve">Login: </w:t>
+      </w:r>
+      <w:proofErr w:type="spellStart"/>
+      <w:r>
+        <w:rPr>
+          <w:rFonts w:ascii="Times New Roman" w:hAnsi="Times New Roman"/>
+          <w:sz w:val="24"/>
+        </w:rPr>
+        <w:t>AuthService</w:t>
+      </w:r>
+      <w:proofErr w:type="spellEnd"/>
+      <w:r>
+        <w:rPr>
+          <w:rFonts w:ascii="Times New Roman" w:hAnsi="Times New Roman"/>
+          <w:sz w:val="24"/>
+        </w:rPr>
+        <w:t xml:space="preserve"> validates admin username and password against the </w:t>
+      </w:r>
+      <w:proofErr w:type="gramStart"/>
+      <w:r>
+        <w:rPr>
+          <w:rFonts w:ascii="Times New Roman" w:hAnsi="Times New Roman"/>
+          <w:sz w:val="24"/>
+        </w:rPr>
+        <w:t>Admin</w:t>
+      </w:r>
+      <w:proofErr w:type="gramEnd"/>
+      <w:r>
+        <w:rPr>
+          <w:rFonts w:ascii="Times New Roman" w:hAnsi="Times New Roman"/>
+          <w:sz w:val="24"/>
+        </w:rPr>
+        <w:t xml:space="preserve"> table via </w:t>
+      </w:r>
+      <w:proofErr w:type="spellStart"/>
+      <w:r>
+        <w:rPr>
+          <w:rFonts w:ascii="Times New Roman" w:hAnsi="Times New Roman"/>
+          <w:sz w:val="24"/>
+        </w:rPr>
+        <w:t>AdminRepository</w:t>
+      </w:r>
+      <w:proofErr w:type="spellEnd"/>
+      <w:r>
+        <w:rPr>
+          <w:rFonts w:ascii="Times New Roman" w:hAnsi="Times New Roman"/>
+          <w:sz w:val="24"/>
+        </w:rPr>
+        <w:t xml:space="preserve">. Empty fields are rejected by </w:t>
+      </w:r>
+      <w:proofErr w:type="spellStart"/>
+      <w:r>
+        <w:rPr>
+          <w:rFonts w:ascii="Times New Roman" w:hAnsi="Times New Roman"/>
+          <w:sz w:val="24"/>
+        </w:rPr>
+        <w:t>ValidationHelper</w:t>
+      </w:r>
+      <w:proofErr w:type="spellEnd"/>
+      <w:r>
+        <w:rPr>
+          <w:rFonts w:ascii="Times New Roman" w:hAnsi="Times New Roman"/>
+          <w:sz w:val="24"/>
+        </w:rPr>
+        <w:t xml:space="preserve"> before database access.</w:t>
       </w:r>
     </w:p>
     <w:p>
@@ -1676,7 +3175,39 @@
           <w:rFonts w:ascii="Times New Roman" w:hAnsi="Times New Roman"/>
           <w:sz w:val="24"/>
         </w:rPr>
-        <w:t>Manage Medicines: MedicineManagementForm provides add, update, delete, and list operations. Fields include name, category, dosage, price, stock quantity, supplier, expiry date, and prescription requirement. Numeric validation ensures price and stock are valid.</w:t>
+        <w:t xml:space="preserve">Manage Medicines: </w:t>
+      </w:r>
+      <w:proofErr w:type="spellStart"/>
+      <w:r>
+        <w:rPr>
+          <w:rFonts w:ascii="Times New Roman" w:hAnsi="Times New Roman"/>
+          <w:sz w:val="24"/>
+        </w:rPr>
+        <w:t>MedicineManagementForm</w:t>
+      </w:r>
+      <w:proofErr w:type="spellEnd"/>
+      <w:r>
+        <w:rPr>
+          <w:rFonts w:ascii="Times New Roman" w:hAnsi="Times New Roman"/>
+          <w:sz w:val="24"/>
+        </w:rPr>
+        <w:t xml:space="preserve"> provides add, update, </w:t>
+      </w:r>
+      <w:proofErr w:type="gramStart"/>
+      <w:r>
+        <w:rPr>
+          <w:rFonts w:ascii="Times New Roman" w:hAnsi="Times New Roman"/>
+          <w:sz w:val="24"/>
+        </w:rPr>
+        <w:t>delete</w:t>
+      </w:r>
+      <w:proofErr w:type="gramEnd"/>
+      <w:r>
+        <w:rPr>
+          <w:rFonts w:ascii="Times New Roman" w:hAnsi="Times New Roman"/>
+          <w:sz w:val="24"/>
+        </w:rPr>
+        <w:t>, and list operations. Fields include name, category, dosage, price, stock quantity, supplier, expiry date, and prescription requirement. Numeric validation ensures price and stock are valid.</w:t>
       </w:r>
     </w:p>
     <w:p>
@@ -1689,7 +3220,23 @@
           <w:rFonts w:ascii="Times New Roman" w:hAnsi="Times New Roman"/>
           <w:sz w:val="24"/>
         </w:rPr>
-        <w:t>Manage Customers: CustomerManagementForm lists registered customers and allows administrators to update contact details.</w:t>
+        <w:t xml:space="preserve">Manage Customers: </w:t>
+      </w:r>
+      <w:proofErr w:type="spellStart"/>
+      <w:r>
+        <w:rPr>
+          <w:rFonts w:ascii="Times New Roman" w:hAnsi="Times New Roman"/>
+          <w:sz w:val="24"/>
+        </w:rPr>
+        <w:t>CustomerManagementForm</w:t>
+      </w:r>
+      <w:proofErr w:type="spellEnd"/>
+      <w:r>
+        <w:rPr>
+          <w:rFonts w:ascii="Times New Roman" w:hAnsi="Times New Roman"/>
+          <w:sz w:val="24"/>
+        </w:rPr>
+        <w:t xml:space="preserve"> lists registered customers and allows administrators to update contact details.</w:t>
       </w:r>
     </w:p>
     <w:p>
@@ -1702,7 +3249,23 @@
           <w:rFonts w:ascii="Times New Roman" w:hAnsi="Times New Roman"/>
           <w:sz w:val="24"/>
         </w:rPr>
-        <w:t>Manage Orders: OrderManagementForm displays all orders with customer name, date, status, and total. Administrators can change status to Pending, Ready for Pickup, or Delivered.</w:t>
+        <w:t xml:space="preserve">Manage Orders: </w:t>
+      </w:r>
+      <w:proofErr w:type="spellStart"/>
+      <w:r>
+        <w:rPr>
+          <w:rFonts w:ascii="Times New Roman" w:hAnsi="Times New Roman"/>
+          <w:sz w:val="24"/>
+        </w:rPr>
+        <w:t>OrderManagementForm</w:t>
+      </w:r>
+      <w:proofErr w:type="spellEnd"/>
+      <w:r>
+        <w:rPr>
+          <w:rFonts w:ascii="Times New Roman" w:hAnsi="Times New Roman"/>
+          <w:sz w:val="24"/>
+        </w:rPr>
+        <w:t xml:space="preserve"> displays all orders with customer name, date, status, and total. Administrators can change status to Pending, Ready for Pickup, or Delivered.</w:t>
       </w:r>
     </w:p>
     <w:p>
@@ -1715,7 +3278,55 @@
           <w:rFonts w:ascii="Times New Roman" w:hAnsi="Times New Roman"/>
           <w:sz w:val="24"/>
         </w:rPr>
-        <w:t>Reports: ReportsForm shows sales totals, stock summary, and customer order history using queries from OrderRepository and MedicineRepository.</w:t>
+        <w:t xml:space="preserve">Reports: </w:t>
+      </w:r>
+      <w:proofErr w:type="spellStart"/>
+      <w:r>
+        <w:rPr>
+          <w:rFonts w:ascii="Times New Roman" w:hAnsi="Times New Roman"/>
+          <w:sz w:val="24"/>
+        </w:rPr>
+        <w:t>ReportsForm</w:t>
+      </w:r>
+      <w:proofErr w:type="spellEnd"/>
+      <w:r>
+        <w:rPr>
+          <w:rFonts w:ascii="Times New Roman" w:hAnsi="Times New Roman"/>
+          <w:sz w:val="24"/>
+        </w:rPr>
+        <w:t xml:space="preserve"> shows sales totals, stock summary, and customer order history using queries from </w:t>
+      </w:r>
+      <w:proofErr w:type="spellStart"/>
+      <w:r>
+        <w:rPr>
+          <w:rFonts w:ascii="Times New Roman" w:hAnsi="Times New Roman"/>
+          <w:sz w:val="24"/>
+        </w:rPr>
+        <w:t>OrderRepository</w:t>
+      </w:r>
+      <w:proofErr w:type="spellEnd"/>
+      <w:r>
+        <w:rPr>
+          <w:rFonts w:ascii="Times New Roman" w:hAnsi="Times New Roman"/>
+          <w:sz w:val="24"/>
+        </w:rPr>
+        <w:t xml:space="preserve"> and </w:t>
+      </w:r>
+      <w:proofErr w:type="spellStart"/>
+      <w:r>
+        <w:rPr>
+          <w:rFonts w:ascii="Times New Roman" w:hAnsi="Times New Roman"/>
+          <w:sz w:val="24"/>
+        </w:rPr>
+        <w:t>MedicineRepository</w:t>
+      </w:r>
+      <w:proofErr w:type="spellEnd"/>
+      <w:r>
+        <w:rPr>
+          <w:rFonts w:ascii="Times New Roman" w:hAnsi="Times New Roman"/>
+          <w:sz w:val="24"/>
+        </w:rPr>
+        <w:t>.</w:t>
       </w:r>
     </w:p>
     <w:p>
@@ -1728,7 +3339,40 @@
           <w:rFonts w:ascii="Times New Roman" w:hAnsi="Times New Roman"/>
           <w:sz w:val="24"/>
         </w:rPr>
-        <w:t>Dashboard: AdminOverviewForm displays aggregate metrics (total sales, medicines in stock, active orders) via DashboardService.</w:t>
+        <w:lastRenderedPageBreak/>
+        <w:t xml:space="preserve">Dashboard: </w:t>
+      </w:r>
+      <w:proofErr w:type="spellStart"/>
+      <w:r>
+        <w:rPr>
+          <w:rFonts w:ascii="Times New Roman" w:hAnsi="Times New Roman"/>
+          <w:sz w:val="24"/>
+        </w:rPr>
+        <w:t>AdminOverviewForm</w:t>
+      </w:r>
+      <w:proofErr w:type="spellEnd"/>
+      <w:r>
+        <w:rPr>
+          <w:rFonts w:ascii="Times New Roman" w:hAnsi="Times New Roman"/>
+          <w:sz w:val="24"/>
+        </w:rPr>
+        <w:t xml:space="preserve"> displays aggregate metrics (total sales, medicines in stock, active orders) via </w:t>
+      </w:r>
+      <w:proofErr w:type="spellStart"/>
+      <w:r>
+        <w:rPr>
+          <w:rFonts w:ascii="Times New Roman" w:hAnsi="Times New Roman"/>
+          <w:sz w:val="24"/>
+        </w:rPr>
+        <w:t>DashboardService</w:t>
+      </w:r>
+      <w:proofErr w:type="spellEnd"/>
+      <w:r>
+        <w:rPr>
+          <w:rFonts w:ascii="Times New Roman" w:hAnsi="Times New Roman"/>
+          <w:sz w:val="24"/>
+        </w:rPr>
+        <w:t>.</w:t>
       </w:r>
     </w:p>
     <w:p>
@@ -1751,7 +3395,55 @@
           <w:rFonts w:ascii="Times New Roman" w:hAnsi="Times New Roman"/>
           <w:sz w:val="24"/>
         </w:rPr>
-        <w:t>Registration: RegistrationForm collects full name, email, phone, address, password, and confirmation. ValidationHelper checks required fields, email format, and password match before CustomerRepository inserts a new row.</w:t>
+        <w:t xml:space="preserve">Registration: </w:t>
+      </w:r>
+      <w:proofErr w:type="spellStart"/>
+      <w:r>
+        <w:rPr>
+          <w:rFonts w:ascii="Times New Roman" w:hAnsi="Times New Roman"/>
+          <w:sz w:val="24"/>
+        </w:rPr>
+        <w:t>RegistrationForm</w:t>
+      </w:r>
+      <w:proofErr w:type="spellEnd"/>
+      <w:r>
+        <w:rPr>
+          <w:rFonts w:ascii="Times New Roman" w:hAnsi="Times New Roman"/>
+          <w:sz w:val="24"/>
+        </w:rPr>
+        <w:t xml:space="preserve"> collects full name, email, phone, address, password, and confirmation. </w:t>
+      </w:r>
+      <w:proofErr w:type="spellStart"/>
+      <w:r>
+        <w:rPr>
+          <w:rFonts w:ascii="Times New Roman" w:hAnsi="Times New Roman"/>
+          <w:sz w:val="24"/>
+        </w:rPr>
+        <w:t>ValidationHelper</w:t>
+      </w:r>
+      <w:proofErr w:type="spellEnd"/>
+      <w:r>
+        <w:rPr>
+          <w:rFonts w:ascii="Times New Roman" w:hAnsi="Times New Roman"/>
+          <w:sz w:val="24"/>
+        </w:rPr>
+        <w:t xml:space="preserve"> checks required fields, email format, and password match before </w:t>
+      </w:r>
+      <w:proofErr w:type="spellStart"/>
+      <w:r>
+        <w:rPr>
+          <w:rFonts w:ascii="Times New Roman" w:hAnsi="Times New Roman"/>
+          <w:sz w:val="24"/>
+        </w:rPr>
+        <w:t>CustomerRepository</w:t>
+      </w:r>
+      <w:proofErr w:type="spellEnd"/>
+      <w:r>
+        <w:rPr>
+          <w:rFonts w:ascii="Times New Roman" w:hAnsi="Times New Roman"/>
+          <w:sz w:val="24"/>
+        </w:rPr>
+        <w:t xml:space="preserve"> inserts a new row.</w:t>
       </w:r>
     </w:p>
     <w:p>
@@ -1764,7 +3456,6 @@
           <w:rFonts w:ascii="Times New Roman" w:hAnsi="Times New Roman"/>
           <w:sz w:val="24"/>
         </w:rPr>
-        <w:lastRenderedPageBreak/>
         <w:t>Login: Customers authenticate with email and password; Session stores the logged-in Customer object.</w:t>
       </w:r>
     </w:p>
@@ -1778,7 +3469,55 @@
           <w:rFonts w:ascii="Times New Roman" w:hAnsi="Times New Roman"/>
           <w:sz w:val="24"/>
         </w:rPr>
-        <w:t>Search Medicines: SearchMedicinesForm loads the catalogue and applies SearchHelper linear search by name, filter by category, and filter by price range. Results bind to a DataGridView.</w:t>
+        <w:t xml:space="preserve">Search Medicines: </w:t>
+      </w:r>
+      <w:proofErr w:type="spellStart"/>
+      <w:r>
+        <w:rPr>
+          <w:rFonts w:ascii="Times New Roman" w:hAnsi="Times New Roman"/>
+          <w:sz w:val="24"/>
+        </w:rPr>
+        <w:t>SearchMedicinesForm</w:t>
+      </w:r>
+      <w:proofErr w:type="spellEnd"/>
+      <w:r>
+        <w:rPr>
+          <w:rFonts w:ascii="Times New Roman" w:hAnsi="Times New Roman"/>
+          <w:sz w:val="24"/>
+        </w:rPr>
+        <w:t xml:space="preserve"> loads the catalogue and applies </w:t>
+      </w:r>
+      <w:proofErr w:type="spellStart"/>
+      <w:r>
+        <w:rPr>
+          <w:rFonts w:ascii="Times New Roman" w:hAnsi="Times New Roman"/>
+          <w:sz w:val="24"/>
+        </w:rPr>
+        <w:t>SearchHelper</w:t>
+      </w:r>
+      <w:proofErr w:type="spellEnd"/>
+      <w:r>
+        <w:rPr>
+          <w:rFonts w:ascii="Times New Roman" w:hAnsi="Times New Roman"/>
+          <w:sz w:val="24"/>
+        </w:rPr>
+        <w:t xml:space="preserve"> linear search by name, filter by category, and filter by price range. Results bind to a </w:t>
+      </w:r>
+      <w:proofErr w:type="spellStart"/>
+      <w:r>
+        <w:rPr>
+          <w:rFonts w:ascii="Times New Roman" w:hAnsi="Times New Roman"/>
+          <w:sz w:val="24"/>
+        </w:rPr>
+        <w:t>DataGridView</w:t>
+      </w:r>
+      <w:proofErr w:type="spellEnd"/>
+      <w:r>
+        <w:rPr>
+          <w:rFonts w:ascii="Times New Roman" w:hAnsi="Times New Roman"/>
+          <w:sz w:val="24"/>
+        </w:rPr>
+        <w:t>.</w:t>
       </w:r>
     </w:p>
     <w:p>
@@ -1791,7 +3530,71 @@
           <w:rFonts w:ascii="Times New Roman" w:hAnsi="Times New Roman"/>
           <w:sz w:val="24"/>
         </w:rPr>
-        <w:t>Place Orders: PlaceOrderForm lists available medicines, supports quantity entry, maintains an in-memory cart, and calls OrderService.PlaceOrder to insert Order and OrderItem rows and decrement stock.</w:t>
+        <w:t xml:space="preserve">Place Orders: </w:t>
+      </w:r>
+      <w:proofErr w:type="spellStart"/>
+      <w:r>
+        <w:rPr>
+          <w:rFonts w:ascii="Times New Roman" w:hAnsi="Times New Roman"/>
+          <w:sz w:val="24"/>
+        </w:rPr>
+        <w:t>PlaceOrderForm</w:t>
+      </w:r>
+      <w:proofErr w:type="spellEnd"/>
+      <w:r>
+        <w:rPr>
+          <w:rFonts w:ascii="Times New Roman" w:hAnsi="Times New Roman"/>
+          <w:sz w:val="24"/>
+        </w:rPr>
+        <w:t xml:space="preserve"> lists available medicines, supports quantity entry, </w:t>
+      </w:r>
+      <w:proofErr w:type="gramStart"/>
+      <w:r>
+        <w:rPr>
+          <w:rFonts w:ascii="Times New Roman" w:hAnsi="Times New Roman"/>
+          <w:sz w:val="24"/>
+        </w:rPr>
+        <w:t>maintains</w:t>
+      </w:r>
+      <w:proofErr w:type="gramEnd"/>
+      <w:r>
+        <w:rPr>
+          <w:rFonts w:ascii="Times New Roman" w:hAnsi="Times New Roman"/>
+          <w:sz w:val="24"/>
+        </w:rPr>
+        <w:t xml:space="preserve"> an in-memory cart, and calls </w:t>
+      </w:r>
+      <w:proofErr w:type="spellStart"/>
+      <w:r>
+        <w:rPr>
+          <w:rFonts w:ascii="Times New Roman" w:hAnsi="Times New Roman"/>
+          <w:sz w:val="24"/>
+        </w:rPr>
+        <w:t>OrderService.PlaceOrder</w:t>
+      </w:r>
+      <w:proofErr w:type="spellEnd"/>
+      <w:r>
+        <w:rPr>
+          <w:rFonts w:ascii="Times New Roman" w:hAnsi="Times New Roman"/>
+          <w:sz w:val="24"/>
+        </w:rPr>
+        <w:t xml:space="preserve"> to insert Order and </w:t>
+      </w:r>
+      <w:proofErr w:type="spellStart"/>
+      <w:r>
+        <w:rPr>
+          <w:rFonts w:ascii="Times New Roman" w:hAnsi="Times New Roman"/>
+          <w:sz w:val="24"/>
+        </w:rPr>
+        <w:t>OrderItem</w:t>
+      </w:r>
+      <w:proofErr w:type="spellEnd"/>
+      <w:r>
+        <w:rPr>
+          <w:rFonts w:ascii="Times New Roman" w:hAnsi="Times New Roman"/>
+          <w:sz w:val="24"/>
+        </w:rPr>
+        <w:t xml:space="preserve"> rows and decrement stock.</w:t>
       </w:r>
     </w:p>
     <w:p>
@@ -1804,7 +3607,23 @@
           <w:rFonts w:ascii="Times New Roman" w:hAnsi="Times New Roman"/>
           <w:sz w:val="24"/>
         </w:rPr>
-        <w:t>Track Orders: TrackOrdersForm lists the current customer's orders and statuses.</w:t>
+        <w:t xml:space="preserve">Track Orders: </w:t>
+      </w:r>
+      <w:proofErr w:type="spellStart"/>
+      <w:r>
+        <w:rPr>
+          <w:rFonts w:ascii="Times New Roman" w:hAnsi="Times New Roman"/>
+          <w:sz w:val="24"/>
+        </w:rPr>
+        <w:t>TrackOrdersForm</w:t>
+      </w:r>
+      <w:proofErr w:type="spellEnd"/>
+      <w:r>
+        <w:rPr>
+          <w:rFonts w:ascii="Times New Roman" w:hAnsi="Times New Roman"/>
+          <w:sz w:val="24"/>
+        </w:rPr>
+        <w:t xml:space="preserve"> lists the current customer's orders and statuses.</w:t>
       </w:r>
     </w:p>
     <w:p>
@@ -1817,7 +3636,23 @@
           <w:rFonts w:ascii="Times New Roman" w:hAnsi="Times New Roman"/>
           <w:sz w:val="24"/>
         </w:rPr>
-        <w:t>Profile Management: ProfileManagementForm allows customers to update their contact information.</w:t>
+        <w:t xml:space="preserve">Profile Management: </w:t>
+      </w:r>
+      <w:proofErr w:type="spellStart"/>
+      <w:r>
+        <w:rPr>
+          <w:rFonts w:ascii="Times New Roman" w:hAnsi="Times New Roman"/>
+          <w:sz w:val="24"/>
+        </w:rPr>
+        <w:t>ProfileManagementForm</w:t>
+      </w:r>
+      <w:proofErr w:type="spellEnd"/>
+      <w:r>
+        <w:rPr>
+          <w:rFonts w:ascii="Times New Roman" w:hAnsi="Times New Roman"/>
+          <w:sz w:val="24"/>
+        </w:rPr>
+        <w:t xml:space="preserve"> allows customers to update their contact information.</w:t>
       </w:r>
     </w:p>
     <w:p>
@@ -1840,7 +3675,23 @@
           <w:rFonts w:ascii="Times New Roman" w:hAnsi="Times New Roman"/>
           <w:sz w:val="24"/>
         </w:rPr>
-        <w:t>Optional features from the brief (discounts, expiry notifications, prescription upload UI, PDF/Excel export) were deferred to prioritise mandatory marking-scheme tasks. The Prescription table and Prescription business class exist in the schema and model layer for future extension. Core order and inventory workflows are fully functional without these extras.</w:t>
+        <w:t xml:space="preserve">Optional features from the brief (discounts, expiry notifications, prescription upload UI, PDF/Excel export) were deferred to </w:t>
+      </w:r>
+      <w:proofErr w:type="spellStart"/>
+      <w:r>
+        <w:rPr>
+          <w:rFonts w:ascii="Times New Roman" w:hAnsi="Times New Roman"/>
+          <w:sz w:val="24"/>
+        </w:rPr>
+        <w:t>prioritise</w:t>
+      </w:r>
+      <w:proofErr w:type="spellEnd"/>
+      <w:r>
+        <w:rPr>
+          <w:rFonts w:ascii="Times New Roman" w:hAnsi="Times New Roman"/>
+          <w:sz w:val="24"/>
+        </w:rPr>
+        <w:t xml:space="preserve"> mandatory marking-scheme tasks. The Prescription table and Prescription business class exist in the schema and model layer for future extension. Core order and inventory workflows are fully functional without these extras.</w:t>
       </w:r>
     </w:p>
     <w:p>
@@ -1863,7 +3714,25 @@
           <w:rFonts w:ascii="Times New Roman" w:hAnsi="Times New Roman"/>
           <w:sz w:val="24"/>
         </w:rPr>
-        <w:t>The application is implemented in C# targeting .NET Framework 4.8. The UI project uses Windows Forms (System.Windows.Forms). The solution uses SDK-style projects compatible with Visual Studio 2019+ and the dotnet CLI build. This meets the requirement for Visual Studio 2015 or higher compatibility at the language and framework level.</w:t>
+        <w:t>The application is implemented in C# targeting .NET Framework 4.8. The UI project uses Windows Forms (</w:t>
+      </w:r>
+      <w:proofErr w:type="spellStart"/>
+      <w:proofErr w:type="gramStart"/>
+      <w:r>
+        <w:rPr>
+          <w:rFonts w:ascii="Times New Roman" w:hAnsi="Times New Roman"/>
+          <w:sz w:val="24"/>
+        </w:rPr>
+        <w:t>System.Windows.Forms</w:t>
+      </w:r>
+      <w:proofErr w:type="spellEnd"/>
+      <w:proofErr w:type="gramEnd"/>
+      <w:r>
+        <w:rPr>
+          <w:rFonts w:ascii="Times New Roman" w:hAnsi="Times New Roman"/>
+          <w:sz w:val="24"/>
+        </w:rPr>
+        <w:t>). The solution uses SDK-style projects compatible with Visual Studio 2019+ and the dotnet CLI build. This meets the requirement for Visual Studio 2015 or higher compatibility at the language and framework level.</w:t>
       </w:r>
     </w:p>
     <w:p>
@@ -1873,6 +3742,7 @@
         <w:jc w:val="both"/>
       </w:pPr>
       <w:r>
+        <w:lastRenderedPageBreak/>
         <w:t>Data Storage</w:t>
       </w:r>
     </w:p>
@@ -1886,7 +3756,87 @@
           <w:rFonts w:ascii="Times New Roman" w:hAnsi="Times New Roman"/>
           <w:sz w:val="24"/>
         </w:rPr>
-        <w:t>Persistent data is stored in Microsoft SQL Server. The connection string named SmartMedDB in App.config is read by DatabaseHelper using ConfigurationManager. Parameterized SQL prevents injection. Transactions are used when placing orders to ensure order header, line items, and stock updates succeed or roll back together.</w:t>
+        <w:t xml:space="preserve">Persistent data is stored in Microsoft SQL Server. The connection string named </w:t>
+      </w:r>
+      <w:proofErr w:type="spellStart"/>
+      <w:r>
+        <w:rPr>
+          <w:rFonts w:ascii="Times New Roman" w:hAnsi="Times New Roman"/>
+          <w:sz w:val="24"/>
+        </w:rPr>
+        <w:t>SmartMedDB</w:t>
+      </w:r>
+      <w:proofErr w:type="spellEnd"/>
+      <w:r>
+        <w:rPr>
+          <w:rFonts w:ascii="Times New Roman" w:hAnsi="Times New Roman"/>
+          <w:sz w:val="24"/>
+        </w:rPr>
+        <w:t xml:space="preserve"> in </w:t>
+      </w:r>
+      <w:proofErr w:type="spellStart"/>
+      <w:r>
+        <w:rPr>
+          <w:rFonts w:ascii="Times New Roman" w:hAnsi="Times New Roman"/>
+          <w:sz w:val="24"/>
+        </w:rPr>
+        <w:t>App.config</w:t>
+      </w:r>
+      <w:proofErr w:type="spellEnd"/>
+      <w:r>
+        <w:rPr>
+          <w:rFonts w:ascii="Times New Roman" w:hAnsi="Times New Roman"/>
+          <w:sz w:val="24"/>
+        </w:rPr>
+        <w:t xml:space="preserve"> is read by </w:t>
+      </w:r>
+      <w:proofErr w:type="spellStart"/>
+      <w:r>
+        <w:rPr>
+          <w:rFonts w:ascii="Times New Roman" w:hAnsi="Times New Roman"/>
+          <w:sz w:val="24"/>
+        </w:rPr>
+        <w:t>DatabaseHelper</w:t>
+      </w:r>
+      <w:proofErr w:type="spellEnd"/>
+      <w:r>
+        <w:rPr>
+          <w:rFonts w:ascii="Times New Roman" w:hAnsi="Times New Roman"/>
+          <w:sz w:val="24"/>
+        </w:rPr>
+        <w:t xml:space="preserve"> using </w:t>
+      </w:r>
+      <w:proofErr w:type="spellStart"/>
+      <w:r>
+        <w:rPr>
+          <w:rFonts w:ascii="Times New Roman" w:hAnsi="Times New Roman"/>
+          <w:sz w:val="24"/>
+        </w:rPr>
+        <w:t>ConfigurationManager</w:t>
+      </w:r>
+      <w:proofErr w:type="spellEnd"/>
+      <w:r>
+        <w:rPr>
+          <w:rFonts w:ascii="Times New Roman" w:hAnsi="Times New Roman"/>
+          <w:sz w:val="24"/>
+        </w:rPr>
+        <w:t xml:space="preserve">. Parameterized SQL prevents injection. Transactions are used when placing orders to ensure </w:t>
+      </w:r>
+      <w:proofErr w:type="gramStart"/>
+      <w:r>
+        <w:rPr>
+          <w:rFonts w:ascii="Times New Roman" w:hAnsi="Times New Roman"/>
+          <w:sz w:val="24"/>
+        </w:rPr>
+        <w:t>order</w:t>
+      </w:r>
+      <w:proofErr w:type="gramEnd"/>
+      <w:r>
+        <w:rPr>
+          <w:rFonts w:ascii="Times New Roman" w:hAnsi="Times New Roman"/>
+          <w:sz w:val="24"/>
+        </w:rPr>
+        <w:t xml:space="preserve"> header, line items, and stock updates succeed or roll back together.</w:t>
       </w:r>
     </w:p>
     <w:p>
@@ -1896,7 +3846,6 @@
         <w:jc w:val="both"/>
       </w:pPr>
       <w:r>
-        <w:lastRenderedPageBreak/>
         <w:t>Software Design</w:t>
       </w:r>
     </w:p>
@@ -1910,7 +3859,23 @@
           <w:rFonts w:ascii="Times New Roman" w:hAnsi="Times New Roman"/>
           <w:sz w:val="24"/>
         </w:rPr>
-        <w:t>Object-oriented design uses inheritance (Person hierarchy), encapsulation (private repository calls inside services), and separation of layers. Each form handles only UI events; business rules live in services and helpers. Repositories isolate SQL syntax from the rest of the application, simplifying maintenance and testing.</w:t>
+        <w:t xml:space="preserve">Object-oriented design uses inheritance (Person hierarchy), encapsulation (private repository calls inside services), and separation of layers. Each form </w:t>
+      </w:r>
+      <w:proofErr w:type="gramStart"/>
+      <w:r>
+        <w:rPr>
+          <w:rFonts w:ascii="Times New Roman" w:hAnsi="Times New Roman"/>
+          <w:sz w:val="24"/>
+        </w:rPr>
+        <w:t>handles</w:t>
+      </w:r>
+      <w:proofErr w:type="gramEnd"/>
+      <w:r>
+        <w:rPr>
+          <w:rFonts w:ascii="Times New Roman" w:hAnsi="Times New Roman"/>
+          <w:sz w:val="24"/>
+        </w:rPr>
+        <w:t xml:space="preserve"> only UI events; business rules live in services and helpers. Repositories isolate SQL syntax from the rest of the application, simplifying maintenance and testing.</w:t>
       </w:r>
     </w:p>
     <w:p>
@@ -1933,7 +3898,55 @@
           <w:rFonts w:ascii="Times New Roman" w:hAnsi="Times New Roman"/>
           <w:sz w:val="24"/>
         </w:rPr>
-        <w:t>Forms are built programmatically in code for portability (no designer files required). A consistent colour scheme uses blue tones matching project diagrams. Role-based navigation prevents customers from accessing admin forms. MessageBox displays validation errors and database exceptions in user-friendly language.</w:t>
+        <w:t xml:space="preserve">Forms are built programmatically in code for portability (no designer files </w:t>
+      </w:r>
+      <w:proofErr w:type="gramStart"/>
+      <w:r>
+        <w:rPr>
+          <w:rFonts w:ascii="Times New Roman" w:hAnsi="Times New Roman"/>
+          <w:sz w:val="24"/>
+        </w:rPr>
+        <w:t>required</w:t>
+      </w:r>
+      <w:proofErr w:type="gramEnd"/>
+      <w:r>
+        <w:rPr>
+          <w:rFonts w:ascii="Times New Roman" w:hAnsi="Times New Roman"/>
+          <w:sz w:val="24"/>
+        </w:rPr>
+        <w:t xml:space="preserve">). A consistent </w:t>
+      </w:r>
+      <w:proofErr w:type="spellStart"/>
+      <w:r>
+        <w:rPr>
+          <w:rFonts w:ascii="Times New Roman" w:hAnsi="Times New Roman"/>
+          <w:sz w:val="24"/>
+        </w:rPr>
+        <w:t>colour</w:t>
+      </w:r>
+      <w:proofErr w:type="spellEnd"/>
+      <w:r>
+        <w:rPr>
+          <w:rFonts w:ascii="Times New Roman" w:hAnsi="Times New Roman"/>
+          <w:sz w:val="24"/>
+        </w:rPr>
+        <w:t xml:space="preserve"> scheme uses blue tones matching project diagrams. Role-based navigation prevents customers from accessing admin forms. </w:t>
+      </w:r>
+      <w:proofErr w:type="spellStart"/>
+      <w:r>
+        <w:rPr>
+          <w:rFonts w:ascii="Times New Roman" w:hAnsi="Times New Roman"/>
+          <w:sz w:val="24"/>
+        </w:rPr>
+        <w:t>MessageBox</w:t>
+      </w:r>
+      <w:proofErr w:type="spellEnd"/>
+      <w:r>
+        <w:rPr>
+          <w:rFonts w:ascii="Times New Roman" w:hAnsi="Times New Roman"/>
+          <w:sz w:val="24"/>
+        </w:rPr>
+        <w:t xml:space="preserve"> displays validation errors and database exceptions in user-friendly language.</w:t>
       </w:r>
     </w:p>
     <w:p>
@@ -1951,12 +3964,133 @@
         <w:spacing w:line="360" w:lineRule="auto"/>
         <w:jc w:val="both"/>
       </w:pPr>
-      <w:r>
-        <w:rPr>
-          <w:rFonts w:ascii="Times New Roman" w:hAnsi="Times New Roman"/>
-          <w:sz w:val="24"/>
-        </w:rPr>
-        <w:t>ValidationHelper provides IsNullOrEmpty, IsValidEmail, IsPositiveDecimal, and IsPositiveInteger checks used across login, registration, and medicine forms. Service and repository methods wrap database operations in try/catch blocks; SQLException messages are surfaced via MessageBox on the UI thread. Order placement validates stock availability before committing.</w:t>
+      <w:proofErr w:type="spellStart"/>
+      <w:r>
+        <w:rPr>
+          <w:rFonts w:ascii="Times New Roman" w:hAnsi="Times New Roman"/>
+          <w:sz w:val="24"/>
+        </w:rPr>
+        <w:t>ValidationHelper</w:t>
+      </w:r>
+      <w:proofErr w:type="spellEnd"/>
+      <w:r>
+        <w:rPr>
+          <w:rFonts w:ascii="Times New Roman" w:hAnsi="Times New Roman"/>
+          <w:sz w:val="24"/>
+        </w:rPr>
+        <w:t xml:space="preserve"> provides </w:t>
+      </w:r>
+      <w:proofErr w:type="spellStart"/>
+      <w:r>
+        <w:rPr>
+          <w:rFonts w:ascii="Times New Roman" w:hAnsi="Times New Roman"/>
+          <w:sz w:val="24"/>
+        </w:rPr>
+        <w:t>IsNullOrEmpty</w:t>
+      </w:r>
+      <w:proofErr w:type="spellEnd"/>
+      <w:r>
+        <w:rPr>
+          <w:rFonts w:ascii="Times New Roman" w:hAnsi="Times New Roman"/>
+          <w:sz w:val="24"/>
+        </w:rPr>
+        <w:t xml:space="preserve">, </w:t>
+      </w:r>
+      <w:proofErr w:type="spellStart"/>
+      <w:r>
+        <w:rPr>
+          <w:rFonts w:ascii="Times New Roman" w:hAnsi="Times New Roman"/>
+          <w:sz w:val="24"/>
+        </w:rPr>
+        <w:t>IsValidEmail</w:t>
+      </w:r>
+      <w:proofErr w:type="spellEnd"/>
+      <w:r>
+        <w:rPr>
+          <w:rFonts w:ascii="Times New Roman" w:hAnsi="Times New Roman"/>
+          <w:sz w:val="24"/>
+        </w:rPr>
+        <w:t xml:space="preserve">, </w:t>
+      </w:r>
+      <w:proofErr w:type="spellStart"/>
+      <w:r>
+        <w:rPr>
+          <w:rFonts w:ascii="Times New Roman" w:hAnsi="Times New Roman"/>
+          <w:sz w:val="24"/>
+        </w:rPr>
+        <w:t>IsPositiveDecimal</w:t>
+      </w:r>
+      <w:proofErr w:type="spellEnd"/>
+      <w:r>
+        <w:rPr>
+          <w:rFonts w:ascii="Times New Roman" w:hAnsi="Times New Roman"/>
+          <w:sz w:val="24"/>
+        </w:rPr>
+        <w:t xml:space="preserve">, and </w:t>
+      </w:r>
+      <w:proofErr w:type="spellStart"/>
+      <w:r>
+        <w:rPr>
+          <w:rFonts w:ascii="Times New Roman" w:hAnsi="Times New Roman"/>
+          <w:sz w:val="24"/>
+        </w:rPr>
+        <w:t>IsPositiveInteger</w:t>
+      </w:r>
+      <w:proofErr w:type="spellEnd"/>
+      <w:r>
+        <w:rPr>
+          <w:rFonts w:ascii="Times New Roman" w:hAnsi="Times New Roman"/>
+          <w:sz w:val="24"/>
+        </w:rPr>
+        <w:t xml:space="preserve"> checks used across login, registration, and medicine forms. Service and repository methods wrap database operations in try/catch blocks; </w:t>
+      </w:r>
+      <w:proofErr w:type="spellStart"/>
+      <w:r>
+        <w:rPr>
+          <w:rFonts w:ascii="Times New Roman" w:hAnsi="Times New Roman"/>
+          <w:sz w:val="24"/>
+        </w:rPr>
+        <w:t>SQLException</w:t>
+      </w:r>
+      <w:proofErr w:type="spellEnd"/>
+      <w:r>
+        <w:rPr>
+          <w:rFonts w:ascii="Times New Roman" w:hAnsi="Times New Roman"/>
+          <w:sz w:val="24"/>
+        </w:rPr>
+        <w:t xml:space="preserve"> messages are surfaced via </w:t>
+      </w:r>
+      <w:proofErr w:type="spellStart"/>
+      <w:r>
+        <w:rPr>
+          <w:rFonts w:ascii="Times New Roman" w:hAnsi="Times New Roman"/>
+          <w:sz w:val="24"/>
+        </w:rPr>
+        <w:t>MessageBox</w:t>
+      </w:r>
+      <w:proofErr w:type="spellEnd"/>
+      <w:r>
+        <w:rPr>
+          <w:rFonts w:ascii="Times New Roman" w:hAnsi="Times New Roman"/>
+          <w:sz w:val="24"/>
+        </w:rPr>
+        <w:t xml:space="preserve"> on the UI thread. Order placement </w:t>
+      </w:r>
+      <w:proofErr w:type="gramStart"/>
+      <w:r>
+        <w:rPr>
+          <w:rFonts w:ascii="Times New Roman" w:hAnsi="Times New Roman"/>
+          <w:sz w:val="24"/>
+        </w:rPr>
+        <w:t>validates</w:t>
+      </w:r>
+      <w:proofErr w:type="gramEnd"/>
+      <w:r>
+        <w:rPr>
+          <w:rFonts w:ascii="Times New Roman" w:hAnsi="Times New Roman"/>
+          <w:sz w:val="24"/>
+        </w:rPr>
+        <w:t xml:space="preserve"> stock availability before committing.</w:t>
       </w:r>
     </w:p>
     <w:p>
@@ -1979,7 +4113,57 @@
           <w:rFonts w:ascii="Times New Roman" w:hAnsi="Times New Roman"/>
           <w:sz w:val="24"/>
         </w:rPr>
-        <w:t>Person (SmartMed.Business.Models.Person) is the base class with properties: Name, Email, Phone, Password. It represents shared attributes for human users. Derived classes add role-specific identifiers and behaviour.</w:t>
+        <w:t>Person (</w:t>
+      </w:r>
+      <w:proofErr w:type="spellStart"/>
+      <w:proofErr w:type="gramStart"/>
+      <w:r>
+        <w:rPr>
+          <w:rFonts w:ascii="Times New Roman" w:hAnsi="Times New Roman"/>
+          <w:sz w:val="24"/>
+        </w:rPr>
+        <w:t>SmartMed.Business.Models.Person</w:t>
+      </w:r>
+      <w:proofErr w:type="spellEnd"/>
+      <w:proofErr w:type="gramEnd"/>
+      <w:r>
+        <w:rPr>
+          <w:rFonts w:ascii="Times New Roman" w:hAnsi="Times New Roman"/>
+          <w:sz w:val="24"/>
+        </w:rPr>
+        <w:t xml:space="preserve">) is the base class with properties: Name, Email, Phone, Password. It </w:t>
+      </w:r>
+      <w:proofErr w:type="gramStart"/>
+      <w:r>
+        <w:rPr>
+          <w:rFonts w:ascii="Times New Roman" w:hAnsi="Times New Roman"/>
+          <w:sz w:val="24"/>
+        </w:rPr>
+        <w:t>represents</w:t>
+      </w:r>
+      <w:proofErr w:type="gramEnd"/>
+      <w:r>
+        <w:rPr>
+          <w:rFonts w:ascii="Times New Roman" w:hAnsi="Times New Roman"/>
+          <w:sz w:val="24"/>
+        </w:rPr>
+        <w:t xml:space="preserve"> shared attributes for human users. Derived classes add role-specific identifiers and </w:t>
+      </w:r>
+      <w:proofErr w:type="spellStart"/>
+      <w:r>
+        <w:rPr>
+          <w:rFonts w:ascii="Times New Roman" w:hAnsi="Times New Roman"/>
+          <w:sz w:val="24"/>
+        </w:rPr>
+        <w:t>behaviour</w:t>
+      </w:r>
+      <w:proofErr w:type="spellEnd"/>
+      <w:r>
+        <w:rPr>
+          <w:rFonts w:ascii="Times New Roman" w:hAnsi="Times New Roman"/>
+          <w:sz w:val="24"/>
+        </w:rPr>
+        <w:t>.</w:t>
       </w:r>
     </w:p>
     <w:p>
@@ -1989,6 +4173,7 @@
         <w:jc w:val="both"/>
       </w:pPr>
       <w:r>
+        <w:lastRenderedPageBreak/>
         <w:t>Customer Class</w:t>
       </w:r>
     </w:p>
@@ -2002,7 +4187,87 @@
           <w:rFonts w:ascii="Times New Roman" w:hAnsi="Times New Roman"/>
           <w:sz w:val="24"/>
         </w:rPr>
-        <w:t>Customer extends Person with CustomerID (int) and Address (string). Methods Register() and Login() are documented in the class diagram; the implemented workflow delegates to AuthService and CustomerRepository while Session holds the authenticated instance after login.</w:t>
+        <w:t xml:space="preserve">Customer extends Person with </w:t>
+      </w:r>
+      <w:proofErr w:type="spellStart"/>
+      <w:r>
+        <w:rPr>
+          <w:rFonts w:ascii="Times New Roman" w:hAnsi="Times New Roman"/>
+          <w:sz w:val="24"/>
+        </w:rPr>
+        <w:t>CustomerID</w:t>
+      </w:r>
+      <w:proofErr w:type="spellEnd"/>
+      <w:r>
+        <w:rPr>
+          <w:rFonts w:ascii="Times New Roman" w:hAnsi="Times New Roman"/>
+          <w:sz w:val="24"/>
+        </w:rPr>
+        <w:t xml:space="preserve"> (int) and Address (string). Methods </w:t>
+      </w:r>
+      <w:proofErr w:type="gramStart"/>
+      <w:r>
+        <w:rPr>
+          <w:rFonts w:ascii="Times New Roman" w:hAnsi="Times New Roman"/>
+          <w:sz w:val="24"/>
+        </w:rPr>
+        <w:t>Register(</w:t>
+      </w:r>
+      <w:proofErr w:type="gramEnd"/>
+      <w:r>
+        <w:rPr>
+          <w:rFonts w:ascii="Times New Roman" w:hAnsi="Times New Roman"/>
+          <w:sz w:val="24"/>
+        </w:rPr>
+        <w:t xml:space="preserve">) and </w:t>
+      </w:r>
+      <w:proofErr w:type="gramStart"/>
+      <w:r>
+        <w:rPr>
+          <w:rFonts w:ascii="Times New Roman" w:hAnsi="Times New Roman"/>
+          <w:sz w:val="24"/>
+        </w:rPr>
+        <w:t>Login(</w:t>
+      </w:r>
+      <w:proofErr w:type="gramEnd"/>
+      <w:r>
+        <w:rPr>
+          <w:rFonts w:ascii="Times New Roman" w:hAnsi="Times New Roman"/>
+          <w:sz w:val="24"/>
+        </w:rPr>
+        <w:t xml:space="preserve">) are documented in the class diagram; the implemented workflow delegates to </w:t>
+      </w:r>
+      <w:proofErr w:type="spellStart"/>
+      <w:r>
+        <w:rPr>
+          <w:rFonts w:ascii="Times New Roman" w:hAnsi="Times New Roman"/>
+          <w:sz w:val="24"/>
+        </w:rPr>
+        <w:t>AuthService</w:t>
+      </w:r>
+      <w:proofErr w:type="spellEnd"/>
+      <w:r>
+        <w:rPr>
+          <w:rFonts w:ascii="Times New Roman" w:hAnsi="Times New Roman"/>
+          <w:sz w:val="24"/>
+        </w:rPr>
+        <w:t xml:space="preserve"> and </w:t>
+      </w:r>
+      <w:proofErr w:type="spellStart"/>
+      <w:r>
+        <w:rPr>
+          <w:rFonts w:ascii="Times New Roman" w:hAnsi="Times New Roman"/>
+          <w:sz w:val="24"/>
+        </w:rPr>
+        <w:t>CustomerRepository</w:t>
+      </w:r>
+      <w:proofErr w:type="spellEnd"/>
+      <w:r>
+        <w:rPr>
+          <w:rFonts w:ascii="Times New Roman" w:hAnsi="Times New Roman"/>
+          <w:sz w:val="24"/>
+        </w:rPr>
+        <w:t xml:space="preserve"> while Session holds the authenticated instance after login.</w:t>
       </w:r>
     </w:p>
     <w:p>
@@ -2025,7 +4290,71 @@
           <w:rFonts w:ascii="Times New Roman" w:hAnsi="Times New Roman"/>
           <w:sz w:val="24"/>
         </w:rPr>
-        <w:t>Admin extends Person with AdminID (int) and Username (string). Admin login uses username rather than email. AuthService.LoginAdmin queries AdminRepository and populates Session.CurrentAdmin on success.</w:t>
+        <w:t xml:space="preserve">Admin extends Person with </w:t>
+      </w:r>
+      <w:proofErr w:type="spellStart"/>
+      <w:r>
+        <w:rPr>
+          <w:rFonts w:ascii="Times New Roman" w:hAnsi="Times New Roman"/>
+          <w:sz w:val="24"/>
+        </w:rPr>
+        <w:t>AdminID</w:t>
+      </w:r>
+      <w:proofErr w:type="spellEnd"/>
+      <w:r>
+        <w:rPr>
+          <w:rFonts w:ascii="Times New Roman" w:hAnsi="Times New Roman"/>
+          <w:sz w:val="24"/>
+        </w:rPr>
+        <w:t xml:space="preserve"> (int) and Username (string). Admin login uses username rather than email. </w:t>
+      </w:r>
+      <w:proofErr w:type="spellStart"/>
+      <w:r>
+        <w:rPr>
+          <w:rFonts w:ascii="Times New Roman" w:hAnsi="Times New Roman"/>
+          <w:sz w:val="24"/>
+        </w:rPr>
+        <w:t>AuthService.LoginAdmin</w:t>
+      </w:r>
+      <w:proofErr w:type="spellEnd"/>
+      <w:r>
+        <w:rPr>
+          <w:rFonts w:ascii="Times New Roman" w:hAnsi="Times New Roman"/>
+          <w:sz w:val="24"/>
+        </w:rPr>
+        <w:t xml:space="preserve"> queries </w:t>
+      </w:r>
+      <w:proofErr w:type="spellStart"/>
+      <w:r>
+        <w:rPr>
+          <w:rFonts w:ascii="Times New Roman" w:hAnsi="Times New Roman"/>
+          <w:sz w:val="24"/>
+        </w:rPr>
+        <w:t>AdminRepository</w:t>
+      </w:r>
+      <w:proofErr w:type="spellEnd"/>
+      <w:r>
+        <w:rPr>
+          <w:rFonts w:ascii="Times New Roman" w:hAnsi="Times New Roman"/>
+          <w:sz w:val="24"/>
+        </w:rPr>
+        <w:t xml:space="preserve"> and populates </w:t>
+      </w:r>
+      <w:proofErr w:type="spellStart"/>
+      <w:r>
+        <w:rPr>
+          <w:rFonts w:ascii="Times New Roman" w:hAnsi="Times New Roman"/>
+          <w:sz w:val="24"/>
+        </w:rPr>
+        <w:t>Session.CurrentAdmin</w:t>
+      </w:r>
+      <w:proofErr w:type="spellEnd"/>
+      <w:r>
+        <w:rPr>
+          <w:rFonts w:ascii="Times New Roman" w:hAnsi="Times New Roman"/>
+          <w:sz w:val="24"/>
+        </w:rPr>
+        <w:t xml:space="preserve"> on success.</w:t>
       </w:r>
     </w:p>
     <w:p>
@@ -2035,7 +4364,6 @@
         <w:jc w:val="both"/>
       </w:pPr>
       <w:r>
-        <w:lastRenderedPageBreak/>
         <w:t>Medicine Class</w:t>
       </w:r>
     </w:p>
@@ -2049,7 +4377,121 @@
           <w:rFonts w:ascii="Times New Roman" w:hAnsi="Times New Roman"/>
           <w:sz w:val="24"/>
         </w:rPr>
-        <w:t>Medicine encapsulates MedicineID, MedicineName, Category, Dosage, Price, StockQuantity, Supplier, ExpiryDate, and RequiresPrescription. MedicineService wraps MedicineRepository for CRUD used by admin and search features.</w:t>
+        <w:t xml:space="preserve">Medicine encapsulates </w:t>
+      </w:r>
+      <w:proofErr w:type="spellStart"/>
+      <w:r>
+        <w:rPr>
+          <w:rFonts w:ascii="Times New Roman" w:hAnsi="Times New Roman"/>
+          <w:sz w:val="24"/>
+        </w:rPr>
+        <w:t>MedicineID</w:t>
+      </w:r>
+      <w:proofErr w:type="spellEnd"/>
+      <w:r>
+        <w:rPr>
+          <w:rFonts w:ascii="Times New Roman" w:hAnsi="Times New Roman"/>
+          <w:sz w:val="24"/>
+        </w:rPr>
+        <w:t xml:space="preserve">, </w:t>
+      </w:r>
+      <w:proofErr w:type="spellStart"/>
+      <w:r>
+        <w:rPr>
+          <w:rFonts w:ascii="Times New Roman" w:hAnsi="Times New Roman"/>
+          <w:sz w:val="24"/>
+        </w:rPr>
+        <w:t>MedicineName</w:t>
+      </w:r>
+      <w:proofErr w:type="spellEnd"/>
+      <w:r>
+        <w:rPr>
+          <w:rFonts w:ascii="Times New Roman" w:hAnsi="Times New Roman"/>
+          <w:sz w:val="24"/>
+        </w:rPr>
+        <w:t xml:space="preserve">, Category, Dosage, Price, </w:t>
+      </w:r>
+      <w:proofErr w:type="spellStart"/>
+      <w:r>
+        <w:rPr>
+          <w:rFonts w:ascii="Times New Roman" w:hAnsi="Times New Roman"/>
+          <w:sz w:val="24"/>
+        </w:rPr>
+        <w:t>StockQuantity</w:t>
+      </w:r>
+      <w:proofErr w:type="spellEnd"/>
+      <w:r>
+        <w:rPr>
+          <w:rFonts w:ascii="Times New Roman" w:hAnsi="Times New Roman"/>
+          <w:sz w:val="24"/>
+        </w:rPr>
+        <w:t xml:space="preserve">, Supplier, </w:t>
+      </w:r>
+      <w:proofErr w:type="spellStart"/>
+      <w:r>
+        <w:rPr>
+          <w:rFonts w:ascii="Times New Roman" w:hAnsi="Times New Roman"/>
+          <w:sz w:val="24"/>
+        </w:rPr>
+        <w:t>ExpiryDate</w:t>
+      </w:r>
+      <w:proofErr w:type="spellEnd"/>
+      <w:r>
+        <w:rPr>
+          <w:rFonts w:ascii="Times New Roman" w:hAnsi="Times New Roman"/>
+          <w:sz w:val="24"/>
+        </w:rPr>
+        <w:t xml:space="preserve">, and </w:t>
+      </w:r>
+      <w:proofErr w:type="spellStart"/>
+      <w:r>
+        <w:rPr>
+          <w:rFonts w:ascii="Times New Roman" w:hAnsi="Times New Roman"/>
+          <w:sz w:val="24"/>
+        </w:rPr>
+        <w:t>RequiresPrescription</w:t>
+      </w:r>
+      <w:proofErr w:type="spellEnd"/>
+      <w:r>
+        <w:rPr>
+          <w:rFonts w:ascii="Times New Roman" w:hAnsi="Times New Roman"/>
+          <w:sz w:val="24"/>
+        </w:rPr>
+        <w:t xml:space="preserve">. </w:t>
+      </w:r>
+      <w:proofErr w:type="spellStart"/>
+      <w:proofErr w:type="gramStart"/>
+      <w:r>
+        <w:rPr>
+          <w:rFonts w:ascii="Times New Roman" w:hAnsi="Times New Roman"/>
+          <w:sz w:val="24"/>
+        </w:rPr>
+        <w:t>MedicineService</w:t>
+      </w:r>
+      <w:proofErr w:type="spellEnd"/>
+      <w:proofErr w:type="gramEnd"/>
+      <w:r>
+        <w:rPr>
+          <w:rFonts w:ascii="Times New Roman" w:hAnsi="Times New Roman"/>
+          <w:sz w:val="24"/>
+        </w:rPr>
+        <w:t xml:space="preserve"> wraps </w:t>
+      </w:r>
+      <w:proofErr w:type="spellStart"/>
+      <w:r>
+        <w:rPr>
+          <w:rFonts w:ascii="Times New Roman" w:hAnsi="Times New Roman"/>
+          <w:sz w:val="24"/>
+        </w:rPr>
+        <w:t>MedicineRepository</w:t>
+      </w:r>
+      <w:proofErr w:type="spellEnd"/>
+      <w:r>
+        <w:rPr>
+          <w:rFonts w:ascii="Times New Roman" w:hAnsi="Times New Roman"/>
+          <w:sz w:val="24"/>
+        </w:rPr>
+        <w:t xml:space="preserve"> for CRUD used by admin and search features.</w:t>
       </w:r>
     </w:p>
     <w:p>
@@ -2072,7 +4514,119 @@
           <w:rFonts w:ascii="Times New Roman" w:hAnsi="Times New Roman"/>
           <w:sz w:val="24"/>
         </w:rPr>
-        <w:t>Order represents OrderID, CustomerID, OrderDate, Status, and TotalAmount. OrderService creates orders, lists by customer, and updates status for admin fulfilment.</w:t>
+        <w:t xml:space="preserve">Order </w:t>
+      </w:r>
+      <w:proofErr w:type="gramStart"/>
+      <w:r>
+        <w:rPr>
+          <w:rFonts w:ascii="Times New Roman" w:hAnsi="Times New Roman"/>
+          <w:sz w:val="24"/>
+        </w:rPr>
+        <w:t>represents</w:t>
+      </w:r>
+      <w:proofErr w:type="gramEnd"/>
+      <w:r>
+        <w:rPr>
+          <w:rFonts w:ascii="Times New Roman" w:hAnsi="Times New Roman"/>
+          <w:sz w:val="24"/>
+        </w:rPr>
+        <w:t xml:space="preserve"> </w:t>
+      </w:r>
+      <w:proofErr w:type="spellStart"/>
+      <w:r>
+        <w:rPr>
+          <w:rFonts w:ascii="Times New Roman" w:hAnsi="Times New Roman"/>
+          <w:sz w:val="24"/>
+        </w:rPr>
+        <w:t>OrderID</w:t>
+      </w:r>
+      <w:proofErr w:type="spellEnd"/>
+      <w:r>
+        <w:rPr>
+          <w:rFonts w:ascii="Times New Roman" w:hAnsi="Times New Roman"/>
+          <w:sz w:val="24"/>
+        </w:rPr>
+        <w:t xml:space="preserve">, </w:t>
+      </w:r>
+      <w:proofErr w:type="spellStart"/>
+      <w:r>
+        <w:rPr>
+          <w:rFonts w:ascii="Times New Roman" w:hAnsi="Times New Roman"/>
+          <w:sz w:val="24"/>
+        </w:rPr>
+        <w:t>CustomerID</w:t>
+      </w:r>
+      <w:proofErr w:type="spellEnd"/>
+      <w:r>
+        <w:rPr>
+          <w:rFonts w:ascii="Times New Roman" w:hAnsi="Times New Roman"/>
+          <w:sz w:val="24"/>
+        </w:rPr>
+        <w:t xml:space="preserve">, </w:t>
+      </w:r>
+      <w:proofErr w:type="spellStart"/>
+      <w:r>
+        <w:rPr>
+          <w:rFonts w:ascii="Times New Roman" w:hAnsi="Times New Roman"/>
+          <w:sz w:val="24"/>
+        </w:rPr>
+        <w:t>OrderDate</w:t>
+      </w:r>
+      <w:proofErr w:type="spellEnd"/>
+      <w:r>
+        <w:rPr>
+          <w:rFonts w:ascii="Times New Roman" w:hAnsi="Times New Roman"/>
+          <w:sz w:val="24"/>
+        </w:rPr>
+        <w:t xml:space="preserve">, Status, and </w:t>
+      </w:r>
+      <w:proofErr w:type="spellStart"/>
+      <w:r>
+        <w:rPr>
+          <w:rFonts w:ascii="Times New Roman" w:hAnsi="Times New Roman"/>
+          <w:sz w:val="24"/>
+        </w:rPr>
+        <w:t>TotalAmount</w:t>
+      </w:r>
+      <w:proofErr w:type="spellEnd"/>
+      <w:r>
+        <w:rPr>
+          <w:rFonts w:ascii="Times New Roman" w:hAnsi="Times New Roman"/>
+          <w:sz w:val="24"/>
+        </w:rPr>
+        <w:t xml:space="preserve">. </w:t>
+      </w:r>
+      <w:proofErr w:type="spellStart"/>
+      <w:r>
+        <w:rPr>
+          <w:rFonts w:ascii="Times New Roman" w:hAnsi="Times New Roman"/>
+          <w:sz w:val="24"/>
+        </w:rPr>
+        <w:t>OrderService</w:t>
+      </w:r>
+      <w:proofErr w:type="spellEnd"/>
+      <w:r>
+        <w:rPr>
+          <w:rFonts w:ascii="Times New Roman" w:hAnsi="Times New Roman"/>
+          <w:sz w:val="24"/>
+        </w:rPr>
+        <w:t xml:space="preserve"> creates orders, lists by </w:t>
+      </w:r>
+      <w:proofErr w:type="gramStart"/>
+      <w:r>
+        <w:rPr>
+          <w:rFonts w:ascii="Times New Roman" w:hAnsi="Times New Roman"/>
+          <w:sz w:val="24"/>
+        </w:rPr>
+        <w:t>customer</w:t>
+      </w:r>
+      <w:proofErr w:type="gramEnd"/>
+      <w:r>
+        <w:rPr>
+          <w:rFonts w:ascii="Times New Roman" w:hAnsi="Times New Roman"/>
+          <w:sz w:val="24"/>
+        </w:rPr>
+        <w:t>, and updates status for admin fulfilment.</w:t>
       </w:r>
     </w:p>
     <w:p>
@@ -2081,8 +4635,13 @@
         <w:spacing w:line="360" w:lineRule="auto"/>
         <w:jc w:val="both"/>
       </w:pPr>
-      <w:r>
-        <w:t>OrderItem Class</w:t>
+      <w:proofErr w:type="spellStart"/>
+      <w:r>
+        <w:t>OrderItem</w:t>
+      </w:r>
+      <w:proofErr w:type="spellEnd"/>
+      <w:r>
+        <w:t xml:space="preserve"> Class</w:t>
       </w:r>
     </w:p>
     <w:p>
@@ -2090,12 +4649,53 @@
         <w:spacing w:line="360" w:lineRule="auto"/>
         <w:jc w:val="both"/>
       </w:pPr>
-      <w:r>
-        <w:rPr>
-          <w:rFonts w:ascii="Times New Roman" w:hAnsi="Times New Roman"/>
-          <w:sz w:val="24"/>
-        </w:rPr>
-        <w:t>OrderItem links an order to a medicine with Quantity, UnitPrice, and Subtotal. Subtotal is calculated as Quantity × UnitPrice at the time of order placement to preserve historical pricing.</w:t>
+      <w:proofErr w:type="spellStart"/>
+      <w:r>
+        <w:rPr>
+          <w:rFonts w:ascii="Times New Roman" w:hAnsi="Times New Roman"/>
+          <w:sz w:val="24"/>
+        </w:rPr>
+        <w:t>OrderItem</w:t>
+      </w:r>
+      <w:proofErr w:type="spellEnd"/>
+      <w:r>
+        <w:rPr>
+          <w:rFonts w:ascii="Times New Roman" w:hAnsi="Times New Roman"/>
+          <w:sz w:val="24"/>
+        </w:rPr>
+        <w:t xml:space="preserve"> links an order to a medicine with Quantity, </w:t>
+      </w:r>
+      <w:proofErr w:type="spellStart"/>
+      <w:r>
+        <w:rPr>
+          <w:rFonts w:ascii="Times New Roman" w:hAnsi="Times New Roman"/>
+          <w:sz w:val="24"/>
+        </w:rPr>
+        <w:t>UnitPrice</w:t>
+      </w:r>
+      <w:proofErr w:type="spellEnd"/>
+      <w:r>
+        <w:rPr>
+          <w:rFonts w:ascii="Times New Roman" w:hAnsi="Times New Roman"/>
+          <w:sz w:val="24"/>
+        </w:rPr>
+        <w:t xml:space="preserve">, and Subtotal. Subtotal is calculated as Quantity × </w:t>
+      </w:r>
+      <w:proofErr w:type="spellStart"/>
+      <w:r>
+        <w:rPr>
+          <w:rFonts w:ascii="Times New Roman" w:hAnsi="Times New Roman"/>
+          <w:sz w:val="24"/>
+        </w:rPr>
+        <w:t>UnitPrice</w:t>
+      </w:r>
+      <w:proofErr w:type="spellEnd"/>
+      <w:r>
+        <w:rPr>
+          <w:rFonts w:ascii="Times New Roman" w:hAnsi="Times New Roman"/>
+          <w:sz w:val="24"/>
+        </w:rPr>
+        <w:t xml:space="preserve"> at the time of order placement to preserve historical pricing.</w:t>
       </w:r>
     </w:p>
     <w:p>
@@ -2118,7 +4718,71 @@
           <w:rFonts w:ascii="Times New Roman" w:hAnsi="Times New Roman"/>
           <w:sz w:val="24"/>
         </w:rPr>
-        <w:t>Prescription models PrescriptionID, CustomerID, PrescriptionFile path, UploadDate, and Status. The database table is created; upload UI is reserved for future enhancement.</w:t>
+        <w:t xml:space="preserve">Prescription models </w:t>
+      </w:r>
+      <w:proofErr w:type="spellStart"/>
+      <w:r>
+        <w:rPr>
+          <w:rFonts w:ascii="Times New Roman" w:hAnsi="Times New Roman"/>
+          <w:sz w:val="24"/>
+        </w:rPr>
+        <w:t>PrescriptionID</w:t>
+      </w:r>
+      <w:proofErr w:type="spellEnd"/>
+      <w:r>
+        <w:rPr>
+          <w:rFonts w:ascii="Times New Roman" w:hAnsi="Times New Roman"/>
+          <w:sz w:val="24"/>
+        </w:rPr>
+        <w:t xml:space="preserve">, </w:t>
+      </w:r>
+      <w:proofErr w:type="spellStart"/>
+      <w:r>
+        <w:rPr>
+          <w:rFonts w:ascii="Times New Roman" w:hAnsi="Times New Roman"/>
+          <w:sz w:val="24"/>
+        </w:rPr>
+        <w:t>CustomerID</w:t>
+      </w:r>
+      <w:proofErr w:type="spellEnd"/>
+      <w:r>
+        <w:rPr>
+          <w:rFonts w:ascii="Times New Roman" w:hAnsi="Times New Roman"/>
+          <w:sz w:val="24"/>
+        </w:rPr>
+        <w:t xml:space="preserve">, </w:t>
+      </w:r>
+      <w:proofErr w:type="spellStart"/>
+      <w:r>
+        <w:rPr>
+          <w:rFonts w:ascii="Times New Roman" w:hAnsi="Times New Roman"/>
+          <w:sz w:val="24"/>
+        </w:rPr>
+        <w:t>PrescriptionFile</w:t>
+      </w:r>
+      <w:proofErr w:type="spellEnd"/>
+      <w:r>
+        <w:rPr>
+          <w:rFonts w:ascii="Times New Roman" w:hAnsi="Times New Roman"/>
+          <w:sz w:val="24"/>
+        </w:rPr>
+        <w:t xml:space="preserve"> path, </w:t>
+      </w:r>
+      <w:proofErr w:type="spellStart"/>
+      <w:r>
+        <w:rPr>
+          <w:rFonts w:ascii="Times New Roman" w:hAnsi="Times New Roman"/>
+          <w:sz w:val="24"/>
+        </w:rPr>
+        <w:t>UploadDate</w:t>
+      </w:r>
+      <w:proofErr w:type="spellEnd"/>
+      <w:r>
+        <w:rPr>
+          <w:rFonts w:ascii="Times New Roman" w:hAnsi="Times New Roman"/>
+          <w:sz w:val="24"/>
+        </w:rPr>
+        <w:t>, and Status. The database table is created; upload UI is reserved for future enhancement.</w:t>
       </w:r>
     </w:p>
     <w:p>
@@ -2141,7 +4805,111 @@
           <w:rFonts w:ascii="Times New Roman" w:hAnsi="Times New Roman"/>
           <w:sz w:val="24"/>
         </w:rPr>
-        <w:t>Medicine search uses linear search and filtering as required by the coursework. SearchHelper.SearchByName iterates the full medicine list once (O(n)), comparing each MedicineName to the keyword using case-insensitive Contains. FilterByCategory applies a second linear pass when a category filter is active. FilterByPriceRange iterates and retains items where Price falls between min and max inclusive.</w:t>
+        <w:t xml:space="preserve">Medicine search uses linear search and filtering as required by the coursework. </w:t>
+      </w:r>
+      <w:proofErr w:type="spellStart"/>
+      <w:r>
+        <w:rPr>
+          <w:rFonts w:ascii="Times New Roman" w:hAnsi="Times New Roman"/>
+          <w:sz w:val="24"/>
+        </w:rPr>
+        <w:t>SearchHelper.SearchByName</w:t>
+      </w:r>
+      <w:proofErr w:type="spellEnd"/>
+      <w:r>
+        <w:rPr>
+          <w:rFonts w:ascii="Times New Roman" w:hAnsi="Times New Roman"/>
+          <w:sz w:val="24"/>
+        </w:rPr>
+        <w:t xml:space="preserve"> iterates the full medicine list once (O(n)), comparing each </w:t>
+      </w:r>
+      <w:proofErr w:type="spellStart"/>
+      <w:r>
+        <w:rPr>
+          <w:rFonts w:ascii="Times New Roman" w:hAnsi="Times New Roman"/>
+          <w:sz w:val="24"/>
+        </w:rPr>
+        <w:t>MedicineName</w:t>
+      </w:r>
+      <w:proofErr w:type="spellEnd"/>
+      <w:r>
+        <w:rPr>
+          <w:rFonts w:ascii="Times New Roman" w:hAnsi="Times New Roman"/>
+          <w:sz w:val="24"/>
+        </w:rPr>
+        <w:t xml:space="preserve"> to the keyword using </w:t>
+      </w:r>
+      <w:proofErr w:type="gramStart"/>
+      <w:r>
+        <w:rPr>
+          <w:rFonts w:ascii="Times New Roman" w:hAnsi="Times New Roman"/>
+          <w:sz w:val="24"/>
+        </w:rPr>
+        <w:t>case-insensitive</w:t>
+      </w:r>
+      <w:proofErr w:type="gramEnd"/>
+      <w:r>
+        <w:rPr>
+          <w:rFonts w:ascii="Times New Roman" w:hAnsi="Times New Roman"/>
+          <w:sz w:val="24"/>
+        </w:rPr>
+        <w:t xml:space="preserve"> Contains. </w:t>
+      </w:r>
+      <w:proofErr w:type="spellStart"/>
+      <w:r>
+        <w:rPr>
+          <w:rFonts w:ascii="Times New Roman" w:hAnsi="Times New Roman"/>
+          <w:sz w:val="24"/>
+        </w:rPr>
+        <w:t>FilterByCategory</w:t>
+      </w:r>
+      <w:proofErr w:type="spellEnd"/>
+      <w:r>
+        <w:rPr>
+          <w:rFonts w:ascii="Times New Roman" w:hAnsi="Times New Roman"/>
+          <w:sz w:val="24"/>
+        </w:rPr>
+        <w:t xml:space="preserve"> applies a </w:t>
+      </w:r>
+      <w:r>
+        <w:rPr>
+          <w:rFonts w:ascii="Times New Roman" w:hAnsi="Times New Roman"/>
+          <w:sz w:val="24"/>
+        </w:rPr>
+        <w:lastRenderedPageBreak/>
+        <w:t xml:space="preserve">second linear pass when a category filter is active. </w:t>
+      </w:r>
+      <w:proofErr w:type="spellStart"/>
+      <w:r>
+        <w:rPr>
+          <w:rFonts w:ascii="Times New Roman" w:hAnsi="Times New Roman"/>
+          <w:sz w:val="24"/>
+        </w:rPr>
+        <w:t>FilterByPriceRange</w:t>
+      </w:r>
+      <w:proofErr w:type="spellEnd"/>
+      <w:r>
+        <w:rPr>
+          <w:rFonts w:ascii="Times New Roman" w:hAnsi="Times New Roman"/>
+          <w:sz w:val="24"/>
+        </w:rPr>
+        <w:t xml:space="preserve"> iterates and </w:t>
+      </w:r>
+      <w:proofErr w:type="gramStart"/>
+      <w:r>
+        <w:rPr>
+          <w:rFonts w:ascii="Times New Roman" w:hAnsi="Times New Roman"/>
+          <w:sz w:val="24"/>
+        </w:rPr>
+        <w:t>retains</w:t>
+      </w:r>
+      <w:proofErr w:type="gramEnd"/>
+      <w:r>
+        <w:rPr>
+          <w:rFonts w:ascii="Times New Roman" w:hAnsi="Times New Roman"/>
+          <w:sz w:val="24"/>
+        </w:rPr>
+        <w:t xml:space="preserve"> items where Price falls between min and max inclusive.</w:t>
       </w:r>
     </w:p>
     <w:p>
@@ -2182,7 +4950,32 @@
           <w:sz w:val="24"/>
         </w:rPr>
         <w:br/>
-        <w:t xml:space="preserve">  if name provided: results = LinearSearchByName(results, name)</w:t>
+        <w:t xml:space="preserve">  if name provided: results = </w:t>
+      </w:r>
+      <w:proofErr w:type="spellStart"/>
+      <w:proofErr w:type="gramStart"/>
+      <w:r>
+        <w:rPr>
+          <w:rFonts w:ascii="Times New Roman" w:hAnsi="Times New Roman"/>
+          <w:sz w:val="24"/>
+        </w:rPr>
+        <w:t>LinearSearchByName</w:t>
+      </w:r>
+      <w:proofErr w:type="spellEnd"/>
+      <w:r>
+        <w:rPr>
+          <w:rFonts w:ascii="Times New Roman" w:hAnsi="Times New Roman"/>
+          <w:sz w:val="24"/>
+        </w:rPr>
+        <w:t>(</w:t>
+      </w:r>
+      <w:proofErr w:type="gramEnd"/>
+      <w:r>
+        <w:rPr>
+          <w:rFonts w:ascii="Times New Roman" w:hAnsi="Times New Roman"/>
+          <w:sz w:val="24"/>
+        </w:rPr>
+        <w:t>results, name)</w:t>
       </w:r>
       <w:r>
         <w:rPr>
@@ -2190,14 +4983,32 @@
           <w:sz w:val="24"/>
         </w:rPr>
         <w:br/>
-      </w:r>
-      <w:r>
-        <w:rPr>
-          <w:rFonts w:ascii="Times New Roman" w:hAnsi="Times New Roman"/>
-          <w:sz w:val="24"/>
-        </w:rPr>
-        <w:lastRenderedPageBreak/>
-        <w:t xml:space="preserve">  if category provided: results = LinearFilterByCategory(results, category)</w:t>
+        <w:t xml:space="preserve">  if category provided: results = </w:t>
+      </w:r>
+      <w:proofErr w:type="spellStart"/>
+      <w:proofErr w:type="gramStart"/>
+      <w:r>
+        <w:rPr>
+          <w:rFonts w:ascii="Times New Roman" w:hAnsi="Times New Roman"/>
+          <w:sz w:val="24"/>
+        </w:rPr>
+        <w:t>LinearFilterByCategory</w:t>
+      </w:r>
+      <w:proofErr w:type="spellEnd"/>
+      <w:r>
+        <w:rPr>
+          <w:rFonts w:ascii="Times New Roman" w:hAnsi="Times New Roman"/>
+          <w:sz w:val="24"/>
+        </w:rPr>
+        <w:t>(</w:t>
+      </w:r>
+      <w:proofErr w:type="gramEnd"/>
+      <w:r>
+        <w:rPr>
+          <w:rFonts w:ascii="Times New Roman" w:hAnsi="Times New Roman"/>
+          <w:sz w:val="24"/>
+        </w:rPr>
+        <w:t>results, category)</w:t>
       </w:r>
       <w:r>
         <w:rPr>
@@ -2205,7 +5016,32 @@
           <w:sz w:val="24"/>
         </w:rPr>
         <w:br/>
-        <w:t xml:space="preserve">  if price range provided: results = LinearFilterByPrice(results, min, max)</w:t>
+        <w:t xml:space="preserve">  if price range provided: results = </w:t>
+      </w:r>
+      <w:proofErr w:type="spellStart"/>
+      <w:proofErr w:type="gramStart"/>
+      <w:r>
+        <w:rPr>
+          <w:rFonts w:ascii="Times New Roman" w:hAnsi="Times New Roman"/>
+          <w:sz w:val="24"/>
+        </w:rPr>
+        <w:t>LinearFilterByPrice</w:t>
+      </w:r>
+      <w:proofErr w:type="spellEnd"/>
+      <w:r>
+        <w:rPr>
+          <w:rFonts w:ascii="Times New Roman" w:hAnsi="Times New Roman"/>
+          <w:sz w:val="24"/>
+        </w:rPr>
+        <w:t>(</w:t>
+      </w:r>
+      <w:proofErr w:type="gramEnd"/>
+      <w:r>
+        <w:rPr>
+          <w:rFonts w:ascii="Times New Roman" w:hAnsi="Times New Roman"/>
+          <w:sz w:val="24"/>
+        </w:rPr>
+        <w:t>results, min, max)</w:t>
       </w:r>
       <w:r>
         <w:rPr>
@@ -2221,12 +5057,53 @@
         <w:spacing w:line="360" w:lineRule="auto"/>
         <w:jc w:val="both"/>
       </w:pPr>
-      <w:r>
-        <w:rPr>
-          <w:rFonts w:ascii="Times New Roman" w:hAnsi="Times New Roman"/>
-          <w:sz w:val="24"/>
-        </w:rPr>
-        <w:t>SearchMedicinesForm calls MedicineService.Search, which loads medicines from the database and delegates to SearchHelper.Search before binding results to the grid.</w:t>
+      <w:proofErr w:type="spellStart"/>
+      <w:r>
+        <w:rPr>
+          <w:rFonts w:ascii="Times New Roman" w:hAnsi="Times New Roman"/>
+          <w:sz w:val="24"/>
+        </w:rPr>
+        <w:t>SearchMedicinesForm</w:t>
+      </w:r>
+      <w:proofErr w:type="spellEnd"/>
+      <w:r>
+        <w:rPr>
+          <w:rFonts w:ascii="Times New Roman" w:hAnsi="Times New Roman"/>
+          <w:sz w:val="24"/>
+        </w:rPr>
+        <w:t xml:space="preserve"> calls </w:t>
+      </w:r>
+      <w:proofErr w:type="spellStart"/>
+      <w:r>
+        <w:rPr>
+          <w:rFonts w:ascii="Times New Roman" w:hAnsi="Times New Roman"/>
+          <w:sz w:val="24"/>
+        </w:rPr>
+        <w:t>MedicineService.Search</w:t>
+      </w:r>
+      <w:proofErr w:type="spellEnd"/>
+      <w:r>
+        <w:rPr>
+          <w:rFonts w:ascii="Times New Roman" w:hAnsi="Times New Roman"/>
+          <w:sz w:val="24"/>
+        </w:rPr>
+        <w:t xml:space="preserve">, which loads medicines from the database and delegates to </w:t>
+      </w:r>
+      <w:proofErr w:type="spellStart"/>
+      <w:r>
+        <w:rPr>
+          <w:rFonts w:ascii="Times New Roman" w:hAnsi="Times New Roman"/>
+          <w:sz w:val="24"/>
+        </w:rPr>
+        <w:t>SearchHelper.Search</w:t>
+      </w:r>
+      <w:proofErr w:type="spellEnd"/>
+      <w:r>
+        <w:rPr>
+          <w:rFonts w:ascii="Times New Roman" w:hAnsi="Times New Roman"/>
+          <w:sz w:val="24"/>
+        </w:rPr>
+        <w:t xml:space="preserve"> before binding results to the grid.</w:t>
       </w:r>
     </w:p>
     <w:p>
@@ -2249,7 +5126,39 @@
           <w:rFonts w:ascii="Times New Roman" w:hAnsi="Times New Roman"/>
           <w:sz w:val="24"/>
         </w:rPr>
-        <w:t>Developing SmartMed strengthened my understanding of C# as an object-oriented language and of Visual Studio as an integrated environment for building desktop applications. Before this module my experience was limited to console programs; WinForms introduced event-driven programming where button clicks and form load events trigger methods that update the interface asynchronously from user input.</w:t>
+        <w:t xml:space="preserve">Developing </w:t>
+      </w:r>
+      <w:proofErr w:type="spellStart"/>
+      <w:r>
+        <w:rPr>
+          <w:rFonts w:ascii="Times New Roman" w:hAnsi="Times New Roman"/>
+          <w:sz w:val="24"/>
+        </w:rPr>
+        <w:t>SmartMed</w:t>
+      </w:r>
+      <w:proofErr w:type="spellEnd"/>
+      <w:r>
+        <w:rPr>
+          <w:rFonts w:ascii="Times New Roman" w:hAnsi="Times New Roman"/>
+          <w:sz w:val="24"/>
+        </w:rPr>
+        <w:t xml:space="preserve"> strengthened my understanding of C# as an object-oriented language and of Visual Studio as an integrated environment for building desktop applications. Before this </w:t>
+      </w:r>
+      <w:proofErr w:type="gramStart"/>
+      <w:r>
+        <w:rPr>
+          <w:rFonts w:ascii="Times New Roman" w:hAnsi="Times New Roman"/>
+          <w:sz w:val="24"/>
+        </w:rPr>
+        <w:t>module</w:t>
+      </w:r>
+      <w:proofErr w:type="gramEnd"/>
+      <w:r>
+        <w:rPr>
+          <w:rFonts w:ascii="Times New Roman" w:hAnsi="Times New Roman"/>
+          <w:sz w:val="24"/>
+        </w:rPr>
+        <w:t xml:space="preserve"> my experience was limited to console programs; WinForms introduced event-driven programming where button clicks and form load events trigger methods that update the interface asynchronously from user input.</w:t>
       </w:r>
     </w:p>
     <w:p>
@@ -2262,7 +5171,71 @@
           <w:rFonts w:ascii="Times New Roman" w:hAnsi="Times New Roman"/>
           <w:sz w:val="24"/>
         </w:rPr>
-        <w:t>Working with a multi-project solution clarified how references work: SmartMed.UI references Business, which references Data. Building the solution compiles dependencies in order. Debugging with breakpoints across layers showed how a click on Login propagates from LoginForm through AuthService to CustomerRepository and back. The Immediate Window and Watch panel helped inspect Session state during authentication.</w:t>
+        <w:t xml:space="preserve">Working with a multi-project solution clarified how references work: </w:t>
+      </w:r>
+      <w:proofErr w:type="spellStart"/>
+      <w:r>
+        <w:rPr>
+          <w:rFonts w:ascii="Times New Roman" w:hAnsi="Times New Roman"/>
+          <w:sz w:val="24"/>
+        </w:rPr>
+        <w:t>SmartMed.UI</w:t>
+      </w:r>
+      <w:proofErr w:type="spellEnd"/>
+      <w:r>
+        <w:rPr>
+          <w:rFonts w:ascii="Times New Roman" w:hAnsi="Times New Roman"/>
+          <w:sz w:val="24"/>
+        </w:rPr>
+        <w:t xml:space="preserve"> references Business, which references Data. Building the solution compiles dependencies in order. Debugging with breakpoints across layers showed how a click on Login propagates from </w:t>
+      </w:r>
+      <w:proofErr w:type="spellStart"/>
+      <w:r>
+        <w:rPr>
+          <w:rFonts w:ascii="Times New Roman" w:hAnsi="Times New Roman"/>
+          <w:sz w:val="24"/>
+        </w:rPr>
+        <w:t>LoginForm</w:t>
+      </w:r>
+      <w:proofErr w:type="spellEnd"/>
+      <w:r>
+        <w:rPr>
+          <w:rFonts w:ascii="Times New Roman" w:hAnsi="Times New Roman"/>
+          <w:sz w:val="24"/>
+        </w:rPr>
+        <w:t xml:space="preserve"> through </w:t>
+      </w:r>
+      <w:proofErr w:type="spellStart"/>
+      <w:r>
+        <w:rPr>
+          <w:rFonts w:ascii="Times New Roman" w:hAnsi="Times New Roman"/>
+          <w:sz w:val="24"/>
+        </w:rPr>
+        <w:t>AuthService</w:t>
+      </w:r>
+      <w:proofErr w:type="spellEnd"/>
+      <w:r>
+        <w:rPr>
+          <w:rFonts w:ascii="Times New Roman" w:hAnsi="Times New Roman"/>
+          <w:sz w:val="24"/>
+        </w:rPr>
+        <w:t xml:space="preserve"> to </w:t>
+      </w:r>
+      <w:proofErr w:type="spellStart"/>
+      <w:r>
+        <w:rPr>
+          <w:rFonts w:ascii="Times New Roman" w:hAnsi="Times New Roman"/>
+          <w:sz w:val="24"/>
+        </w:rPr>
+        <w:t>CustomerRepository</w:t>
+      </w:r>
+      <w:proofErr w:type="spellEnd"/>
+      <w:r>
+        <w:rPr>
+          <w:rFonts w:ascii="Times New Roman" w:hAnsi="Times New Roman"/>
+          <w:sz w:val="24"/>
+        </w:rPr>
+        <w:t xml:space="preserve"> and back. The Immediate Window and Watch panel helped inspect Session state during authentication.</w:t>
       </w:r>
     </w:p>
     <w:p>
@@ -2270,12 +5243,77 @@
         <w:spacing w:line="360" w:lineRule="auto"/>
         <w:jc w:val="both"/>
       </w:pPr>
-      <w:r>
-        <w:rPr>
-          <w:rFonts w:ascii="Times New Roman" w:hAnsi="Times New Roman"/>
-          <w:sz w:val="24"/>
-        </w:rPr>
-        <w:t>I used both Visual Studio and the dotnet CLI to build. SDK-style projects simplified the csproj files compared to older templates. Configuring App.config for the connection string reinforced the importance of externalising environment-specific settings rather than hard-coding server names in source code.</w:t>
+      <w:proofErr w:type="gramStart"/>
+      <w:r>
+        <w:rPr>
+          <w:rFonts w:ascii="Times New Roman" w:hAnsi="Times New Roman"/>
+          <w:sz w:val="24"/>
+        </w:rPr>
+        <w:t>I used</w:t>
+      </w:r>
+      <w:proofErr w:type="gramEnd"/>
+      <w:r>
+        <w:rPr>
+          <w:rFonts w:ascii="Times New Roman" w:hAnsi="Times New Roman"/>
+          <w:sz w:val="24"/>
+        </w:rPr>
+        <w:t xml:space="preserve"> both Visual Studio and the dotnet CLI to build. SDK-style projects simplified the </w:t>
+      </w:r>
+      <w:proofErr w:type="spellStart"/>
+      <w:r>
+        <w:rPr>
+          <w:rFonts w:ascii="Times New Roman" w:hAnsi="Times New Roman"/>
+          <w:sz w:val="24"/>
+        </w:rPr>
+        <w:t>csproj</w:t>
+      </w:r>
+      <w:proofErr w:type="spellEnd"/>
+      <w:r>
+        <w:rPr>
+          <w:rFonts w:ascii="Times New Roman" w:hAnsi="Times New Roman"/>
+          <w:sz w:val="24"/>
+        </w:rPr>
+        <w:t xml:space="preserve"> files compared to older templates. Configuring </w:t>
+      </w:r>
+      <w:proofErr w:type="spellStart"/>
+      <w:r>
+        <w:rPr>
+          <w:rFonts w:ascii="Times New Roman" w:hAnsi="Times New Roman"/>
+          <w:sz w:val="24"/>
+        </w:rPr>
+        <w:t>App.config</w:t>
+      </w:r>
+      <w:proofErr w:type="spellEnd"/>
+      <w:r>
+        <w:rPr>
+          <w:rFonts w:ascii="Times New Roman" w:hAnsi="Times New Roman"/>
+          <w:sz w:val="24"/>
+        </w:rPr>
+        <w:t xml:space="preserve"> for the connection string reinforced </w:t>
+      </w:r>
+      <w:r>
+        <w:rPr>
+          <w:rFonts w:ascii="Times New Roman" w:hAnsi="Times New Roman"/>
+          <w:sz w:val="24"/>
+        </w:rPr>
+        <w:lastRenderedPageBreak/>
+        <w:t xml:space="preserve">the importance of </w:t>
+      </w:r>
+      <w:proofErr w:type="spellStart"/>
+      <w:r>
+        <w:rPr>
+          <w:rFonts w:ascii="Times New Roman" w:hAnsi="Times New Roman"/>
+          <w:sz w:val="24"/>
+        </w:rPr>
+        <w:t>externalising</w:t>
+      </w:r>
+      <w:proofErr w:type="spellEnd"/>
+      <w:r>
+        <w:rPr>
+          <w:rFonts w:ascii="Times New Roman" w:hAnsi="Times New Roman"/>
+          <w:sz w:val="24"/>
+        </w:rPr>
+        <w:t xml:space="preserve"> environment-specific settings rather than hard-coding server names in source code.</w:t>
       </w:r>
     </w:p>
     <w:p>
@@ -2298,7 +5336,71 @@
           <w:rFonts w:ascii="Times New Roman" w:hAnsi="Times New Roman"/>
           <w:sz w:val="24"/>
         </w:rPr>
-        <w:t>I particularly valued the three-tier architecture because it mirrors professional practice. When I needed to change how medicines were loaded, I edited MedicineRepository once while MedicineManagementForm and SearchMedicinesForm continued to call MedicineService unchanged. This separation reduced duplication and made the codebase easier to reason about.</w:t>
+        <w:t xml:space="preserve">I particularly valued the three-tier architecture because it mirrors professional practice. When I needed to change how medicines were loaded, I edited </w:t>
+      </w:r>
+      <w:proofErr w:type="spellStart"/>
+      <w:r>
+        <w:rPr>
+          <w:rFonts w:ascii="Times New Roman" w:hAnsi="Times New Roman"/>
+          <w:sz w:val="24"/>
+        </w:rPr>
+        <w:t>MedicineRepository</w:t>
+      </w:r>
+      <w:proofErr w:type="spellEnd"/>
+      <w:r>
+        <w:rPr>
+          <w:rFonts w:ascii="Times New Roman" w:hAnsi="Times New Roman"/>
+          <w:sz w:val="24"/>
+        </w:rPr>
+        <w:t xml:space="preserve"> once while </w:t>
+      </w:r>
+      <w:proofErr w:type="spellStart"/>
+      <w:r>
+        <w:rPr>
+          <w:rFonts w:ascii="Times New Roman" w:hAnsi="Times New Roman"/>
+          <w:sz w:val="24"/>
+        </w:rPr>
+        <w:t>MedicineManagementForm</w:t>
+      </w:r>
+      <w:proofErr w:type="spellEnd"/>
+      <w:r>
+        <w:rPr>
+          <w:rFonts w:ascii="Times New Roman" w:hAnsi="Times New Roman"/>
+          <w:sz w:val="24"/>
+        </w:rPr>
+        <w:t xml:space="preserve"> and </w:t>
+      </w:r>
+      <w:proofErr w:type="spellStart"/>
+      <w:r>
+        <w:rPr>
+          <w:rFonts w:ascii="Times New Roman" w:hAnsi="Times New Roman"/>
+          <w:sz w:val="24"/>
+        </w:rPr>
+        <w:t>SearchMedicinesForm</w:t>
+      </w:r>
+      <w:proofErr w:type="spellEnd"/>
+      <w:r>
+        <w:rPr>
+          <w:rFonts w:ascii="Times New Roman" w:hAnsi="Times New Roman"/>
+          <w:sz w:val="24"/>
+        </w:rPr>
+        <w:t xml:space="preserve"> continued to call </w:t>
+      </w:r>
+      <w:proofErr w:type="spellStart"/>
+      <w:r>
+        <w:rPr>
+          <w:rFonts w:ascii="Times New Roman" w:hAnsi="Times New Roman"/>
+          <w:sz w:val="24"/>
+        </w:rPr>
+        <w:t>MedicineService</w:t>
+      </w:r>
+      <w:proofErr w:type="spellEnd"/>
+      <w:r>
+        <w:rPr>
+          <w:rFonts w:ascii="Times New Roman" w:hAnsi="Times New Roman"/>
+          <w:sz w:val="24"/>
+        </w:rPr>
+        <w:t xml:space="preserve"> unchanged. This separation reduced duplication and made the codebase easier to reason about.</w:t>
       </w:r>
     </w:p>
     <w:p>
@@ -2311,15 +5413,55 @@
           <w:rFonts w:ascii="Times New Roman" w:hAnsi="Times New Roman"/>
           <w:sz w:val="24"/>
         </w:rPr>
-        <w:t xml:space="preserve">Windows Forms was approachable for rapid layout of grids, text boxes, and buttons. DataGridView data binding to lists of MedicineItem provided instant tabular display without </w:t>
-      </w:r>
-      <w:r>
-        <w:rPr>
-          <w:rFonts w:ascii="Times New Roman" w:hAnsi="Times New Roman"/>
-          <w:sz w:val="24"/>
-        </w:rPr>
-        <w:lastRenderedPageBreak/>
-        <w:t>manual row painting. The inheritance model for Person, Customer, and Admin made the domain model intuitive and aligned with the class diagram produced in the design phase.</w:t>
+        <w:t xml:space="preserve">Windows Forms was approachable for rapid layout of grids, text boxes, and buttons. </w:t>
+      </w:r>
+      <w:proofErr w:type="spellStart"/>
+      <w:r>
+        <w:rPr>
+          <w:rFonts w:ascii="Times New Roman" w:hAnsi="Times New Roman"/>
+          <w:sz w:val="24"/>
+        </w:rPr>
+        <w:t>DataGridView</w:t>
+      </w:r>
+      <w:proofErr w:type="spellEnd"/>
+      <w:r>
+        <w:rPr>
+          <w:rFonts w:ascii="Times New Roman" w:hAnsi="Times New Roman"/>
+          <w:sz w:val="24"/>
+        </w:rPr>
+        <w:t xml:space="preserve"> data binding </w:t>
+      </w:r>
+      <w:proofErr w:type="gramStart"/>
+      <w:r>
+        <w:rPr>
+          <w:rFonts w:ascii="Times New Roman" w:hAnsi="Times New Roman"/>
+          <w:sz w:val="24"/>
+        </w:rPr>
+        <w:t>to</w:t>
+      </w:r>
+      <w:proofErr w:type="gramEnd"/>
+      <w:r>
+        <w:rPr>
+          <w:rFonts w:ascii="Times New Roman" w:hAnsi="Times New Roman"/>
+          <w:sz w:val="24"/>
+        </w:rPr>
+        <w:t xml:space="preserve"> lists of </w:t>
+      </w:r>
+      <w:proofErr w:type="spellStart"/>
+      <w:r>
+        <w:rPr>
+          <w:rFonts w:ascii="Times New Roman" w:hAnsi="Times New Roman"/>
+          <w:sz w:val="24"/>
+        </w:rPr>
+        <w:t>MedicineItem</w:t>
+      </w:r>
+      <w:proofErr w:type="spellEnd"/>
+      <w:r>
+        <w:rPr>
+          <w:rFonts w:ascii="Times New Roman" w:hAnsi="Times New Roman"/>
+          <w:sz w:val="24"/>
+        </w:rPr>
+        <w:t xml:space="preserve"> provided instant tabular display without manual row painting. The inheritance model for Person, Customer, and Admin made the domain model intuitive and aligned with the class diagram produced in the design phase.</w:t>
       </w:r>
     </w:p>
     <w:p>
@@ -2332,7 +5474,39 @@
           <w:rFonts w:ascii="Times New Roman" w:hAnsi="Times New Roman"/>
           <w:sz w:val="24"/>
         </w:rPr>
-        <w:t>Implementing SearchHelper as a static utility class kept search logic testable and documented independently of the UI. I liked that linear search is easy to explain in documentation and sufficient for pharmacy catalogues that are not millions of rows.</w:t>
+        <w:t xml:space="preserve">Implementing </w:t>
+      </w:r>
+      <w:proofErr w:type="spellStart"/>
+      <w:r>
+        <w:rPr>
+          <w:rFonts w:ascii="Times New Roman" w:hAnsi="Times New Roman"/>
+          <w:sz w:val="24"/>
+        </w:rPr>
+        <w:t>SearchHelper</w:t>
+      </w:r>
+      <w:proofErr w:type="spellEnd"/>
+      <w:r>
+        <w:rPr>
+          <w:rFonts w:ascii="Times New Roman" w:hAnsi="Times New Roman"/>
+          <w:sz w:val="24"/>
+        </w:rPr>
+        <w:t xml:space="preserve"> as a static utility class kept search logic testable and documented independently of the UI. </w:t>
+      </w:r>
+      <w:proofErr w:type="gramStart"/>
+      <w:r>
+        <w:rPr>
+          <w:rFonts w:ascii="Times New Roman" w:hAnsi="Times New Roman"/>
+          <w:sz w:val="24"/>
+        </w:rPr>
+        <w:t>I liked</w:t>
+      </w:r>
+      <w:proofErr w:type="gramEnd"/>
+      <w:r>
+        <w:rPr>
+          <w:rFonts w:ascii="Times New Roman" w:hAnsi="Times New Roman"/>
+          <w:sz w:val="24"/>
+        </w:rPr>
+        <w:t xml:space="preserve"> that linear search is easy to explain in documentation and sufficient for pharmacy catalogues that are not millions of rows.</w:t>
       </w:r>
     </w:p>
     <w:p>
@@ -2355,7 +5529,71 @@
           <w:rFonts w:ascii="Times New Roman" w:hAnsi="Times New Roman"/>
           <w:sz w:val="24"/>
         </w:rPr>
-        <w:t>A significant challenge was ensuring the data layer could read the connection string when called from a class library. DatabaseHelper uses ConfigurationManager, which reads from the executing assembly's config file. The UI project's App.config is copied to SmartMed.exe.config on build, so running the executable provides the correct connection string to all layers.</w:t>
+        <w:t xml:space="preserve">A significant challenge was ensuring the data layer could read the connection string when called from a class library. </w:t>
+      </w:r>
+      <w:proofErr w:type="spellStart"/>
+      <w:r>
+        <w:rPr>
+          <w:rFonts w:ascii="Times New Roman" w:hAnsi="Times New Roman"/>
+          <w:sz w:val="24"/>
+        </w:rPr>
+        <w:t>DatabaseHelper</w:t>
+      </w:r>
+      <w:proofErr w:type="spellEnd"/>
+      <w:r>
+        <w:rPr>
+          <w:rFonts w:ascii="Times New Roman" w:hAnsi="Times New Roman"/>
+          <w:sz w:val="24"/>
+        </w:rPr>
+        <w:t xml:space="preserve"> uses </w:t>
+      </w:r>
+      <w:proofErr w:type="spellStart"/>
+      <w:r>
+        <w:rPr>
+          <w:rFonts w:ascii="Times New Roman" w:hAnsi="Times New Roman"/>
+          <w:sz w:val="24"/>
+        </w:rPr>
+        <w:t>ConfigurationManager</w:t>
+      </w:r>
+      <w:proofErr w:type="spellEnd"/>
+      <w:r>
+        <w:rPr>
+          <w:rFonts w:ascii="Times New Roman" w:hAnsi="Times New Roman"/>
+          <w:sz w:val="24"/>
+        </w:rPr>
+        <w:t xml:space="preserve">, which reads from the executing assembly's config file. The UI project's </w:t>
+      </w:r>
+      <w:proofErr w:type="spellStart"/>
+      <w:r>
+        <w:rPr>
+          <w:rFonts w:ascii="Times New Roman" w:hAnsi="Times New Roman"/>
+          <w:sz w:val="24"/>
+        </w:rPr>
+        <w:t>App.config</w:t>
+      </w:r>
+      <w:proofErr w:type="spellEnd"/>
+      <w:r>
+        <w:rPr>
+          <w:rFonts w:ascii="Times New Roman" w:hAnsi="Times New Roman"/>
+          <w:sz w:val="24"/>
+        </w:rPr>
+        <w:t xml:space="preserve"> is copied to </w:t>
+      </w:r>
+      <w:proofErr w:type="spellStart"/>
+      <w:r>
+        <w:rPr>
+          <w:rFonts w:ascii="Times New Roman" w:hAnsi="Times New Roman"/>
+          <w:sz w:val="24"/>
+        </w:rPr>
+        <w:t>SmartMed.exe.config</w:t>
+      </w:r>
+      <w:proofErr w:type="spellEnd"/>
+      <w:r>
+        <w:rPr>
+          <w:rFonts w:ascii="Times New Roman" w:hAnsi="Times New Roman"/>
+          <w:sz w:val="24"/>
+        </w:rPr>
+        <w:t xml:space="preserve"> on build, so running the executable provides the correct connection string to all layers.</w:t>
       </w:r>
     </w:p>
     <w:p>
@@ -2368,7 +5606,41 @@
           <w:rFonts w:ascii="Times New Roman" w:hAnsi="Times New Roman"/>
           <w:sz w:val="24"/>
         </w:rPr>
-        <w:t>Order placement required transactional integrity: inserting an order, multiple order items, and updating stock had to succeed together. OrderRepository wraps these steps in a SqlTransaction so a failure mid-process rolls back partial changes.</w:t>
+        <w:t xml:space="preserve">Order placement required transactional integrity: inserting an order, multiple order items, and updating stock had to succeed together. </w:t>
+      </w:r>
+      <w:proofErr w:type="spellStart"/>
+      <w:r>
+        <w:rPr>
+          <w:rFonts w:ascii="Times New Roman" w:hAnsi="Times New Roman"/>
+          <w:sz w:val="24"/>
+        </w:rPr>
+        <w:t>OrderRepository</w:t>
+      </w:r>
+      <w:proofErr w:type="spellEnd"/>
+      <w:r>
+        <w:rPr>
+          <w:rFonts w:ascii="Times New Roman" w:hAnsi="Times New Roman"/>
+          <w:sz w:val="24"/>
+        </w:rPr>
+        <w:t xml:space="preserve"> wraps these steps in a </w:t>
+      </w:r>
+      <w:proofErr w:type="spellStart"/>
+      <w:proofErr w:type="gramStart"/>
+      <w:r>
+        <w:rPr>
+          <w:rFonts w:ascii="Times New Roman" w:hAnsi="Times New Roman"/>
+          <w:sz w:val="24"/>
+        </w:rPr>
+        <w:t>SqlTransaction</w:t>
+      </w:r>
+      <w:proofErr w:type="spellEnd"/>
+      <w:proofErr w:type="gramEnd"/>
+      <w:r>
+        <w:rPr>
+          <w:rFonts w:ascii="Times New Roman" w:hAnsi="Times New Roman"/>
+          <w:sz w:val="24"/>
+        </w:rPr>
+        <w:t xml:space="preserve"> so a failure mid-process rolls back partial changes.</w:t>
       </w:r>
     </w:p>
     <w:p>
@@ -2381,7 +5653,82 @@
           <w:rFonts w:ascii="Times New Roman" w:hAnsi="Times New Roman"/>
           <w:sz w:val="24"/>
         </w:rPr>
-        <w:t>Another challenge was keeping WinForms code-behind thin while still showing helpful errors. I standardised on try/catch in event handlers that display ex.Message in MessageBox, while repositories throw descriptive exceptions for constraint violations.</w:t>
+        <w:t xml:space="preserve">Another challenge was keeping WinForms </w:t>
+      </w:r>
+      <w:proofErr w:type="gramStart"/>
+      <w:r>
+        <w:rPr>
+          <w:rFonts w:ascii="Times New Roman" w:hAnsi="Times New Roman"/>
+          <w:sz w:val="24"/>
+        </w:rPr>
+        <w:t>code-behind</w:t>
+      </w:r>
+      <w:proofErr w:type="gramEnd"/>
+      <w:r>
+        <w:rPr>
+          <w:rFonts w:ascii="Times New Roman" w:hAnsi="Times New Roman"/>
+          <w:sz w:val="24"/>
+        </w:rPr>
+        <w:t xml:space="preserve"> thin while still showing helpful errors. </w:t>
+      </w:r>
+      <w:proofErr w:type="gramStart"/>
+      <w:r>
+        <w:rPr>
+          <w:rFonts w:ascii="Times New Roman" w:hAnsi="Times New Roman"/>
+          <w:sz w:val="24"/>
+        </w:rPr>
+        <w:t xml:space="preserve">I </w:t>
+      </w:r>
+      <w:proofErr w:type="spellStart"/>
+      <w:r>
+        <w:rPr>
+          <w:rFonts w:ascii="Times New Roman" w:hAnsi="Times New Roman"/>
+          <w:sz w:val="24"/>
+        </w:rPr>
+        <w:t>standardised</w:t>
+      </w:r>
+      <w:proofErr w:type="spellEnd"/>
+      <w:proofErr w:type="gramEnd"/>
+      <w:r>
+        <w:rPr>
+          <w:rFonts w:ascii="Times New Roman" w:hAnsi="Times New Roman"/>
+          <w:sz w:val="24"/>
+        </w:rPr>
+        <w:t xml:space="preserve"> on try/catch in event handlers that display </w:t>
+      </w:r>
+      <w:proofErr w:type="spellStart"/>
+      <w:proofErr w:type="gramStart"/>
+      <w:r>
+        <w:rPr>
+          <w:rFonts w:ascii="Times New Roman" w:hAnsi="Times New Roman"/>
+          <w:sz w:val="24"/>
+        </w:rPr>
+        <w:t>ex.Message</w:t>
+      </w:r>
+      <w:proofErr w:type="spellEnd"/>
+      <w:proofErr w:type="gramEnd"/>
+      <w:r>
+        <w:rPr>
+          <w:rFonts w:ascii="Times New Roman" w:hAnsi="Times New Roman"/>
+          <w:sz w:val="24"/>
+        </w:rPr>
+        <w:t xml:space="preserve"> in </w:t>
+      </w:r>
+      <w:proofErr w:type="spellStart"/>
+      <w:r>
+        <w:rPr>
+          <w:rFonts w:ascii="Times New Roman" w:hAnsi="Times New Roman"/>
+          <w:sz w:val="24"/>
+        </w:rPr>
+        <w:t>MessageBox</w:t>
+      </w:r>
+      <w:proofErr w:type="spellEnd"/>
+      <w:r>
+        <w:rPr>
+          <w:rFonts w:ascii="Times New Roman" w:hAnsi="Times New Roman"/>
+          <w:sz w:val="24"/>
+        </w:rPr>
+        <w:t>, while repositories throw descriptive exceptions for constraint violations.</w:t>
       </w:r>
     </w:p>
     <w:p>
@@ -2394,7 +5741,40 @@
           <w:rFonts w:ascii="Times New Roman" w:hAnsi="Times New Roman"/>
           <w:sz w:val="24"/>
         </w:rPr>
-        <w:t>Building forms entirely in code (without the designer) was initially verbose but avoided merge conflicts and kept the repository self-contained for submission. I reused patterns for grid setup, button placement, and BackColor theming across admin and customer forms.</w:t>
+        <w:lastRenderedPageBreak/>
+        <w:t xml:space="preserve">Building forms entirely in code (without the designer) was initially verbose but avoided merge conflicts and kept the repository self-contained for submission. </w:t>
+      </w:r>
+      <w:proofErr w:type="gramStart"/>
+      <w:r>
+        <w:rPr>
+          <w:rFonts w:ascii="Times New Roman" w:hAnsi="Times New Roman"/>
+          <w:sz w:val="24"/>
+        </w:rPr>
+        <w:t>I reused</w:t>
+      </w:r>
+      <w:proofErr w:type="gramEnd"/>
+      <w:r>
+        <w:rPr>
+          <w:rFonts w:ascii="Times New Roman" w:hAnsi="Times New Roman"/>
+          <w:sz w:val="24"/>
+        </w:rPr>
+        <w:t xml:space="preserve"> patterns for grid setup, button placement, and </w:t>
+      </w:r>
+      <w:proofErr w:type="spellStart"/>
+      <w:r>
+        <w:rPr>
+          <w:rFonts w:ascii="Times New Roman" w:hAnsi="Times New Roman"/>
+          <w:sz w:val="24"/>
+        </w:rPr>
+        <w:t>BackColor</w:t>
+      </w:r>
+      <w:proofErr w:type="spellEnd"/>
+      <w:r>
+        <w:rPr>
+          <w:rFonts w:ascii="Times New Roman" w:hAnsi="Times New Roman"/>
+          <w:sz w:val="24"/>
+        </w:rPr>
+        <w:t xml:space="preserve"> theming across admin and customer forms.</w:t>
       </w:r>
     </w:p>
     <w:p>
@@ -2407,7 +5787,39 @@
           <w:rFonts w:ascii="Times New Roman" w:hAnsi="Times New Roman"/>
           <w:sz w:val="24"/>
         </w:rPr>
-        <w:t>Mapping between Business models and Data models (e.g. Customer vs CustomerUser) required discipline. Services translate between layers when needed, keeping ADO.NET details out of the business entities.</w:t>
+        <w:t>Mapping between Business models and Data models (</w:t>
+      </w:r>
+      <w:proofErr w:type="gramStart"/>
+      <w:r>
+        <w:rPr>
+          <w:rFonts w:ascii="Times New Roman" w:hAnsi="Times New Roman"/>
+          <w:sz w:val="24"/>
+        </w:rPr>
+        <w:t>e.g.</w:t>
+      </w:r>
+      <w:proofErr w:type="gramEnd"/>
+      <w:r>
+        <w:rPr>
+          <w:rFonts w:ascii="Times New Roman" w:hAnsi="Times New Roman"/>
+          <w:sz w:val="24"/>
+        </w:rPr>
+        <w:t xml:space="preserve"> Customer vs </w:t>
+      </w:r>
+      <w:proofErr w:type="spellStart"/>
+      <w:r>
+        <w:rPr>
+          <w:rFonts w:ascii="Times New Roman" w:hAnsi="Times New Roman"/>
+          <w:sz w:val="24"/>
+        </w:rPr>
+        <w:t>CustomerUser</w:t>
+      </w:r>
+      <w:proofErr w:type="spellEnd"/>
+      <w:r>
+        <w:rPr>
+          <w:rFonts w:ascii="Times New Roman" w:hAnsi="Times New Roman"/>
+          <w:sz w:val="24"/>
+        </w:rPr>
+        <w:t>) required discipline. Services translate between layers when needed, keeping ADO.NET details out of the business entities.</w:t>
       </w:r>
     </w:p>
     <w:p>
@@ -2432,13 +5844,69 @@
         </w:rPr>
         <w:t xml:space="preserve">Future versions could add prescription file upload with validation, email notifications when order status changes, and export of reports to PDF or Excel using libraries such as iTextSharp or </w:t>
       </w:r>
-      <w:r>
-        <w:rPr>
-          <w:rFonts w:ascii="Times New Roman" w:hAnsi="Times New Roman"/>
-          <w:sz w:val="24"/>
-        </w:rPr>
-        <w:lastRenderedPageBreak/>
-        <w:t>ClosedXML. Role-based admin permissions could distinguish pharmacists from managers. A barcode scanner integration would speed stock intake. For larger catalogues, indexing and full-text search in SQL Server could supplement client-side linear search. Unit tests for ValidationHelper and SearchHelper would improve regression safety. Migrating to .NET 6+ WinForms would enable cross-platform considerations, though deployment targets remain Windows for pharmacy workstations.</w:t>
+      <w:proofErr w:type="spellStart"/>
+      <w:r>
+        <w:rPr>
+          <w:rFonts w:ascii="Times New Roman" w:hAnsi="Times New Roman"/>
+          <w:sz w:val="24"/>
+        </w:rPr>
+        <w:t>ClosedXML</w:t>
+      </w:r>
+      <w:proofErr w:type="spellEnd"/>
+      <w:r>
+        <w:rPr>
+          <w:rFonts w:ascii="Times New Roman" w:hAnsi="Times New Roman"/>
+          <w:sz w:val="24"/>
+        </w:rPr>
+        <w:t xml:space="preserve">. Role-based admin permissions could distinguish pharmacists from managers. A barcode scanner integration would speed stock intake. For larger catalogues, indexing and full-text search in SQL Server could supplement client-side linear search. Unit tests for </w:t>
+      </w:r>
+      <w:proofErr w:type="spellStart"/>
+      <w:r>
+        <w:rPr>
+          <w:rFonts w:ascii="Times New Roman" w:hAnsi="Times New Roman"/>
+          <w:sz w:val="24"/>
+        </w:rPr>
+        <w:t>ValidationHelper</w:t>
+      </w:r>
+      <w:proofErr w:type="spellEnd"/>
+      <w:r>
+        <w:rPr>
+          <w:rFonts w:ascii="Times New Roman" w:hAnsi="Times New Roman"/>
+          <w:sz w:val="24"/>
+        </w:rPr>
+        <w:t xml:space="preserve"> and </w:t>
+      </w:r>
+      <w:proofErr w:type="spellStart"/>
+      <w:r>
+        <w:rPr>
+          <w:rFonts w:ascii="Times New Roman" w:hAnsi="Times New Roman"/>
+          <w:sz w:val="24"/>
+        </w:rPr>
+        <w:t>SearchHelper</w:t>
+      </w:r>
+      <w:proofErr w:type="spellEnd"/>
+      <w:r>
+        <w:rPr>
+          <w:rFonts w:ascii="Times New Roman" w:hAnsi="Times New Roman"/>
+          <w:sz w:val="24"/>
+        </w:rPr>
+        <w:t xml:space="preserve"> would improve regression safety. Migrating to .NET 6+ WinForms would enable cross-platform considerations, though deployment targets </w:t>
+      </w:r>
+      <w:proofErr w:type="gramStart"/>
+      <w:r>
+        <w:rPr>
+          <w:rFonts w:ascii="Times New Roman" w:hAnsi="Times New Roman"/>
+          <w:sz w:val="24"/>
+        </w:rPr>
+        <w:t>remain</w:t>
+      </w:r>
+      <w:proofErr w:type="gramEnd"/>
+      <w:r>
+        <w:rPr>
+          <w:rFonts w:ascii="Times New Roman" w:hAnsi="Times New Roman"/>
+          <w:sz w:val="24"/>
+        </w:rPr>
+        <w:t xml:space="preserve"> Windows for pharmacy workstations.</w:t>
       </w:r>
     </w:p>
     <w:p>
@@ -2456,12 +5924,37 @@
         <w:spacing w:line="360" w:lineRule="auto"/>
         <w:jc w:val="both"/>
       </w:pPr>
-      <w:r>
-        <w:rPr>
-          <w:rFonts w:ascii="Times New Roman" w:hAnsi="Times New Roman"/>
-          <w:sz w:val="24"/>
-        </w:rPr>
-        <w:t>SmartMed delivers a working pharmacy management desktop application that meets the coursework functional and technical requirements. The design diagrams guided implementation of the database schema, class structure, and layered architecture. Mandatory features—authentication, medicine CRUD, customer search with linear filtering, order lifecycle, reports, and dashboard—are implemented and runnable against SQL Server seed data. The project improved my skills in C#, WinForms, ADO.NET, and structured OOP design. Documentation and reflective analysis consolidate learning outcomes for assessment.</w:t>
+      <w:proofErr w:type="spellStart"/>
+      <w:r>
+        <w:rPr>
+          <w:rFonts w:ascii="Times New Roman" w:hAnsi="Times New Roman"/>
+          <w:sz w:val="24"/>
+        </w:rPr>
+        <w:t>SmartMed</w:t>
+      </w:r>
+      <w:proofErr w:type="spellEnd"/>
+      <w:r>
+        <w:rPr>
+          <w:rFonts w:ascii="Times New Roman" w:hAnsi="Times New Roman"/>
+          <w:sz w:val="24"/>
+        </w:rPr>
+        <w:t xml:space="preserve"> delivers a working pharmacy management desktop application that meets the coursework functional and technical requirements. The design diagrams guided implementation of the database schema, class structure, and layered architecture. Mandatory features—authentication, medicine CRUD, customer search with linear filtering, order lifecycle, reports, and dashboard—are implemented and runnable against SQL Server seed data. The project improved my skills in C#, WinForms, ADO.NET, and structured OOP design. Documentation and reflective analysis </w:t>
+      </w:r>
+      <w:proofErr w:type="gramStart"/>
+      <w:r>
+        <w:rPr>
+          <w:rFonts w:ascii="Times New Roman" w:hAnsi="Times New Roman"/>
+          <w:sz w:val="24"/>
+        </w:rPr>
+        <w:t>consolidate</w:t>
+      </w:r>
+      <w:proofErr w:type="gramEnd"/>
+      <w:r>
+        <w:rPr>
+          <w:rFonts w:ascii="Times New Roman" w:hAnsi="Times New Roman"/>
+          <w:sz w:val="24"/>
+        </w:rPr>
+        <w:t xml:space="preserve"> learning outcomes for assessment.</w:t>
       </w:r>
     </w:p>
     <w:p>
@@ -2471,6 +5964,7 @@
         <w:jc w:val="both"/>
       </w:pPr>
       <w:r>
+        <w:lastRenderedPageBreak/>
         <w:t>References</w:t>
       </w:r>
     </w:p>
@@ -2510,7 +6004,23 @@
           <w:rFonts w:ascii="Times New Roman" w:hAnsi="Times New Roman"/>
           <w:sz w:val="24"/>
         </w:rPr>
-        <w:t>Module coursework brief: Document.md (SmartMed Pharmacy specification).</w:t>
+        <w:t>Module coursework brief: Document.md (</w:t>
+      </w:r>
+      <w:proofErr w:type="spellStart"/>
+      <w:r>
+        <w:rPr>
+          <w:rFonts w:ascii="Times New Roman" w:hAnsi="Times New Roman"/>
+          <w:sz w:val="24"/>
+        </w:rPr>
+        <w:t>SmartMed</w:t>
+      </w:r>
+      <w:proofErr w:type="spellEnd"/>
+      <w:r>
+        <w:rPr>
+          <w:rFonts w:ascii="Times New Roman" w:hAnsi="Times New Roman"/>
+          <w:sz w:val="24"/>
+        </w:rPr>
+        <w:t xml:space="preserve"> Pharmacy specification).</w:t>
       </w:r>
     </w:p>
     <w:p>
@@ -2533,7 +6043,39 @@
           <w:rFonts w:ascii="Times New Roman" w:hAnsi="Times New Roman"/>
           <w:sz w:val="24"/>
         </w:rPr>
-        <w:t>See Diagrams/Usecase.drawio — export as PNG for printed submission if required.</w:t>
+        <w:t>See Diagrams/</w:t>
+      </w:r>
+      <w:proofErr w:type="spellStart"/>
+      <w:r>
+        <w:rPr>
+          <w:rFonts w:ascii="Times New Roman" w:hAnsi="Times New Roman"/>
+          <w:sz w:val="24"/>
+        </w:rPr>
+        <w:t>Usecase.drawio</w:t>
+      </w:r>
+      <w:proofErr w:type="spellEnd"/>
+      <w:r>
+        <w:rPr>
+          <w:rFonts w:ascii="Times New Roman" w:hAnsi="Times New Roman"/>
+          <w:sz w:val="24"/>
+        </w:rPr>
+        <w:t xml:space="preserve"> — export as PNG for printed submission if </w:t>
+      </w:r>
+      <w:proofErr w:type="gramStart"/>
+      <w:r>
+        <w:rPr>
+          <w:rFonts w:ascii="Times New Roman" w:hAnsi="Times New Roman"/>
+          <w:sz w:val="24"/>
+        </w:rPr>
+        <w:t>required</w:t>
+      </w:r>
+      <w:proofErr w:type="gramEnd"/>
+      <w:r>
+        <w:rPr>
+          <w:rFonts w:ascii="Times New Roman" w:hAnsi="Times New Roman"/>
+          <w:sz w:val="24"/>
+        </w:rPr>
+        <w:t>.</w:t>
       </w:r>
     </w:p>
     <w:p>
@@ -2556,7 +6098,39 @@
           <w:rFonts w:ascii="Times New Roman" w:hAnsi="Times New Roman"/>
           <w:sz w:val="24"/>
         </w:rPr>
-        <w:t>See Diagrams/ER.drawio — Chen notation with Admin, Customer, Medicine, Order, OrderItem, Prescription.</w:t>
+        <w:t>See Diagrams/</w:t>
+      </w:r>
+      <w:proofErr w:type="spellStart"/>
+      <w:r>
+        <w:rPr>
+          <w:rFonts w:ascii="Times New Roman" w:hAnsi="Times New Roman"/>
+          <w:sz w:val="24"/>
+        </w:rPr>
+        <w:t>ER.drawio</w:t>
+      </w:r>
+      <w:proofErr w:type="spellEnd"/>
+      <w:r>
+        <w:rPr>
+          <w:rFonts w:ascii="Times New Roman" w:hAnsi="Times New Roman"/>
+          <w:sz w:val="24"/>
+        </w:rPr>
+        <w:t xml:space="preserve"> — Chen notation with Admin, Customer, Medicine, Order, </w:t>
+      </w:r>
+      <w:proofErr w:type="spellStart"/>
+      <w:r>
+        <w:rPr>
+          <w:rFonts w:ascii="Times New Roman" w:hAnsi="Times New Roman"/>
+          <w:sz w:val="24"/>
+        </w:rPr>
+        <w:t>OrderItem</w:t>
+      </w:r>
+      <w:proofErr w:type="spellEnd"/>
+      <w:r>
+        <w:rPr>
+          <w:rFonts w:ascii="Times New Roman" w:hAnsi="Times New Roman"/>
+          <w:sz w:val="24"/>
+        </w:rPr>
+        <w:t>, Prescription.</w:t>
       </w:r>
     </w:p>
     <w:p>
@@ -2566,7 +6140,6 @@
         <w:jc w:val="both"/>
       </w:pPr>
       <w:r>
-        <w:lastRenderedPageBreak/>
         <w:t>Appendix C: Class Diagram</w:t>
       </w:r>
     </w:p>
@@ -2580,7 +6153,23 @@
           <w:rFonts w:ascii="Times New Roman" w:hAnsi="Times New Roman"/>
           <w:sz w:val="24"/>
         </w:rPr>
-        <w:t>See Diagrams/Class.drawio — Person inheritance, entity classes, and relationships.</w:t>
+        <w:t>See Diagrams/</w:t>
+      </w:r>
+      <w:proofErr w:type="spellStart"/>
+      <w:r>
+        <w:rPr>
+          <w:rFonts w:ascii="Times New Roman" w:hAnsi="Times New Roman"/>
+          <w:sz w:val="24"/>
+        </w:rPr>
+        <w:t>Class.drawio</w:t>
+      </w:r>
+      <w:proofErr w:type="spellEnd"/>
+      <w:r>
+        <w:rPr>
+          <w:rFonts w:ascii="Times New Roman" w:hAnsi="Times New Roman"/>
+          <w:sz w:val="24"/>
+        </w:rPr>
+        <w:t xml:space="preserve"> — Person inheritance, entity classes, and relationships.</w:t>
       </w:r>
     </w:p>
     <w:p>
@@ -2603,7 +6192,23 @@
           <w:rFonts w:ascii="Times New Roman" w:hAnsi="Times New Roman"/>
           <w:sz w:val="24"/>
         </w:rPr>
-        <w:t>See Diagrams/Architecture.drawio — vertical flow: Presentation → Business → Data Access → SQL Server.</w:t>
+        <w:t>See Diagrams/</w:t>
+      </w:r>
+      <w:proofErr w:type="spellStart"/>
+      <w:r>
+        <w:rPr>
+          <w:rFonts w:ascii="Times New Roman" w:hAnsi="Times New Roman"/>
+          <w:sz w:val="24"/>
+        </w:rPr>
+        <w:t>Architecture.drawio</w:t>
+      </w:r>
+      <w:proofErr w:type="spellEnd"/>
+      <w:r>
+        <w:rPr>
+          <w:rFonts w:ascii="Times New Roman" w:hAnsi="Times New Roman"/>
+          <w:sz w:val="24"/>
+        </w:rPr>
+        <w:t xml:space="preserve"> — vertical flow: Presentation → Business → Data Access → SQL Server.</w:t>
       </w:r>
     </w:p>
     <w:sectPr>
@@ -3656,6 +7261,7 @@
   <w:style w:type="character" w:default="1" w:styleId="DefaultParagraphFont">
     <w:name w:val="Default Paragraph Font"/>
     <w:uiPriority w:val="1"/>
+    <w:semiHidden/>
     <w:unhideWhenUsed/>
   </w:style>
   <w:style w:type="table" w:default="1" w:styleId="TableNormal">

</xml_diff>